<commit_message>
Updated: article fetcher to fetch tables, api, frontend
</commit_message>
<xml_diff>
--- a/extra_materials/thesis /notes.docx
+++ b/extra_materials/thesis /notes.docx
@@ -116,7 +116,7 @@
     </w:p>
     <w:p>
       <w:pPr>
-        <w:pStyle w:val="922"/>
+        <w:pStyle w:val="928"/>
         <w:numPr>
           <w:ilvl w:val="0"/>
           <w:numId w:val="5"/>
@@ -161,7 +161,7 @@
     </w:p>
     <w:p>
       <w:pPr>
-        <w:pStyle w:val="922"/>
+        <w:pStyle w:val="928"/>
         <w:numPr>
           <w:ilvl w:val="0"/>
           <w:numId w:val="5"/>
@@ -197,7 +197,7 @@
     </w:p>
     <w:p>
       <w:pPr>
-        <w:pStyle w:val="922"/>
+        <w:pStyle w:val="928"/>
         <w:numPr>
           <w:ilvl w:val="0"/>
           <w:numId w:val="5"/>
@@ -271,7 +271,7 @@
     </w:p>
     <w:p>
       <w:pPr>
-        <w:pStyle w:val="922"/>
+        <w:pStyle w:val="928"/>
         <w:numPr>
           <w:ilvl w:val="0"/>
           <w:numId w:val="11"/>
@@ -302,7 +302,7 @@
     </w:p>
     <w:p>
       <w:pPr>
-        <w:pStyle w:val="922"/>
+        <w:pStyle w:val="928"/>
         <w:numPr>
           <w:ilvl w:val="0"/>
           <w:numId w:val="11"/>
@@ -329,7 +329,7 @@
     </w:p>
     <w:p>
       <w:pPr>
-        <w:pStyle w:val="922"/>
+        <w:pStyle w:val="928"/>
         <w:numPr>
           <w:ilvl w:val="0"/>
           <w:numId w:val="11"/>
@@ -351,7 +351,7 @@
     </w:p>
     <w:p>
       <w:pPr>
-        <w:pStyle w:val="922"/>
+        <w:pStyle w:val="928"/>
         <w:numPr>
           <w:ilvl w:val="0"/>
           <w:numId w:val="11"/>
@@ -412,7 +412,7 @@
     </w:p>
     <w:p>
       <w:pPr>
-        <w:pStyle w:val="922"/>
+        <w:pStyle w:val="928"/>
         <w:numPr>
           <w:ilvl w:val="0"/>
           <w:numId w:val="3"/>
@@ -445,7 +445,7 @@
     </w:p>
     <w:p>
       <w:pPr>
-        <w:pStyle w:val="922"/>
+        <w:pStyle w:val="928"/>
         <w:numPr>
           <w:ilvl w:val="0"/>
           <w:numId w:val="2"/>
@@ -511,7 +511,7 @@
     </w:p>
     <w:p>
       <w:pPr>
-        <w:pStyle w:val="922"/>
+        <w:pStyle w:val="928"/>
         <w:numPr>
           <w:ilvl w:val="0"/>
           <w:numId w:val="2"/>
@@ -559,7 +559,7 @@
     </w:p>
     <w:p>
       <w:pPr>
-        <w:pStyle w:val="922"/>
+        <w:pStyle w:val="928"/>
         <w:numPr>
           <w:ilvl w:val="0"/>
           <w:numId w:val="2"/>
@@ -590,7 +590,7 @@
     </w:p>
     <w:p>
       <w:pPr>
-        <w:pStyle w:val="922"/>
+        <w:pStyle w:val="928"/>
         <w:numPr>
           <w:ilvl w:val="1"/>
           <w:numId w:val="2"/>
@@ -621,7 +621,7 @@
     </w:p>
     <w:p>
       <w:pPr>
-        <w:pStyle w:val="922"/>
+        <w:pStyle w:val="928"/>
         <w:numPr>
           <w:ilvl w:val="0"/>
           <w:numId w:val="2"/>
@@ -704,7 +704,7 @@
     </w:p>
     <w:p>
       <w:pPr>
-        <w:pStyle w:val="922"/>
+        <w:pStyle w:val="928"/>
         <w:numPr>
           <w:ilvl w:val="0"/>
           <w:numId w:val="2"/>
@@ -796,7 +796,7 @@
     </w:p>
     <w:p>
       <w:pPr>
-        <w:pStyle w:val="922"/>
+        <w:pStyle w:val="928"/>
         <w:numPr>
           <w:ilvl w:val="0"/>
           <w:numId w:val="2"/>
@@ -858,7 +858,7 @@
     </w:p>
     <w:p>
       <w:pPr>
-        <w:pStyle w:val="922"/>
+        <w:pStyle w:val="928"/>
         <w:numPr>
           <w:ilvl w:val="0"/>
           <w:numId w:val="2"/>
@@ -892,7 +892,7 @@
     </w:p>
     <w:p>
       <w:pPr>
-        <w:pStyle w:val="922"/>
+        <w:pStyle w:val="928"/>
         <w:numPr>
           <w:ilvl w:val="0"/>
           <w:numId w:val="2"/>
@@ -960,7 +960,7 @@
     </w:p>
     <w:p>
       <w:pPr>
-        <w:pStyle w:val="922"/>
+        <w:pStyle w:val="928"/>
         <w:numPr>
           <w:ilvl w:val="0"/>
           <w:numId w:val="2"/>
@@ -1077,7 +1077,7 @@
     </w:p>
     <w:p>
       <w:pPr>
-        <w:pStyle w:val="922"/>
+        <w:pStyle w:val="928"/>
         <w:numPr>
           <w:ilvl w:val="0"/>
           <w:numId w:val="2"/>
@@ -1116,7 +1116,7 @@
     </w:p>
     <w:p>
       <w:pPr>
-        <w:pStyle w:val="922"/>
+        <w:pStyle w:val="928"/>
         <w:numPr>
           <w:ilvl w:val="1"/>
           <w:numId w:val="7"/>
@@ -1190,7 +1190,7 @@
     </w:p>
     <w:p>
       <w:pPr>
-        <w:pStyle w:val="922"/>
+        <w:pStyle w:val="928"/>
         <w:numPr>
           <w:ilvl w:val="2"/>
           <w:numId w:val="7"/>
@@ -1217,7 +1217,7 @@
     </w:p>
     <w:p>
       <w:pPr>
-        <w:pStyle w:val="922"/>
+        <w:pStyle w:val="928"/>
         <w:numPr>
           <w:ilvl w:val="2"/>
           <w:numId w:val="7"/>
@@ -1244,7 +1244,7 @@
     </w:p>
     <w:p>
       <w:pPr>
-        <w:pStyle w:val="922"/>
+        <w:pStyle w:val="928"/>
         <w:numPr>
           <w:ilvl w:val="1"/>
           <w:numId w:val="7"/>
@@ -1272,7 +1272,7 @@
     </w:p>
     <w:p>
       <w:pPr>
-        <w:pStyle w:val="922"/>
+        <w:pStyle w:val="928"/>
         <w:numPr>
           <w:ilvl w:val="1"/>
           <w:numId w:val="7"/>
@@ -1300,7 +1300,7 @@
     </w:p>
     <w:p>
       <w:pPr>
-        <w:pStyle w:val="922"/>
+        <w:pStyle w:val="928"/>
         <w:numPr>
           <w:ilvl w:val="2"/>
           <w:numId w:val="7"/>
@@ -1347,7 +1347,7 @@
     </w:p>
     <w:p>
       <w:pPr>
-        <w:pStyle w:val="922"/>
+        <w:pStyle w:val="928"/>
         <w:numPr>
           <w:ilvl w:val="2"/>
           <w:numId w:val="7"/>
@@ -1432,7 +1432,7 @@
     </w:p>
     <w:p>
       <w:pPr>
-        <w:pStyle w:val="922"/>
+        <w:pStyle w:val="928"/>
         <w:numPr>
           <w:ilvl w:val="1"/>
           <w:numId w:val="7"/>
@@ -1460,7 +1460,7 @@
     </w:p>
     <w:p>
       <w:pPr>
-        <w:pStyle w:val="922"/>
+        <w:pStyle w:val="928"/>
         <w:numPr>
           <w:ilvl w:val="2"/>
           <w:numId w:val="7"/>
@@ -1487,7 +1487,7 @@
     </w:p>
     <w:p>
       <w:pPr>
-        <w:pStyle w:val="922"/>
+        <w:pStyle w:val="928"/>
         <w:numPr>
           <w:ilvl w:val="2"/>
           <w:numId w:val="7"/>
@@ -1554,7 +1554,7 @@
     </w:p>
     <w:p>
       <w:pPr>
-        <w:pStyle w:val="922"/>
+        <w:pStyle w:val="928"/>
         <w:numPr>
           <w:ilvl w:val="0"/>
           <w:numId w:val="10"/>
@@ -1606,7 +1606,7 @@
     </w:p>
     <w:p>
       <w:pPr>
-        <w:pStyle w:val="922"/>
+        <w:pStyle w:val="928"/>
         <w:numPr>
           <w:ilvl w:val="0"/>
           <w:numId w:val="10"/>
@@ -1706,7 +1706,7 @@
     </w:p>
     <w:p>
       <w:pPr>
-        <w:pStyle w:val="922"/>
+        <w:pStyle w:val="928"/>
         <w:numPr>
           <w:ilvl w:val="0"/>
           <w:numId w:val="4"/>
@@ -1769,7 +1769,7 @@
     </w:p>
     <w:p>
       <w:pPr>
-        <w:pStyle w:val="922"/>
+        <w:pStyle w:val="928"/>
         <w:numPr>
           <w:ilvl w:val="0"/>
           <w:numId w:val="4"/>
@@ -1848,7 +1848,7 @@
     </w:p>
     <w:p>
       <w:pPr>
-        <w:pStyle w:val="922"/>
+        <w:pStyle w:val="928"/>
         <w:numPr>
           <w:ilvl w:val="0"/>
           <w:numId w:val="4"/>
@@ -1930,7 +1930,7 @@
     </w:p>
     <w:p>
       <w:pPr>
-        <w:pStyle w:val="922"/>
+        <w:pStyle w:val="928"/>
         <w:numPr>
           <w:ilvl w:val="0"/>
           <w:numId w:val="4"/>
@@ -2013,7 +2013,7 @@
     </w:p>
     <w:p>
       <w:pPr>
-        <w:pStyle w:val="922"/>
+        <w:pStyle w:val="928"/>
         <w:numPr>
           <w:ilvl w:val="0"/>
           <w:numId w:val="4"/>
@@ -2260,7 +2260,7 @@
     </w:p>
     <w:p>
       <w:pPr>
-        <w:pStyle w:val="897"/>
+        <w:pStyle w:val="903"/>
         <w:pBdr/>
         <w:spacing/>
         <w:ind/>
@@ -2287,7 +2287,7 @@
     </w:p>
     <w:p>
       <w:pPr>
-        <w:pStyle w:val="922"/>
+        <w:pStyle w:val="928"/>
         <w:numPr>
           <w:ilvl w:val="0"/>
           <w:numId w:val="12"/>
@@ -2323,7 +2323,7 @@
     </w:p>
     <w:p>
       <w:pPr>
-        <w:pStyle w:val="922"/>
+        <w:pStyle w:val="928"/>
         <w:numPr>
           <w:ilvl w:val="0"/>
           <w:numId w:val="12"/>
@@ -2359,7 +2359,7 @@
     </w:p>
     <w:p>
       <w:pPr>
-        <w:pStyle w:val="922"/>
+        <w:pStyle w:val="928"/>
         <w:numPr>
           <w:ilvl w:val="1"/>
           <w:numId w:val="12"/>
@@ -2411,7 +2411,7 @@
     </w:p>
     <w:p>
       <w:pPr>
-        <w:pStyle w:val="922"/>
+        <w:pStyle w:val="928"/>
         <w:numPr>
           <w:ilvl w:val="2"/>
           <w:numId w:val="12"/>
@@ -2479,8 +2479,6 @@
           <w:b/>
           <w:bCs/>
           <w:i/>
-          <w:iCs/>
-          <w:highlight w:val="none"/>
         </w:rPr>
       </w:r>
       <w:r>
@@ -2493,7 +2491,7 @@
     </w:p>
     <w:p>
       <w:pPr>
-        <w:pStyle w:val="922"/>
+        <w:pStyle w:val="928"/>
         <w:numPr>
           <w:ilvl w:val="1"/>
           <w:numId w:val="12"/>
@@ -2529,7 +2527,7 @@
     </w:p>
     <w:p>
       <w:pPr>
-        <w:pStyle w:val="922"/>
+        <w:pStyle w:val="928"/>
         <w:numPr>
           <w:ilvl w:val="1"/>
           <w:numId w:val="12"/>
@@ -2565,7 +2563,7 @@
     </w:p>
     <w:p>
       <w:pPr>
-        <w:pStyle w:val="922"/>
+        <w:pStyle w:val="928"/>
         <w:numPr>
           <w:ilvl w:val="1"/>
           <w:numId w:val="12"/>
@@ -2601,7 +2599,7 @@
     </w:p>
     <w:p>
       <w:pPr>
-        <w:pStyle w:val="922"/>
+        <w:pStyle w:val="928"/>
         <w:numPr>
           <w:ilvl w:val="0"/>
           <w:numId w:val="12"/>
@@ -2640,7 +2638,7 @@
     </w:p>
     <w:p>
       <w:pPr>
-        <w:pStyle w:val="922"/>
+        <w:pStyle w:val="928"/>
         <w:numPr>
           <w:ilvl w:val="1"/>
           <w:numId w:val="12"/>
@@ -2686,7 +2684,7 @@
     </w:p>
     <w:p>
       <w:pPr>
-        <w:pStyle w:val="922"/>
+        <w:pStyle w:val="928"/>
         <w:numPr>
           <w:ilvl w:val="1"/>
           <w:numId w:val="12"/>
@@ -2740,7 +2738,7 @@
     </w:p>
     <w:p>
       <w:pPr>
-        <w:pStyle w:val="922"/>
+        <w:pStyle w:val="928"/>
         <w:numPr>
           <w:ilvl w:val="1"/>
           <w:numId w:val="12"/>
@@ -2786,7 +2784,7 @@
     </w:p>
     <w:p>
       <w:pPr>
-        <w:pStyle w:val="922"/>
+        <w:pStyle w:val="928"/>
         <w:numPr>
           <w:ilvl w:val="2"/>
           <w:numId w:val="12"/>
@@ -2884,7 +2882,7 @@
     </w:p>
     <w:p>
       <w:pPr>
-        <w:pStyle w:val="922"/>
+        <w:pStyle w:val="928"/>
         <w:numPr>
           <w:ilvl w:val="1"/>
           <w:numId w:val="12"/>
@@ -2930,7 +2928,7 @@
     </w:p>
     <w:p>
       <w:pPr>
-        <w:pStyle w:val="922"/>
+        <w:pStyle w:val="928"/>
         <w:numPr>
           <w:ilvl w:val="2"/>
           <w:numId w:val="12"/>
@@ -2969,7 +2967,7 @@
     </w:p>
     <w:p>
       <w:pPr>
-        <w:pStyle w:val="922"/>
+        <w:pStyle w:val="928"/>
         <w:numPr>
           <w:ilvl w:val="3"/>
           <w:numId w:val="12"/>
@@ -3015,7 +3013,7 @@
     </w:p>
     <w:p>
       <w:pPr>
-        <w:pStyle w:val="922"/>
+        <w:pStyle w:val="928"/>
         <w:numPr>
           <w:ilvl w:val="3"/>
           <w:numId w:val="12"/>
@@ -3048,6 +3046,7 @@
         <w:rPr>
           <w:b/>
           <w:bCs/>
+          <w:highlight w:val="none"/>
         </w:rPr>
       </w:r>
       <w:r>
@@ -3060,7 +3059,7 @@
     </w:p>
     <w:p>
       <w:pPr>
-        <w:pStyle w:val="922"/>
+        <w:pStyle w:val="928"/>
         <w:numPr>
           <w:ilvl w:val="3"/>
           <w:numId w:val="12"/>
@@ -3099,7 +3098,7 @@
     </w:p>
     <w:p>
       <w:pPr>
-        <w:pStyle w:val="922"/>
+        <w:pStyle w:val="928"/>
         <w:numPr>
           <w:ilvl w:val="2"/>
           <w:numId w:val="12"/>
@@ -3138,7 +3137,7 @@
     </w:p>
     <w:p>
       <w:pPr>
-        <w:pStyle w:val="922"/>
+        <w:pStyle w:val="928"/>
         <w:numPr>
           <w:ilvl w:val="2"/>
           <w:numId w:val="12"/>
@@ -3245,7 +3244,7 @@
     </w:p>
     <w:p>
       <w:pPr>
-        <w:pStyle w:val="922"/>
+        <w:pStyle w:val="928"/>
         <w:numPr>
           <w:ilvl w:val="2"/>
           <w:numId w:val="12"/>
@@ -3300,7 +3299,7 @@
     </w:p>
     <w:p>
       <w:pPr>
-        <w:pStyle w:val="922"/>
+        <w:pStyle w:val="928"/>
         <w:numPr>
           <w:ilvl w:val="3"/>
           <w:numId w:val="12"/>
@@ -3347,7 +3346,7 @@
     </w:p>
     <w:p>
       <w:pPr>
-        <w:pStyle w:val="922"/>
+        <w:pStyle w:val="928"/>
         <w:numPr>
           <w:ilvl w:val="3"/>
           <w:numId w:val="12"/>
@@ -3411,7 +3410,7 @@
     </w:p>
     <w:p>
       <w:pPr>
-        <w:pStyle w:val="922"/>
+        <w:pStyle w:val="928"/>
         <w:numPr>
           <w:ilvl w:val="3"/>
           <w:numId w:val="12"/>
@@ -3475,7 +3474,7 @@
     </w:p>
     <w:p>
       <w:pPr>
-        <w:pStyle w:val="922"/>
+        <w:pStyle w:val="928"/>
         <w:numPr>
           <w:ilvl w:val="3"/>
           <w:numId w:val="12"/>
@@ -3514,7 +3513,7 @@
     </w:p>
     <w:p>
       <w:pPr>
-        <w:pStyle w:val="922"/>
+        <w:pStyle w:val="928"/>
         <w:numPr>
           <w:ilvl w:val="4"/>
           <w:numId w:val="12"/>
@@ -3564,7 +3563,7 @@
     </w:p>
     <w:p>
       <w:pPr>
-        <w:pStyle w:val="922"/>
+        <w:pStyle w:val="928"/>
         <w:numPr>
           <w:ilvl w:val="4"/>
           <w:numId w:val="12"/>
@@ -3601,9 +3600,8 @@
       <w:r>
         <w:rPr>
           <w:b w:val="0"/>
-          <w:bCs w:val="0"/>
+          <w:bCs/>
           <w:i/>
-          <w:iCs/>
           <w:highlight w:val="none"/>
         </w:rPr>
       </w:r>
@@ -3618,7 +3616,7 @@
     </w:p>
     <w:p>
       <w:pPr>
-        <w:pStyle w:val="922"/>
+        <w:pStyle w:val="928"/>
         <w:numPr>
           <w:ilvl w:val="4"/>
           <w:numId w:val="12"/>
@@ -3671,7 +3669,7 @@
     </w:p>
     <w:p>
       <w:pPr>
-        <w:pStyle w:val="922"/>
+        <w:pStyle w:val="928"/>
         <w:numPr>
           <w:ilvl w:val="3"/>
           <w:numId w:val="12"/>
@@ -3749,9 +3747,8 @@
       <w:r>
         <w:rPr>
           <w:b w:val="0"/>
-          <w:bCs w:val="0"/>
+          <w:bCs/>
           <w:i/>
-          <w:iCs/>
           <w:highlight w:val="none"/>
         </w:rPr>
       </w:r>
@@ -3766,7 +3763,7 @@
     </w:p>
     <w:p>
       <w:pPr>
-        <w:pStyle w:val="922"/>
+        <w:pStyle w:val="928"/>
         <w:numPr>
           <w:ilvl w:val="2"/>
           <w:numId w:val="12"/>
@@ -3810,7 +3807,7 @@
     </w:p>
     <w:p>
       <w:pPr>
-        <w:pStyle w:val="922"/>
+        <w:pStyle w:val="928"/>
         <w:numPr>
           <w:ilvl w:val="3"/>
           <w:numId w:val="12"/>
@@ -3857,9 +3854,8 @@
       <w:r>
         <w:rPr>
           <w:b w:val="0"/>
-          <w:bCs w:val="0"/>
-          <w:i w:val="0"/>
-          <w:iCs w:val="0"/>
+          <w:bCs/>
+          <w:i/>
           <w:highlight w:val="none"/>
         </w:rPr>
       </w:r>
@@ -3874,7 +3870,7 @@
     </w:p>
     <w:p>
       <w:pPr>
-        <w:pStyle w:val="922"/>
+        <w:pStyle w:val="928"/>
         <w:numPr>
           <w:ilvl w:val="1"/>
           <w:numId w:val="12"/>
@@ -3928,7 +3924,7 @@
     </w:p>
     <w:p>
       <w:pPr>
-        <w:pStyle w:val="922"/>
+        <w:pStyle w:val="928"/>
         <w:numPr>
           <w:ilvl w:val="2"/>
           <w:numId w:val="12"/>
@@ -3974,7 +3970,7 @@
     </w:p>
     <w:p>
       <w:pPr>
-        <w:pStyle w:val="922"/>
+        <w:pStyle w:val="928"/>
         <w:numPr>
           <w:ilvl w:val="3"/>
           <w:numId w:val="12"/>
@@ -4031,7 +4027,7 @@
     </w:p>
     <w:p>
       <w:pPr>
-        <w:pStyle w:val="922"/>
+        <w:pStyle w:val="928"/>
         <w:numPr>
           <w:ilvl w:val="3"/>
           <w:numId w:val="12"/>
@@ -4088,7 +4084,7 @@
     </w:p>
     <w:p>
       <w:pPr>
-        <w:pStyle w:val="922"/>
+        <w:pStyle w:val="928"/>
         <w:numPr>
           <w:ilvl w:val="3"/>
           <w:numId w:val="12"/>
@@ -4135,7 +4131,7 @@
     </w:p>
     <w:p>
       <w:pPr>
-        <w:pStyle w:val="922"/>
+        <w:pStyle w:val="928"/>
         <w:numPr>
           <w:ilvl w:val="1"/>
           <w:numId w:val="12"/>
@@ -4179,7 +4175,7 @@
     </w:p>
     <w:p>
       <w:pPr>
-        <w:pStyle w:val="922"/>
+        <w:pStyle w:val="928"/>
         <w:numPr>
           <w:ilvl w:val="2"/>
           <w:numId w:val="12"/>
@@ -4222,7 +4218,7 @@
     </w:p>
     <w:p>
       <w:pPr>
-        <w:pStyle w:val="922"/>
+        <w:pStyle w:val="928"/>
         <w:numPr>
           <w:ilvl w:val="0"/>
           <w:numId w:val="12"/>
@@ -4253,7 +4249,7 @@
       <w:hyperlink r:id="rId11" w:tooltip="https://qdrant.tech/course/essentials/day-3/sparse-vectors/" w:history="1">
         <w:r>
           <w:rPr>
-            <w:rStyle w:val="904"/>
+            <w:rStyle w:val="910"/>
             <w:b w:val="0"/>
             <w:bCs w:val="0"/>
             <w:highlight w:val="none"/>
@@ -4262,7 +4258,7 @@
         </w:r>
         <w:r>
           <w:rPr>
-            <w:rStyle w:val="904"/>
+            <w:rStyle w:val="910"/>
             <w:b w:val="0"/>
             <w:bCs w:val="0"/>
             <w:highlight w:val="none"/>
@@ -4281,7 +4277,6 @@
         <w:rPr>
           <w:b w:val="0"/>
           <w:bCs w:val="0"/>
-          <w:highlight w:val="none"/>
         </w:rPr>
       </w:r>
       <w:r>
@@ -4322,7 +4317,7 @@
     </w:p>
     <w:p>
       <w:pPr>
-        <w:pStyle w:val="922"/>
+        <w:pStyle w:val="928"/>
         <w:numPr>
           <w:ilvl w:val="0"/>
           <w:numId w:val="15"/>
@@ -4388,7 +4383,7 @@
     </w:p>
     <w:p>
       <w:pPr>
-        <w:pStyle w:val="922"/>
+        <w:pStyle w:val="928"/>
         <w:numPr>
           <w:ilvl w:val="0"/>
           <w:numId w:val="16"/>
@@ -4427,7 +4422,7 @@
     </w:p>
     <w:p>
       <w:pPr>
-        <w:pStyle w:val="922"/>
+        <w:pStyle w:val="928"/>
         <w:numPr>
           <w:ilvl w:val="0"/>
           <w:numId w:val="16"/>
@@ -4505,7 +4500,7 @@
     </w:p>
     <w:p>
       <w:pPr>
-        <w:pStyle w:val="922"/>
+        <w:pStyle w:val="928"/>
         <w:numPr>
           <w:ilvl w:val="0"/>
           <w:numId w:val="14"/>
@@ -4577,7 +4572,7 @@
     </w:p>
     <w:p>
       <w:pPr>
-        <w:pStyle w:val="922"/>
+        <w:pStyle w:val="928"/>
         <w:numPr>
           <w:ilvl w:val="0"/>
           <w:numId w:val="14"/>
@@ -4616,7 +4611,7 @@
     </w:p>
     <w:p>
       <w:pPr>
-        <w:pStyle w:val="922"/>
+        <w:pStyle w:val="928"/>
         <w:numPr>
           <w:ilvl w:val="1"/>
           <w:numId w:val="14"/>
@@ -4655,7 +4650,7 @@
     </w:p>
     <w:p>
       <w:pPr>
-        <w:pStyle w:val="922"/>
+        <w:pStyle w:val="928"/>
         <w:numPr>
           <w:ilvl w:val="1"/>
           <w:numId w:val="14"/>
@@ -4745,7 +4740,7 @@
     </w:p>
     <w:p>
       <w:pPr>
-        <w:pStyle w:val="922"/>
+        <w:pStyle w:val="928"/>
         <w:numPr>
           <w:ilvl w:val="0"/>
           <w:numId w:val="14"/>
@@ -4802,7 +4797,15 @@
         <w:t xml:space="preserve"> and that several systems consider decent </w:t>
       </w:r>
       <w:r>
-        <w:t xml:space="preserve">will beat a document that one system worships and another despises.</w:t>
+        <w:rPr>
+          <w:i/>
+          <w:iCs/>
+          <w:u w:val="single"/>
+        </w:rPr>
+        <w:t xml:space="preserve">will beat a document that one system worships and another despises</w:t>
+      </w:r>
+      <w:r>
+        <w:t xml:space="preserve">.</w:t>
       </w:r>
       <w:r>
         <w:t xml:space="preserve"> [Source: </w:t>
@@ -4810,18 +4813,18 @@
       <w:hyperlink r:id="rId12" w:tooltip="https://blog.serghei.pl/posts/reciprocal-rank-fusion-explained/" w:history="1">
         <w:r>
           <w:rPr>
-            <w:rStyle w:val="904"/>
+            <w:rStyle w:val="910"/>
           </w:rPr>
           <w:t xml:space="preserve">https://blog.serghei.pl/posts/reciprocal-rank-fusion-explained/</w:t>
         </w:r>
         <w:r>
           <w:rPr>
-            <w:rStyle w:val="904"/>
+            <w:rStyle w:val="910"/>
           </w:rPr>
         </w:r>
         <w:r>
           <w:rPr>
-            <w:rStyle w:val="904"/>
+            <w:rStyle w:val="910"/>
           </w:rPr>
         </w:r>
       </w:hyperlink>
@@ -4864,11 +4867,7 @@
           <w:highlight w:val="none"/>
         </w:rPr>
       </w:r>
-      <w:r>
-        <w:rPr>
-          <w:highlight w:val="none"/>
-        </w:rPr>
-      </w:r>
+      <w:r/>
     </w:p>
     <w:p>
       <w:pPr>
@@ -4926,10 +4925,18 @@
           <w:szCs w:val="36"/>
         </w:rPr>
       </w:r>
+      <w:r>
+        <w:rPr>
+          <w:b/>
+          <w:bCs/>
+          <w:sz w:val="36"/>
+          <w:szCs w:val="36"/>
+        </w:rPr>
+      </w:r>
     </w:p>
     <w:p>
       <w:pPr>
-        <w:pStyle w:val="922"/>
+        <w:pStyle w:val="928"/>
         <w:numPr>
           <w:ilvl w:val="0"/>
           <w:numId w:val="19"/>
@@ -4951,10 +4958,11 @@
           <w:szCs w:val="36"/>
         </w:rPr>
       </w:r>
+      <w:r/>
     </w:p>
     <w:p>
       <w:pPr>
-        <w:pStyle w:val="922"/>
+        <w:pStyle w:val="928"/>
         <w:numPr>
           <w:ilvl w:val="0"/>
           <w:numId w:val="19"/>
@@ -4976,10 +4984,11 @@
           <w:szCs w:val="36"/>
         </w:rPr>
       </w:r>
+      <w:r/>
     </w:p>
     <w:p>
       <w:pPr>
-        <w:pStyle w:val="922"/>
+        <w:pStyle w:val="928"/>
         <w:numPr>
           <w:ilvl w:val="1"/>
           <w:numId w:val="19"/>
@@ -5004,7 +5013,7 @@
     </w:p>
     <w:p>
       <w:pPr>
-        <w:pStyle w:val="922"/>
+        <w:pStyle w:val="928"/>
         <w:numPr>
           <w:ilvl w:val="2"/>
           <w:numId w:val="19"/>
@@ -5021,17 +5030,6 @@
         </w:rPr>
         <w:t xml:space="preserve">Measures LLM’s faithfulness to the retrieved contexts</w:t>
       </w:r>
-      <w:r/>
-      <w:r>
-        <w:rPr>
-          <w:highlight w:val="none"/>
-        </w:rPr>
-      </w:r>
-      <w:r>
-        <w:rPr>
-          <w:highlight w:val="none"/>
-        </w:rPr>
-      </w:r>
       <w:r>
         <w:rPr>
           <w:highlight w:val="none"/>
@@ -5041,7 +5039,7 @@
     </w:p>
     <w:p>
       <w:pPr>
-        <w:pStyle w:val="922"/>
+        <w:pStyle w:val="928"/>
         <w:numPr>
           <w:ilvl w:val="1"/>
           <w:numId w:val="19"/>
@@ -5063,7 +5061,7 @@
     </w:p>
     <w:p>
       <w:pPr>
-        <w:pStyle w:val="922"/>
+        <w:pStyle w:val="928"/>
         <w:numPr>
           <w:ilvl w:val="2"/>
           <w:numId w:val="19"/>
@@ -5085,15 +5083,11 @@
           <w:highlight w:val="none"/>
         </w:rPr>
       </w:r>
-      <w:r>
-        <w:rPr>
-          <w:highlight w:val="none"/>
-        </w:rPr>
-      </w:r>
+      <w:r/>
     </w:p>
     <w:p>
       <w:pPr>
-        <w:pStyle w:val="922"/>
+        <w:pStyle w:val="928"/>
         <w:numPr>
           <w:ilvl w:val="1"/>
           <w:numId w:val="19"/>
@@ -5120,10 +5114,16 @@
           <w:iCs/>
         </w:rPr>
       </w:r>
+      <w:r>
+        <w:rPr>
+          <w:bCs/>
+          <w:i/>
+        </w:rPr>
+      </w:r>
     </w:p>
     <w:p>
       <w:pPr>
-        <w:pStyle w:val="922"/>
+        <w:pStyle w:val="928"/>
         <w:numPr>
           <w:ilvl w:val="2"/>
           <w:numId w:val="19"/>
@@ -5145,15 +5145,11 @@
           <w:highlight w:val="none"/>
         </w:rPr>
       </w:r>
-      <w:r>
-        <w:rPr>
-          <w:highlight w:val="none"/>
-        </w:rPr>
-      </w:r>
+      <w:r/>
     </w:p>
     <w:p>
       <w:pPr>
-        <w:pStyle w:val="922"/>
+        <w:pStyle w:val="928"/>
         <w:numPr>
           <w:ilvl w:val="1"/>
           <w:numId w:val="19"/>
@@ -5164,7 +5160,6 @@
         <w:ind/>
         <w:rPr/>
       </w:pPr>
-      <w:r/>
       <w:r>
         <w:rPr>
           <w:i/>
@@ -5182,7 +5177,7 @@
     </w:p>
     <w:p>
       <w:pPr>
-        <w:pStyle w:val="922"/>
+        <w:pStyle w:val="928"/>
         <w:numPr>
           <w:ilvl w:val="2"/>
           <w:numId w:val="19"/>
@@ -5215,15 +5210,11 @@
           <w:highlight w:val="none"/>
         </w:rPr>
       </w:r>
-      <w:r>
-        <w:rPr>
-          <w:highlight w:val="none"/>
-        </w:rPr>
-      </w:r>
+      <w:r/>
     </w:p>
     <w:p>
       <w:pPr>
-        <w:pStyle w:val="922"/>
+        <w:pStyle w:val="928"/>
         <w:numPr>
           <w:ilvl w:val="0"/>
           <w:numId w:val="19"/>
@@ -5242,8 +5233,14 @@
       <w:r>
         <w:br w:type="page" w:clear="all"/>
       </w:r>
-      <w:r/>
-      <w:r/>
+      <w:r>
+        <w:rPr>
+          <w:b/>
+          <w:bCs/>
+          <w:sz w:val="36"/>
+          <w:szCs w:val="36"/>
+        </w:rPr>
+      </w:r>
     </w:p>
     <w:p>
       <w:pPr>
@@ -8361,9 +8358,9 @@
     <w:lsdException w:name="Bibliography" w:uiPriority="37"/>
     <w:lsdException w:name="TOC Heading" w:uiPriority="39" w:qFormat="1"/>
   </w:latentStyles>
-  <w:style w:type="table" w:styleId="733">
+  <w:style w:type="table" w:styleId="739">
     <w:name w:val="Table Grid"/>
-    <w:basedOn w:val="919"/>
+    <w:basedOn w:val="925"/>
     <w:uiPriority w:val="59"/>
     <w:pPr>
       <w:pBdr/>
@@ -8560,9 +8557,9 @@
       </w:tcPr>
     </w:tblStylePr>
   </w:style>
-  <w:style w:type="table" w:styleId="734">
+  <w:style w:type="table" w:styleId="740">
     <w:name w:val="Table Grid Light"/>
-    <w:basedOn w:val="919"/>
+    <w:basedOn w:val="925"/>
     <w:uiPriority w:val="59"/>
     <w:pPr>
       <w:pBdr/>
@@ -8759,9 +8756,9 @@
       </w:tcPr>
     </w:tblStylePr>
   </w:style>
-  <w:style w:type="table" w:styleId="735">
+  <w:style w:type="table" w:styleId="741">
     <w:name w:val="Plain Table 1"/>
-    <w:basedOn w:val="919"/>
+    <w:basedOn w:val="925"/>
     <w:uiPriority w:val="59"/>
     <w:pPr>
       <w:pBdr/>
@@ -8984,9 +8981,9 @@
       </w:tcPr>
     </w:tblStylePr>
   </w:style>
-  <w:style w:type="table" w:styleId="736">
+  <w:style w:type="table" w:styleId="742">
     <w:name w:val="Plain Table 2"/>
-    <w:basedOn w:val="919"/>
+    <w:basedOn w:val="925"/>
     <w:uiPriority w:val="59"/>
     <w:pPr>
       <w:pBdr/>
@@ -9217,9 +9214,9 @@
       </w:tcPr>
     </w:tblStylePr>
   </w:style>
-  <w:style w:type="table" w:styleId="737">
+  <w:style w:type="table" w:styleId="743">
     <w:name w:val="Plain Table 3"/>
-    <w:basedOn w:val="919"/>
+    <w:basedOn w:val="925"/>
     <w:uiPriority w:val="99"/>
     <w:pPr>
       <w:pBdr/>
@@ -9447,9 +9444,9 @@
       </w:tcPr>
     </w:tblStylePr>
   </w:style>
-  <w:style w:type="table" w:styleId="738">
+  <w:style w:type="table" w:styleId="744">
     <w:name w:val="Plain Table 4"/>
-    <w:basedOn w:val="919"/>
+    <w:basedOn w:val="925"/>
     <w:uiPriority w:val="99"/>
     <w:pPr>
       <w:pBdr/>
@@ -9663,9 +9660,9 @@
       </w:tcPr>
     </w:tblStylePr>
   </w:style>
-  <w:style w:type="table" w:styleId="739">
+  <w:style w:type="table" w:styleId="745">
     <w:name w:val="Plain Table 5"/>
-    <w:basedOn w:val="919"/>
+    <w:basedOn w:val="925"/>
     <w:uiPriority w:val="99"/>
     <w:pPr>
       <w:pBdr/>
@@ -9896,9 +9893,9 @@
       </w:tcPr>
     </w:tblStylePr>
   </w:style>
-  <w:style w:type="table" w:styleId="740">
+  <w:style w:type="table" w:styleId="746">
     <w:name w:val="Grid Table 1 Light"/>
-    <w:basedOn w:val="919"/>
+    <w:basedOn w:val="925"/>
     <w:uiPriority w:val="99"/>
     <w:pPr>
       <w:pBdr/>
@@ -10119,9 +10116,9 @@
       </w:tcPr>
     </w:tblStylePr>
   </w:style>
-  <w:style w:type="table" w:styleId="741">
+  <w:style w:type="table" w:styleId="747">
     <w:name w:val="Grid Table 1 Light - Accent 1"/>
-    <w:basedOn w:val="919"/>
+    <w:basedOn w:val="925"/>
     <w:uiPriority w:val="99"/>
     <w:pPr>
       <w:pBdr/>
@@ -10342,9 +10339,9 @@
       </w:tcPr>
     </w:tblStylePr>
   </w:style>
-  <w:style w:type="table" w:styleId="742">
+  <w:style w:type="table" w:styleId="748">
     <w:name w:val="Grid Table 1 Light - Accent 2"/>
-    <w:basedOn w:val="919"/>
+    <w:basedOn w:val="925"/>
     <w:uiPriority w:val="99"/>
     <w:pPr>
       <w:pBdr/>
@@ -10565,9 +10562,9 @@
       </w:tcPr>
     </w:tblStylePr>
   </w:style>
-  <w:style w:type="table" w:styleId="743">
+  <w:style w:type="table" w:styleId="749">
     <w:name w:val="Grid Table 1 Light - Accent 3"/>
-    <w:basedOn w:val="919"/>
+    <w:basedOn w:val="925"/>
     <w:uiPriority w:val="99"/>
     <w:pPr>
       <w:pBdr/>
@@ -10788,9 +10785,9 @@
       </w:tcPr>
     </w:tblStylePr>
   </w:style>
-  <w:style w:type="table" w:styleId="744">
+  <w:style w:type="table" w:styleId="750">
     <w:name w:val="Grid Table 1 Light - Accent 4"/>
-    <w:basedOn w:val="919"/>
+    <w:basedOn w:val="925"/>
     <w:uiPriority w:val="99"/>
     <w:pPr>
       <w:pBdr/>
@@ -11011,9 +11008,9 @@
       </w:tcPr>
     </w:tblStylePr>
   </w:style>
-  <w:style w:type="table" w:styleId="745">
+  <w:style w:type="table" w:styleId="751">
     <w:name w:val="Grid Table 1 Light - Accent 5"/>
-    <w:basedOn w:val="919"/>
+    <w:basedOn w:val="925"/>
     <w:uiPriority w:val="99"/>
     <w:pPr>
       <w:pBdr/>
@@ -11234,9 +11231,9 @@
       </w:tcPr>
     </w:tblStylePr>
   </w:style>
-  <w:style w:type="table" w:styleId="746">
+  <w:style w:type="table" w:styleId="752">
     <w:name w:val="Grid Table 1 Light - Accent 6"/>
-    <w:basedOn w:val="919"/>
+    <w:basedOn w:val="925"/>
     <w:uiPriority w:val="99"/>
     <w:pPr>
       <w:pBdr/>
@@ -11457,9 +11454,9 @@
       </w:tcPr>
     </w:tblStylePr>
   </w:style>
-  <w:style w:type="table" w:styleId="747">
+  <w:style w:type="table" w:styleId="753">
     <w:name w:val="Grid Table 2"/>
-    <w:basedOn w:val="919"/>
+    <w:basedOn w:val="925"/>
     <w:uiPriority w:val="99"/>
     <w:pPr>
       <w:pBdr/>
@@ -11689,9 +11686,9 @@
       </w:tcPr>
     </w:tblStylePr>
   </w:style>
-  <w:style w:type="table" w:styleId="748">
+  <w:style w:type="table" w:styleId="754">
     <w:name w:val="Grid Table 2 - Accent 1"/>
-    <w:basedOn w:val="919"/>
+    <w:basedOn w:val="925"/>
     <w:uiPriority w:val="99"/>
     <w:pPr>
       <w:pBdr/>
@@ -11921,9 +11918,9 @@
       </w:tcPr>
     </w:tblStylePr>
   </w:style>
-  <w:style w:type="table" w:styleId="749">
+  <w:style w:type="table" w:styleId="755">
     <w:name w:val="Grid Table 2 - Accent 2"/>
-    <w:basedOn w:val="919"/>
+    <w:basedOn w:val="925"/>
     <w:uiPriority w:val="99"/>
     <w:pPr>
       <w:pBdr/>
@@ -12153,9 +12150,9 @@
       </w:tcPr>
     </w:tblStylePr>
   </w:style>
-  <w:style w:type="table" w:styleId="750">
+  <w:style w:type="table" w:styleId="756">
     <w:name w:val="Grid Table 2 - Accent 3"/>
-    <w:basedOn w:val="919"/>
+    <w:basedOn w:val="925"/>
     <w:uiPriority w:val="99"/>
     <w:pPr>
       <w:pBdr/>
@@ -12385,9 +12382,9 @@
       </w:tcPr>
     </w:tblStylePr>
   </w:style>
-  <w:style w:type="table" w:styleId="751">
+  <w:style w:type="table" w:styleId="757">
     <w:name w:val="Grid Table 2 - Accent 4"/>
-    <w:basedOn w:val="919"/>
+    <w:basedOn w:val="925"/>
     <w:uiPriority w:val="99"/>
     <w:pPr>
       <w:pBdr/>
@@ -12617,9 +12614,9 @@
       </w:tcPr>
     </w:tblStylePr>
   </w:style>
-  <w:style w:type="table" w:styleId="752">
+  <w:style w:type="table" w:styleId="758">
     <w:name w:val="Grid Table 2 - Accent 5"/>
-    <w:basedOn w:val="919"/>
+    <w:basedOn w:val="925"/>
     <w:uiPriority w:val="99"/>
     <w:pPr>
       <w:pBdr/>
@@ -12849,9 +12846,9 @@
       </w:tcPr>
     </w:tblStylePr>
   </w:style>
-  <w:style w:type="table" w:styleId="753">
+  <w:style w:type="table" w:styleId="759">
     <w:name w:val="Grid Table 2 - Accent 6"/>
-    <w:basedOn w:val="919"/>
+    <w:basedOn w:val="925"/>
     <w:uiPriority w:val="99"/>
     <w:pPr>
       <w:pBdr/>
@@ -13081,9 +13078,9 @@
       </w:tcPr>
     </w:tblStylePr>
   </w:style>
-  <w:style w:type="table" w:styleId="754">
+  <w:style w:type="table" w:styleId="760">
     <w:name w:val="Grid Table 3"/>
-    <w:basedOn w:val="919"/>
+    <w:basedOn w:val="925"/>
     <w:uiPriority w:val="99"/>
     <w:pPr>
       <w:pBdr/>
@@ -13326,9 +13323,9 @@
       </w:tcPr>
     </w:tblStylePr>
   </w:style>
-  <w:style w:type="table" w:styleId="755">
+  <w:style w:type="table" w:styleId="761">
     <w:name w:val="Grid Table 3 - Accent 1"/>
-    <w:basedOn w:val="919"/>
+    <w:basedOn w:val="925"/>
     <w:uiPriority w:val="99"/>
     <w:pPr>
       <w:pBdr/>
@@ -13571,9 +13568,9 @@
       </w:tcPr>
     </w:tblStylePr>
   </w:style>
-  <w:style w:type="table" w:styleId="756">
+  <w:style w:type="table" w:styleId="762">
     <w:name w:val="Grid Table 3 - Accent 2"/>
-    <w:basedOn w:val="919"/>
+    <w:basedOn w:val="925"/>
     <w:uiPriority w:val="99"/>
     <w:pPr>
       <w:pBdr/>
@@ -13816,9 +13813,9 @@
       </w:tcPr>
     </w:tblStylePr>
   </w:style>
-  <w:style w:type="table" w:styleId="757">
+  <w:style w:type="table" w:styleId="763">
     <w:name w:val="Grid Table 3 - Accent 3"/>
-    <w:basedOn w:val="919"/>
+    <w:basedOn w:val="925"/>
     <w:uiPriority w:val="99"/>
     <w:pPr>
       <w:pBdr/>
@@ -14061,9 +14058,9 @@
       </w:tcPr>
     </w:tblStylePr>
   </w:style>
-  <w:style w:type="table" w:styleId="758">
+  <w:style w:type="table" w:styleId="764">
     <w:name w:val="Grid Table 3 - Accent 4"/>
-    <w:basedOn w:val="919"/>
+    <w:basedOn w:val="925"/>
     <w:uiPriority w:val="99"/>
     <w:pPr>
       <w:pBdr/>
@@ -14306,9 +14303,9 @@
       </w:tcPr>
     </w:tblStylePr>
   </w:style>
-  <w:style w:type="table" w:styleId="759">
+  <w:style w:type="table" w:styleId="765">
     <w:name w:val="Grid Table 3 - Accent 5"/>
-    <w:basedOn w:val="919"/>
+    <w:basedOn w:val="925"/>
     <w:uiPriority w:val="99"/>
     <w:pPr>
       <w:pBdr/>
@@ -14551,9 +14548,9 @@
       </w:tcPr>
     </w:tblStylePr>
   </w:style>
-  <w:style w:type="table" w:styleId="760">
+  <w:style w:type="table" w:styleId="766">
     <w:name w:val="Grid Table 3 - Accent 6"/>
-    <w:basedOn w:val="919"/>
+    <w:basedOn w:val="925"/>
     <w:uiPriority w:val="99"/>
     <w:pPr>
       <w:pBdr/>
@@ -14796,9 +14793,9 @@
       </w:tcPr>
     </w:tblStylePr>
   </w:style>
-  <w:style w:type="table" w:styleId="761">
+  <w:style w:type="table" w:styleId="767">
     <w:name w:val="Grid Table 4"/>
-    <w:basedOn w:val="919"/>
+    <w:basedOn w:val="925"/>
     <w:uiPriority w:val="59"/>
     <w:pPr>
       <w:pBdr/>
@@ -15029,9 +15026,9 @@
       </w:tcPr>
     </w:tblStylePr>
   </w:style>
-  <w:style w:type="table" w:styleId="762">
+  <w:style w:type="table" w:styleId="768">
     <w:name w:val="Grid Table 4 - Accent 1"/>
-    <w:basedOn w:val="919"/>
+    <w:basedOn w:val="925"/>
     <w:uiPriority w:val="59"/>
     <w:pPr>
       <w:pBdr/>
@@ -15262,9 +15259,9 @@
       </w:tcPr>
     </w:tblStylePr>
   </w:style>
-  <w:style w:type="table" w:styleId="763">
+  <w:style w:type="table" w:styleId="769">
     <w:name w:val="Grid Table 4 - Accent 2"/>
-    <w:basedOn w:val="919"/>
+    <w:basedOn w:val="925"/>
     <w:uiPriority w:val="59"/>
     <w:pPr>
       <w:pBdr/>
@@ -15495,9 +15492,9 @@
       </w:tcPr>
     </w:tblStylePr>
   </w:style>
-  <w:style w:type="table" w:styleId="764">
+  <w:style w:type="table" w:styleId="770">
     <w:name w:val="Grid Table 4 - Accent 3"/>
-    <w:basedOn w:val="919"/>
+    <w:basedOn w:val="925"/>
     <w:uiPriority w:val="59"/>
     <w:pPr>
       <w:pBdr/>
@@ -15728,9 +15725,9 @@
       </w:tcPr>
     </w:tblStylePr>
   </w:style>
-  <w:style w:type="table" w:styleId="765">
+  <w:style w:type="table" w:styleId="771">
     <w:name w:val="Grid Table 4 - Accent 4"/>
-    <w:basedOn w:val="919"/>
+    <w:basedOn w:val="925"/>
     <w:uiPriority w:val="59"/>
     <w:pPr>
       <w:pBdr/>
@@ -15961,9 +15958,9 @@
       </w:tcPr>
     </w:tblStylePr>
   </w:style>
-  <w:style w:type="table" w:styleId="766">
+  <w:style w:type="table" w:styleId="772">
     <w:name w:val="Grid Table 4 - Accent 5"/>
-    <w:basedOn w:val="919"/>
+    <w:basedOn w:val="925"/>
     <w:uiPriority w:val="59"/>
     <w:pPr>
       <w:pBdr/>
@@ -16194,9 +16191,9 @@
       </w:tcPr>
     </w:tblStylePr>
   </w:style>
-  <w:style w:type="table" w:styleId="767">
+  <w:style w:type="table" w:styleId="773">
     <w:name w:val="Grid Table 4 - Accent 6"/>
-    <w:basedOn w:val="919"/>
+    <w:basedOn w:val="925"/>
     <w:uiPriority w:val="59"/>
     <w:pPr>
       <w:pBdr/>
@@ -16427,9 +16424,9 @@
       </w:tcPr>
     </w:tblStylePr>
   </w:style>
-  <w:style w:type="table" w:styleId="768">
+  <w:style w:type="table" w:styleId="774">
     <w:name w:val="Grid Table 5 Dark"/>
-    <w:basedOn w:val="919"/>
+    <w:basedOn w:val="925"/>
     <w:uiPriority w:val="99"/>
     <w:pPr>
       <w:pBdr/>
@@ -16655,9 +16652,9 @@
       </w:tcPr>
     </w:tblStylePr>
   </w:style>
-  <w:style w:type="table" w:styleId="769">
+  <w:style w:type="table" w:styleId="775">
     <w:name w:val="Grid Table 5 Dark- Accent 1"/>
-    <w:basedOn w:val="919"/>
+    <w:basedOn w:val="925"/>
     <w:uiPriority w:val="99"/>
     <w:pPr>
       <w:pBdr/>
@@ -16883,9 +16880,9 @@
       </w:tcPr>
     </w:tblStylePr>
   </w:style>
-  <w:style w:type="table" w:styleId="770">
+  <w:style w:type="table" w:styleId="776">
     <w:name w:val="Grid Table 5 Dark - Accent 2"/>
-    <w:basedOn w:val="919"/>
+    <w:basedOn w:val="925"/>
     <w:uiPriority w:val="99"/>
     <w:pPr>
       <w:pBdr/>
@@ -17111,9 +17108,9 @@
       </w:tcPr>
     </w:tblStylePr>
   </w:style>
-  <w:style w:type="table" w:styleId="771">
+  <w:style w:type="table" w:styleId="777">
     <w:name w:val="Grid Table 5 Dark - Accent 3"/>
-    <w:basedOn w:val="919"/>
+    <w:basedOn w:val="925"/>
     <w:uiPriority w:val="99"/>
     <w:pPr>
       <w:pBdr/>
@@ -17339,9 +17336,9 @@
       </w:tcPr>
     </w:tblStylePr>
   </w:style>
-  <w:style w:type="table" w:styleId="772">
+  <w:style w:type="table" w:styleId="778">
     <w:name w:val="Grid Table 5 Dark- Accent 4"/>
-    <w:basedOn w:val="919"/>
+    <w:basedOn w:val="925"/>
     <w:uiPriority w:val="99"/>
     <w:pPr>
       <w:pBdr/>
@@ -17567,9 +17564,9 @@
       </w:tcPr>
     </w:tblStylePr>
   </w:style>
-  <w:style w:type="table" w:styleId="773">
+  <w:style w:type="table" w:styleId="779">
     <w:name w:val="Grid Table 5 Dark - Accent 5"/>
-    <w:basedOn w:val="919"/>
+    <w:basedOn w:val="925"/>
     <w:uiPriority w:val="99"/>
     <w:pPr>
       <w:pBdr/>
@@ -17795,9 +17792,9 @@
       </w:tcPr>
     </w:tblStylePr>
   </w:style>
-  <w:style w:type="table" w:styleId="774">
+  <w:style w:type="table" w:styleId="780">
     <w:name w:val="Grid Table 5 Dark - Accent 6"/>
-    <w:basedOn w:val="919"/>
+    <w:basedOn w:val="925"/>
     <w:uiPriority w:val="99"/>
     <w:pPr>
       <w:pBdr/>
@@ -18023,9 +18020,9 @@
       </w:tcPr>
     </w:tblStylePr>
   </w:style>
-  <w:style w:type="table" w:styleId="775">
+  <w:style w:type="table" w:styleId="781">
     <w:name w:val="Grid Table 6 Colorful"/>
-    <w:basedOn w:val="919"/>
+    <w:basedOn w:val="925"/>
     <w:uiPriority w:val="99"/>
     <w:pPr>
       <w:pBdr/>
@@ -18253,9 +18250,9 @@
       </w:tcPr>
     </w:tblStylePr>
   </w:style>
-  <w:style w:type="table" w:styleId="776">
+  <w:style w:type="table" w:styleId="782">
     <w:name w:val="Grid Table 6 Colorful - Accent 1"/>
-    <w:basedOn w:val="919"/>
+    <w:basedOn w:val="925"/>
     <w:uiPriority w:val="99"/>
     <w:pPr>
       <w:pBdr/>
@@ -18483,9 +18480,9 @@
       </w:tcPr>
     </w:tblStylePr>
   </w:style>
-  <w:style w:type="table" w:styleId="777">
+  <w:style w:type="table" w:styleId="783">
     <w:name w:val="Grid Table 6 Colorful - Accent 2"/>
-    <w:basedOn w:val="919"/>
+    <w:basedOn w:val="925"/>
     <w:uiPriority w:val="99"/>
     <w:pPr>
       <w:pBdr/>
@@ -18713,9 +18710,9 @@
       </w:tcPr>
     </w:tblStylePr>
   </w:style>
-  <w:style w:type="table" w:styleId="778">
+  <w:style w:type="table" w:styleId="784">
     <w:name w:val="Grid Table 6 Colorful - Accent 3"/>
-    <w:basedOn w:val="919"/>
+    <w:basedOn w:val="925"/>
     <w:uiPriority w:val="99"/>
     <w:pPr>
       <w:pBdr/>
@@ -18943,9 +18940,9 @@
       </w:tcPr>
     </w:tblStylePr>
   </w:style>
-  <w:style w:type="table" w:styleId="779">
+  <w:style w:type="table" w:styleId="785">
     <w:name w:val="Grid Table 6 Colorful - Accent 4"/>
-    <w:basedOn w:val="919"/>
+    <w:basedOn w:val="925"/>
     <w:uiPriority w:val="99"/>
     <w:pPr>
       <w:pBdr/>
@@ -19173,9 +19170,9 @@
       </w:tcPr>
     </w:tblStylePr>
   </w:style>
-  <w:style w:type="table" w:styleId="780">
+  <w:style w:type="table" w:styleId="786">
     <w:name w:val="Grid Table 6 Colorful - Accent 5"/>
-    <w:basedOn w:val="919"/>
+    <w:basedOn w:val="925"/>
     <w:uiPriority w:val="99"/>
     <w:pPr>
       <w:pBdr/>
@@ -19403,9 +19400,9 @@
       </w:tcPr>
     </w:tblStylePr>
   </w:style>
-  <w:style w:type="table" w:styleId="781">
+  <w:style w:type="table" w:styleId="787">
     <w:name w:val="Grid Table 6 Colorful - Accent 6"/>
-    <w:basedOn w:val="919"/>
+    <w:basedOn w:val="925"/>
     <w:uiPriority w:val="99"/>
     <w:pPr>
       <w:pBdr/>
@@ -19633,9 +19630,9 @@
       </w:tcPr>
     </w:tblStylePr>
   </w:style>
-  <w:style w:type="table" w:styleId="782">
+  <w:style w:type="table" w:styleId="788">
     <w:name w:val="Grid Table 7 Colorful"/>
-    <w:basedOn w:val="919"/>
+    <w:basedOn w:val="925"/>
     <w:uiPriority w:val="99"/>
     <w:pPr>
       <w:pBdr/>
@@ -19887,9 +19884,9 @@
       </w:tcPr>
     </w:tblStylePr>
   </w:style>
-  <w:style w:type="table" w:styleId="783">
+  <w:style w:type="table" w:styleId="789">
     <w:name w:val="Grid Table 7 Colorful - Accent 1"/>
-    <w:basedOn w:val="919"/>
+    <w:basedOn w:val="925"/>
     <w:uiPriority w:val="99"/>
     <w:pPr>
       <w:pBdr/>
@@ -20141,9 +20138,9 @@
       </w:tcPr>
     </w:tblStylePr>
   </w:style>
-  <w:style w:type="table" w:styleId="784">
+  <w:style w:type="table" w:styleId="790">
     <w:name w:val="Grid Table 7 Colorful - Accent 2"/>
-    <w:basedOn w:val="919"/>
+    <w:basedOn w:val="925"/>
     <w:uiPriority w:val="99"/>
     <w:pPr>
       <w:pBdr/>
@@ -20395,9 +20392,9 @@
       </w:tcPr>
     </w:tblStylePr>
   </w:style>
-  <w:style w:type="table" w:styleId="785">
+  <w:style w:type="table" w:styleId="791">
     <w:name w:val="Grid Table 7 Colorful - Accent 3"/>
-    <w:basedOn w:val="919"/>
+    <w:basedOn w:val="925"/>
     <w:uiPriority w:val="99"/>
     <w:pPr>
       <w:pBdr/>
@@ -20649,9 +20646,9 @@
       </w:tcPr>
     </w:tblStylePr>
   </w:style>
-  <w:style w:type="table" w:styleId="786">
+  <w:style w:type="table" w:styleId="792">
     <w:name w:val="Grid Table 7 Colorful - Accent 4"/>
-    <w:basedOn w:val="919"/>
+    <w:basedOn w:val="925"/>
     <w:uiPriority w:val="99"/>
     <w:pPr>
       <w:pBdr/>
@@ -20903,9 +20900,9 @@
       </w:tcPr>
     </w:tblStylePr>
   </w:style>
-  <w:style w:type="table" w:styleId="787">
+  <w:style w:type="table" w:styleId="793">
     <w:name w:val="Grid Table 7 Colorful - Accent 5"/>
-    <w:basedOn w:val="919"/>
+    <w:basedOn w:val="925"/>
     <w:uiPriority w:val="99"/>
     <w:pPr>
       <w:pBdr/>
@@ -21157,9 +21154,9 @@
       </w:tcPr>
     </w:tblStylePr>
   </w:style>
-  <w:style w:type="table" w:styleId="788">
+  <w:style w:type="table" w:styleId="794">
     <w:name w:val="Grid Table 7 Colorful - Accent 6"/>
-    <w:basedOn w:val="919"/>
+    <w:basedOn w:val="925"/>
     <w:uiPriority w:val="99"/>
     <w:pPr>
       <w:pBdr/>
@@ -21411,9 +21408,9 @@
       </w:tcPr>
     </w:tblStylePr>
   </w:style>
-  <w:style w:type="table" w:styleId="789">
+  <w:style w:type="table" w:styleId="795">
     <w:name w:val="List Table 1 Light"/>
-    <w:basedOn w:val="919"/>
+    <w:basedOn w:val="925"/>
     <w:uiPriority w:val="99"/>
     <w:pPr>
       <w:pBdr/>
@@ -21627,9 +21624,9 @@
       </w:tcPr>
     </w:tblStylePr>
   </w:style>
-  <w:style w:type="table" w:styleId="790">
+  <w:style w:type="table" w:styleId="796">
     <w:name w:val="List Table 1 Light - Accent 1"/>
-    <w:basedOn w:val="919"/>
+    <w:basedOn w:val="925"/>
     <w:uiPriority w:val="99"/>
     <w:pPr>
       <w:pBdr/>
@@ -21843,9 +21840,9 @@
       </w:tcPr>
     </w:tblStylePr>
   </w:style>
-  <w:style w:type="table" w:styleId="791">
+  <w:style w:type="table" w:styleId="797">
     <w:name w:val="List Table 1 Light - Accent 2"/>
-    <w:basedOn w:val="919"/>
+    <w:basedOn w:val="925"/>
     <w:uiPriority w:val="99"/>
     <w:pPr>
       <w:pBdr/>
@@ -22059,9 +22056,9 @@
       </w:tcPr>
     </w:tblStylePr>
   </w:style>
-  <w:style w:type="table" w:styleId="792">
+  <w:style w:type="table" w:styleId="798">
     <w:name w:val="List Table 1 Light - Accent 3"/>
-    <w:basedOn w:val="919"/>
+    <w:basedOn w:val="925"/>
     <w:uiPriority w:val="99"/>
     <w:pPr>
       <w:pBdr/>
@@ -22275,9 +22272,9 @@
       </w:tcPr>
     </w:tblStylePr>
   </w:style>
-  <w:style w:type="table" w:styleId="793">
+  <w:style w:type="table" w:styleId="799">
     <w:name w:val="List Table 1 Light - Accent 4"/>
-    <w:basedOn w:val="919"/>
+    <w:basedOn w:val="925"/>
     <w:uiPriority w:val="99"/>
     <w:pPr>
       <w:pBdr/>
@@ -22491,9 +22488,9 @@
       </w:tcPr>
     </w:tblStylePr>
   </w:style>
-  <w:style w:type="table" w:styleId="794">
+  <w:style w:type="table" w:styleId="800">
     <w:name w:val="List Table 1 Light - Accent 5"/>
-    <w:basedOn w:val="919"/>
+    <w:basedOn w:val="925"/>
     <w:uiPriority w:val="99"/>
     <w:pPr>
       <w:pBdr/>
@@ -22707,9 +22704,9 @@
       </w:tcPr>
     </w:tblStylePr>
   </w:style>
-  <w:style w:type="table" w:styleId="795">
+  <w:style w:type="table" w:styleId="801">
     <w:name w:val="List Table 1 Light - Accent 6"/>
-    <w:basedOn w:val="919"/>
+    <w:basedOn w:val="925"/>
     <w:uiPriority w:val="99"/>
     <w:pPr>
       <w:pBdr/>
@@ -22923,9 +22920,9 @@
       </w:tcPr>
     </w:tblStylePr>
   </w:style>
-  <w:style w:type="table" w:styleId="796">
+  <w:style w:type="table" w:styleId="802">
     <w:name w:val="List Table 2"/>
-    <w:basedOn w:val="919"/>
+    <w:basedOn w:val="925"/>
     <w:uiPriority w:val="99"/>
     <w:pPr>
       <w:pBdr/>
@@ -23161,9 +23158,9 @@
       </w:tcPr>
     </w:tblStylePr>
   </w:style>
-  <w:style w:type="table" w:styleId="797">
+  <w:style w:type="table" w:styleId="803">
     <w:name w:val="List Table 2 - Accent 1"/>
-    <w:basedOn w:val="919"/>
+    <w:basedOn w:val="925"/>
     <w:uiPriority w:val="99"/>
     <w:pPr>
       <w:pBdr/>
@@ -23399,9 +23396,9 @@
       </w:tcPr>
     </w:tblStylePr>
   </w:style>
-  <w:style w:type="table" w:styleId="798">
+  <w:style w:type="table" w:styleId="804">
     <w:name w:val="List Table 2 - Accent 2"/>
-    <w:basedOn w:val="919"/>
+    <w:basedOn w:val="925"/>
     <w:uiPriority w:val="99"/>
     <w:pPr>
       <w:pBdr/>
@@ -23637,9 +23634,9 @@
       </w:tcPr>
     </w:tblStylePr>
   </w:style>
-  <w:style w:type="table" w:styleId="799">
+  <w:style w:type="table" w:styleId="805">
     <w:name w:val="List Table 2 - Accent 3"/>
-    <w:basedOn w:val="919"/>
+    <w:basedOn w:val="925"/>
     <w:uiPriority w:val="99"/>
     <w:pPr>
       <w:pBdr/>
@@ -23875,9 +23872,9 @@
       </w:tcPr>
     </w:tblStylePr>
   </w:style>
-  <w:style w:type="table" w:styleId="800">
+  <w:style w:type="table" w:styleId="806">
     <w:name w:val="List Table 2 - Accent 4"/>
-    <w:basedOn w:val="919"/>
+    <w:basedOn w:val="925"/>
     <w:uiPriority w:val="99"/>
     <w:pPr>
       <w:pBdr/>
@@ -24113,9 +24110,9 @@
       </w:tcPr>
     </w:tblStylePr>
   </w:style>
-  <w:style w:type="table" w:styleId="801">
+  <w:style w:type="table" w:styleId="807">
     <w:name w:val="List Table 2 - Accent 5"/>
-    <w:basedOn w:val="919"/>
+    <w:basedOn w:val="925"/>
     <w:uiPriority w:val="99"/>
     <w:pPr>
       <w:pBdr/>
@@ -24351,9 +24348,9 @@
       </w:tcPr>
     </w:tblStylePr>
   </w:style>
-  <w:style w:type="table" w:styleId="802">
+  <w:style w:type="table" w:styleId="808">
     <w:name w:val="List Table 2 - Accent 6"/>
-    <w:basedOn w:val="919"/>
+    <w:basedOn w:val="925"/>
     <w:uiPriority w:val="99"/>
     <w:pPr>
       <w:pBdr/>
@@ -24589,9 +24586,9 @@
       </w:tcPr>
     </w:tblStylePr>
   </w:style>
-  <w:style w:type="table" w:styleId="803">
+  <w:style w:type="table" w:styleId="809">
     <w:name w:val="List Table 3"/>
-    <w:basedOn w:val="919"/>
+    <w:basedOn w:val="925"/>
     <w:uiPriority w:val="99"/>
     <w:pPr>
       <w:pBdr/>
@@ -24817,9 +24814,9 @@
       </w:tcPr>
     </w:tblStylePr>
   </w:style>
-  <w:style w:type="table" w:styleId="804">
+  <w:style w:type="table" w:styleId="810">
     <w:name w:val="List Table 3 - Accent 1"/>
-    <w:basedOn w:val="919"/>
+    <w:basedOn w:val="925"/>
     <w:uiPriority w:val="99"/>
     <w:pPr>
       <w:pBdr/>
@@ -25045,9 +25042,9 @@
       </w:tcPr>
     </w:tblStylePr>
   </w:style>
-  <w:style w:type="table" w:styleId="805">
+  <w:style w:type="table" w:styleId="811">
     <w:name w:val="List Table 3 - Accent 2"/>
-    <w:basedOn w:val="919"/>
+    <w:basedOn w:val="925"/>
     <w:uiPriority w:val="99"/>
     <w:pPr>
       <w:pBdr/>
@@ -25273,9 +25270,9 @@
       </w:tcPr>
     </w:tblStylePr>
   </w:style>
-  <w:style w:type="table" w:styleId="806">
+  <w:style w:type="table" w:styleId="812">
     <w:name w:val="List Table 3 - Accent 3"/>
-    <w:basedOn w:val="919"/>
+    <w:basedOn w:val="925"/>
     <w:uiPriority w:val="99"/>
     <w:pPr>
       <w:pBdr/>
@@ -25501,9 +25498,9 @@
       </w:tcPr>
     </w:tblStylePr>
   </w:style>
-  <w:style w:type="table" w:styleId="807">
+  <w:style w:type="table" w:styleId="813">
     <w:name w:val="List Table 3 - Accent 4"/>
-    <w:basedOn w:val="919"/>
+    <w:basedOn w:val="925"/>
     <w:uiPriority w:val="99"/>
     <w:pPr>
       <w:pBdr/>
@@ -25729,9 +25726,9 @@
       </w:tcPr>
     </w:tblStylePr>
   </w:style>
-  <w:style w:type="table" w:styleId="808">
+  <w:style w:type="table" w:styleId="814">
     <w:name w:val="List Table 3 - Accent 5"/>
-    <w:basedOn w:val="919"/>
+    <w:basedOn w:val="925"/>
     <w:uiPriority w:val="99"/>
     <w:pPr>
       <w:pBdr/>
@@ -25957,9 +25954,9 @@
       </w:tcPr>
     </w:tblStylePr>
   </w:style>
-  <w:style w:type="table" w:styleId="809">
+  <w:style w:type="table" w:styleId="815">
     <w:name w:val="List Table 3 - Accent 6"/>
-    <w:basedOn w:val="919"/>
+    <w:basedOn w:val="925"/>
     <w:uiPriority w:val="99"/>
     <w:pPr>
       <w:pBdr/>
@@ -26185,9 +26182,9 @@
       </w:tcPr>
     </w:tblStylePr>
   </w:style>
-  <w:style w:type="table" w:styleId="810">
+  <w:style w:type="table" w:styleId="816">
     <w:name w:val="List Table 4"/>
-    <w:basedOn w:val="919"/>
+    <w:basedOn w:val="925"/>
     <w:uiPriority w:val="99"/>
     <w:pPr>
       <w:pBdr/>
@@ -26410,9 +26407,9 @@
       </w:tcPr>
     </w:tblStylePr>
   </w:style>
-  <w:style w:type="table" w:styleId="811">
+  <w:style w:type="table" w:styleId="817">
     <w:name w:val="List Table 4 - Accent 1"/>
-    <w:basedOn w:val="919"/>
+    <w:basedOn w:val="925"/>
     <w:uiPriority w:val="99"/>
     <w:pPr>
       <w:pBdr/>
@@ -26635,9 +26632,9 @@
       </w:tcPr>
     </w:tblStylePr>
   </w:style>
-  <w:style w:type="table" w:styleId="812">
+  <w:style w:type="table" w:styleId="818">
     <w:name w:val="List Table 4 - Accent 2"/>
-    <w:basedOn w:val="919"/>
+    <w:basedOn w:val="925"/>
     <w:uiPriority w:val="99"/>
     <w:pPr>
       <w:pBdr/>
@@ -26860,9 +26857,9 @@
       </w:tcPr>
     </w:tblStylePr>
   </w:style>
-  <w:style w:type="table" w:styleId="813">
+  <w:style w:type="table" w:styleId="819">
     <w:name w:val="List Table 4 - Accent 3"/>
-    <w:basedOn w:val="919"/>
+    <w:basedOn w:val="925"/>
     <w:uiPriority w:val="99"/>
     <w:pPr>
       <w:pBdr/>
@@ -27085,9 +27082,9 @@
       </w:tcPr>
     </w:tblStylePr>
   </w:style>
-  <w:style w:type="table" w:styleId="814">
+  <w:style w:type="table" w:styleId="820">
     <w:name w:val="List Table 4 - Accent 4"/>
-    <w:basedOn w:val="919"/>
+    <w:basedOn w:val="925"/>
     <w:uiPriority w:val="99"/>
     <w:pPr>
       <w:pBdr/>
@@ -27310,9 +27307,9 @@
       </w:tcPr>
     </w:tblStylePr>
   </w:style>
-  <w:style w:type="table" w:styleId="815">
+  <w:style w:type="table" w:styleId="821">
     <w:name w:val="List Table 4 - Accent 5"/>
-    <w:basedOn w:val="919"/>
+    <w:basedOn w:val="925"/>
     <w:uiPriority w:val="99"/>
     <w:pPr>
       <w:pBdr/>
@@ -27535,9 +27532,9 @@
       </w:tcPr>
     </w:tblStylePr>
   </w:style>
-  <w:style w:type="table" w:styleId="816">
+  <w:style w:type="table" w:styleId="822">
     <w:name w:val="List Table 4 - Accent 6"/>
-    <w:basedOn w:val="919"/>
+    <w:basedOn w:val="925"/>
     <w:uiPriority w:val="99"/>
     <w:pPr>
       <w:pBdr/>
@@ -27760,9 +27757,9 @@
       </w:tcPr>
     </w:tblStylePr>
   </w:style>
-  <w:style w:type="table" w:styleId="817">
+  <w:style w:type="table" w:styleId="823">
     <w:name w:val="List Table 5 Dark"/>
-    <w:basedOn w:val="919"/>
+    <w:basedOn w:val="925"/>
     <w:uiPriority w:val="99"/>
     <w:pPr>
       <w:pBdr/>
@@ -28002,9 +27999,9 @@
       </w:tcPr>
     </w:tblStylePr>
   </w:style>
-  <w:style w:type="table" w:styleId="818">
+  <w:style w:type="table" w:styleId="824">
     <w:name w:val="List Table 5 Dark - Accent 1"/>
-    <w:basedOn w:val="919"/>
+    <w:basedOn w:val="925"/>
     <w:uiPriority w:val="99"/>
     <w:pPr>
       <w:pBdr/>
@@ -28244,9 +28241,9 @@
       </w:tcPr>
     </w:tblStylePr>
   </w:style>
-  <w:style w:type="table" w:styleId="819">
+  <w:style w:type="table" w:styleId="825">
     <w:name w:val="List Table 5 Dark - Accent 2"/>
-    <w:basedOn w:val="919"/>
+    <w:basedOn w:val="925"/>
     <w:uiPriority w:val="99"/>
     <w:pPr>
       <w:pBdr/>
@@ -28486,9 +28483,9 @@
       </w:tcPr>
     </w:tblStylePr>
   </w:style>
-  <w:style w:type="table" w:styleId="820">
+  <w:style w:type="table" w:styleId="826">
     <w:name w:val="List Table 5 Dark - Accent 3"/>
-    <w:basedOn w:val="919"/>
+    <w:basedOn w:val="925"/>
     <w:uiPriority w:val="99"/>
     <w:pPr>
       <w:pBdr/>
@@ -28728,9 +28725,9 @@
       </w:tcPr>
     </w:tblStylePr>
   </w:style>
-  <w:style w:type="table" w:styleId="821">
+  <w:style w:type="table" w:styleId="827">
     <w:name w:val="List Table 5 Dark - Accent 4"/>
-    <w:basedOn w:val="919"/>
+    <w:basedOn w:val="925"/>
     <w:uiPriority w:val="99"/>
     <w:pPr>
       <w:pBdr/>
@@ -28970,9 +28967,9 @@
       </w:tcPr>
     </w:tblStylePr>
   </w:style>
-  <w:style w:type="table" w:styleId="822">
+  <w:style w:type="table" w:styleId="828">
     <w:name w:val="List Table 5 Dark - Accent 5"/>
-    <w:basedOn w:val="919"/>
+    <w:basedOn w:val="925"/>
     <w:uiPriority w:val="99"/>
     <w:pPr>
       <w:pBdr/>
@@ -29212,9 +29209,9 @@
       </w:tcPr>
     </w:tblStylePr>
   </w:style>
-  <w:style w:type="table" w:styleId="823">
+  <w:style w:type="table" w:styleId="829">
     <w:name w:val="List Table 5 Dark - Accent 6"/>
-    <w:basedOn w:val="919"/>
+    <w:basedOn w:val="925"/>
     <w:uiPriority w:val="99"/>
     <w:pPr>
       <w:pBdr/>
@@ -29454,9 +29451,9 @@
       </w:tcPr>
     </w:tblStylePr>
   </w:style>
-  <w:style w:type="table" w:styleId="824">
+  <w:style w:type="table" w:styleId="830">
     <w:name w:val="List Table 6 Colorful"/>
-    <w:basedOn w:val="919"/>
+    <w:basedOn w:val="925"/>
     <w:uiPriority w:val="99"/>
     <w:pPr>
       <w:pBdr/>
@@ -29677,9 +29674,9 @@
       </w:tcPr>
     </w:tblStylePr>
   </w:style>
-  <w:style w:type="table" w:styleId="825">
+  <w:style w:type="table" w:styleId="831">
     <w:name w:val="List Table 6 Colorful - Accent 1"/>
-    <w:basedOn w:val="919"/>
+    <w:basedOn w:val="925"/>
     <w:uiPriority w:val="99"/>
     <w:pPr>
       <w:pBdr/>
@@ -29900,9 +29897,9 @@
       </w:tcPr>
     </w:tblStylePr>
   </w:style>
-  <w:style w:type="table" w:styleId="826">
+  <w:style w:type="table" w:styleId="832">
     <w:name w:val="List Table 6 Colorful - Accent 2"/>
-    <w:basedOn w:val="919"/>
+    <w:basedOn w:val="925"/>
     <w:uiPriority w:val="99"/>
     <w:pPr>
       <w:pBdr/>
@@ -30123,9 +30120,9 @@
       </w:tcPr>
     </w:tblStylePr>
   </w:style>
-  <w:style w:type="table" w:styleId="827">
+  <w:style w:type="table" w:styleId="833">
     <w:name w:val="List Table 6 Colorful - Accent 3"/>
-    <w:basedOn w:val="919"/>
+    <w:basedOn w:val="925"/>
     <w:uiPriority w:val="99"/>
     <w:pPr>
       <w:pBdr/>
@@ -30346,9 +30343,9 @@
       </w:tcPr>
     </w:tblStylePr>
   </w:style>
-  <w:style w:type="table" w:styleId="828">
+  <w:style w:type="table" w:styleId="834">
     <w:name w:val="List Table 6 Colorful - Accent 4"/>
-    <w:basedOn w:val="919"/>
+    <w:basedOn w:val="925"/>
     <w:uiPriority w:val="99"/>
     <w:pPr>
       <w:pBdr/>
@@ -30569,9 +30566,9 @@
       </w:tcPr>
     </w:tblStylePr>
   </w:style>
-  <w:style w:type="table" w:styleId="829">
+  <w:style w:type="table" w:styleId="835">
     <w:name w:val="List Table 6 Colorful - Accent 5"/>
-    <w:basedOn w:val="919"/>
+    <w:basedOn w:val="925"/>
     <w:uiPriority w:val="99"/>
     <w:pPr>
       <w:pBdr/>
@@ -30792,9 +30789,9 @@
       </w:tcPr>
     </w:tblStylePr>
   </w:style>
-  <w:style w:type="table" w:styleId="830">
+  <w:style w:type="table" w:styleId="836">
     <w:name w:val="List Table 6 Colorful - Accent 6"/>
-    <w:basedOn w:val="919"/>
+    <w:basedOn w:val="925"/>
     <w:uiPriority w:val="99"/>
     <w:pPr>
       <w:pBdr/>
@@ -31015,9 +31012,9 @@
       </w:tcPr>
     </w:tblStylePr>
   </w:style>
-  <w:style w:type="table" w:styleId="831">
+  <w:style w:type="table" w:styleId="837">
     <w:name w:val="List Table 7 Colorful"/>
-    <w:basedOn w:val="919"/>
+    <w:basedOn w:val="925"/>
     <w:uiPriority w:val="99"/>
     <w:pPr>
       <w:pBdr/>
@@ -31271,9 +31268,9 @@
       </w:tcPr>
     </w:tblStylePr>
   </w:style>
-  <w:style w:type="table" w:styleId="832">
+  <w:style w:type="table" w:styleId="838">
     <w:name w:val="List Table 7 Colorful - Accent 1"/>
-    <w:basedOn w:val="919"/>
+    <w:basedOn w:val="925"/>
     <w:uiPriority w:val="99"/>
     <w:pPr>
       <w:pBdr/>
@@ -31527,9 +31524,9 @@
       </w:tcPr>
     </w:tblStylePr>
   </w:style>
-  <w:style w:type="table" w:styleId="833">
+  <w:style w:type="table" w:styleId="839">
     <w:name w:val="List Table 7 Colorful - Accent 2"/>
-    <w:basedOn w:val="919"/>
+    <w:basedOn w:val="925"/>
     <w:uiPriority w:val="99"/>
     <w:pPr>
       <w:pBdr/>
@@ -31783,9 +31780,9 @@
       </w:tcPr>
     </w:tblStylePr>
   </w:style>
-  <w:style w:type="table" w:styleId="834">
+  <w:style w:type="table" w:styleId="840">
     <w:name w:val="List Table 7 Colorful - Accent 3"/>
-    <w:basedOn w:val="919"/>
+    <w:basedOn w:val="925"/>
     <w:uiPriority w:val="99"/>
     <w:pPr>
       <w:pBdr/>
@@ -32039,9 +32036,9 @@
       </w:tcPr>
     </w:tblStylePr>
   </w:style>
-  <w:style w:type="table" w:styleId="835">
+  <w:style w:type="table" w:styleId="841">
     <w:name w:val="List Table 7 Colorful - Accent 4"/>
-    <w:basedOn w:val="919"/>
+    <w:basedOn w:val="925"/>
     <w:uiPriority w:val="99"/>
     <w:pPr>
       <w:pBdr/>
@@ -32295,9 +32292,9 @@
       </w:tcPr>
     </w:tblStylePr>
   </w:style>
-  <w:style w:type="table" w:styleId="836">
+  <w:style w:type="table" w:styleId="842">
     <w:name w:val="List Table 7 Colorful - Accent 5"/>
-    <w:basedOn w:val="919"/>
+    <w:basedOn w:val="925"/>
     <w:uiPriority w:val="99"/>
     <w:pPr>
       <w:pBdr/>
@@ -32551,9 +32548,9 @@
       </w:tcPr>
     </w:tblStylePr>
   </w:style>
-  <w:style w:type="table" w:styleId="837">
+  <w:style w:type="table" w:styleId="843">
     <w:name w:val="List Table 7 Colorful - Accent 6"/>
-    <w:basedOn w:val="919"/>
+    <w:basedOn w:val="925"/>
     <w:uiPriority w:val="99"/>
     <w:pPr>
       <w:pBdr/>
@@ -32807,9 +32804,9 @@
       </w:tcPr>
     </w:tblStylePr>
   </w:style>
-  <w:style w:type="table" w:styleId="838">
+  <w:style w:type="table" w:styleId="844">
     <w:name w:val="Lined - Accent"/>
-    <w:basedOn w:val="919"/>
+    <w:basedOn w:val="925"/>
     <w:uiPriority w:val="99"/>
     <w:pPr>
       <w:pBdr/>
@@ -33044,9 +33041,9 @@
       </w:tcPr>
     </w:tblStylePr>
   </w:style>
-  <w:style w:type="table" w:styleId="839">
+  <w:style w:type="table" w:styleId="845">
     <w:name w:val="Lined - Accent 1"/>
-    <w:basedOn w:val="919"/>
+    <w:basedOn w:val="925"/>
     <w:uiPriority w:val="99"/>
     <w:pPr>
       <w:pBdr/>
@@ -33281,9 +33278,9 @@
       </w:tcPr>
     </w:tblStylePr>
   </w:style>
-  <w:style w:type="table" w:styleId="840">
+  <w:style w:type="table" w:styleId="846">
     <w:name w:val="Lined - Accent 2"/>
-    <w:basedOn w:val="919"/>
+    <w:basedOn w:val="925"/>
     <w:uiPriority w:val="99"/>
     <w:pPr>
       <w:pBdr/>
@@ -33518,9 +33515,9 @@
       </w:tcPr>
     </w:tblStylePr>
   </w:style>
-  <w:style w:type="table" w:styleId="841">
+  <w:style w:type="table" w:styleId="847">
     <w:name w:val="Lined - Accent 3"/>
-    <w:basedOn w:val="919"/>
+    <w:basedOn w:val="925"/>
     <w:uiPriority w:val="99"/>
     <w:pPr>
       <w:pBdr/>
@@ -33755,9 +33752,9 @@
       </w:tcPr>
     </w:tblStylePr>
   </w:style>
-  <w:style w:type="table" w:styleId="842">
+  <w:style w:type="table" w:styleId="848">
     <w:name w:val="Lined - Accent 4"/>
-    <w:basedOn w:val="919"/>
+    <w:basedOn w:val="925"/>
     <w:uiPriority w:val="99"/>
     <w:pPr>
       <w:pBdr/>
@@ -33992,9 +33989,9 @@
       </w:tcPr>
     </w:tblStylePr>
   </w:style>
-  <w:style w:type="table" w:styleId="843">
+  <w:style w:type="table" w:styleId="849">
     <w:name w:val="Lined - Accent 5"/>
-    <w:basedOn w:val="919"/>
+    <w:basedOn w:val="925"/>
     <w:uiPriority w:val="99"/>
     <w:pPr>
       <w:pBdr/>
@@ -34229,9 +34226,9 @@
       </w:tcPr>
     </w:tblStylePr>
   </w:style>
-  <w:style w:type="table" w:styleId="844">
+  <w:style w:type="table" w:styleId="850">
     <w:name w:val="Lined - Accent 6"/>
-    <w:basedOn w:val="919"/>
+    <w:basedOn w:val="925"/>
     <w:uiPriority w:val="99"/>
     <w:pPr>
       <w:pBdr/>
@@ -34466,9 +34463,9 @@
       </w:tcPr>
     </w:tblStylePr>
   </w:style>
-  <w:style w:type="table" w:styleId="845">
+  <w:style w:type="table" w:styleId="851">
     <w:name w:val="Bordered &amp; Lined - Accent"/>
-    <w:basedOn w:val="919"/>
+    <w:basedOn w:val="925"/>
     <w:uiPriority w:val="99"/>
     <w:pPr>
       <w:pBdr/>
@@ -34710,9 +34707,9 @@
       </w:tcPr>
     </w:tblStylePr>
   </w:style>
-  <w:style w:type="table" w:styleId="846">
+  <w:style w:type="table" w:styleId="852">
     <w:name w:val="Bordered &amp; Lined - Accent 1"/>
-    <w:basedOn w:val="919"/>
+    <w:basedOn w:val="925"/>
     <w:uiPriority w:val="99"/>
     <w:pPr>
       <w:pBdr/>
@@ -34954,9 +34951,9 @@
       </w:tcPr>
     </w:tblStylePr>
   </w:style>
-  <w:style w:type="table" w:styleId="847">
+  <w:style w:type="table" w:styleId="853">
     <w:name w:val="Bordered &amp; Lined - Accent 2"/>
-    <w:basedOn w:val="919"/>
+    <w:basedOn w:val="925"/>
     <w:uiPriority w:val="99"/>
     <w:pPr>
       <w:pBdr/>
@@ -35198,9 +35195,9 @@
       </w:tcPr>
     </w:tblStylePr>
   </w:style>
-  <w:style w:type="table" w:styleId="848">
+  <w:style w:type="table" w:styleId="854">
     <w:name w:val="Bordered &amp; Lined - Accent 3"/>
-    <w:basedOn w:val="919"/>
+    <w:basedOn w:val="925"/>
     <w:uiPriority w:val="99"/>
     <w:pPr>
       <w:pBdr/>
@@ -35442,9 +35439,9 @@
       </w:tcPr>
     </w:tblStylePr>
   </w:style>
-  <w:style w:type="table" w:styleId="849">
+  <w:style w:type="table" w:styleId="855">
     <w:name w:val="Bordered &amp; Lined - Accent 4"/>
-    <w:basedOn w:val="919"/>
+    <w:basedOn w:val="925"/>
     <w:uiPriority w:val="99"/>
     <w:pPr>
       <w:pBdr/>
@@ -35686,9 +35683,9 @@
       </w:tcPr>
     </w:tblStylePr>
   </w:style>
-  <w:style w:type="table" w:styleId="850">
+  <w:style w:type="table" w:styleId="856">
     <w:name w:val="Bordered &amp; Lined - Accent 5"/>
-    <w:basedOn w:val="919"/>
+    <w:basedOn w:val="925"/>
     <w:uiPriority w:val="99"/>
     <w:pPr>
       <w:pBdr/>
@@ -35930,9 +35927,9 @@
       </w:tcPr>
     </w:tblStylePr>
   </w:style>
-  <w:style w:type="table" w:styleId="851">
+  <w:style w:type="table" w:styleId="857">
     <w:name w:val="Bordered &amp; Lined - Accent 6"/>
-    <w:basedOn w:val="919"/>
+    <w:basedOn w:val="925"/>
     <w:uiPriority w:val="99"/>
     <w:pPr>
       <w:pBdr/>
@@ -36174,9 +36171,9 @@
       </w:tcPr>
     </w:tblStylePr>
   </w:style>
-  <w:style w:type="table" w:styleId="852">
+  <w:style w:type="table" w:styleId="858">
     <w:name w:val="Bordered"/>
-    <w:basedOn w:val="919"/>
+    <w:basedOn w:val="925"/>
     <w:uiPriority w:val="99"/>
     <w:pPr>
       <w:pBdr/>
@@ -36405,9 +36402,9 @@
       </w:tcPr>
     </w:tblStylePr>
   </w:style>
-  <w:style w:type="table" w:styleId="853">
+  <w:style w:type="table" w:styleId="859">
     <w:name w:val="Bordered - Accent 1"/>
-    <w:basedOn w:val="919"/>
+    <w:basedOn w:val="925"/>
     <w:uiPriority w:val="99"/>
     <w:pPr>
       <w:pBdr/>
@@ -36636,9 +36633,9 @@
       </w:tcPr>
     </w:tblStylePr>
   </w:style>
-  <w:style w:type="table" w:styleId="854">
+  <w:style w:type="table" w:styleId="860">
     <w:name w:val="Bordered - Accent 2"/>
-    <w:basedOn w:val="919"/>
+    <w:basedOn w:val="925"/>
     <w:uiPriority w:val="99"/>
     <w:pPr>
       <w:pBdr/>
@@ -36867,9 +36864,9 @@
       </w:tcPr>
     </w:tblStylePr>
   </w:style>
-  <w:style w:type="table" w:styleId="855">
+  <w:style w:type="table" w:styleId="861">
     <w:name w:val="Bordered - Accent 3"/>
-    <w:basedOn w:val="919"/>
+    <w:basedOn w:val="925"/>
     <w:uiPriority w:val="99"/>
     <w:pPr>
       <w:pBdr/>
@@ -37098,9 +37095,9 @@
       </w:tcPr>
     </w:tblStylePr>
   </w:style>
-  <w:style w:type="table" w:styleId="856">
+  <w:style w:type="table" w:styleId="862">
     <w:name w:val="Bordered - Accent 4"/>
-    <w:basedOn w:val="919"/>
+    <w:basedOn w:val="925"/>
     <w:uiPriority w:val="99"/>
     <w:pPr>
       <w:pBdr/>
@@ -37329,9 +37326,9 @@
       </w:tcPr>
     </w:tblStylePr>
   </w:style>
-  <w:style w:type="table" w:styleId="857">
+  <w:style w:type="table" w:styleId="863">
     <w:name w:val="Bordered - Accent 5"/>
-    <w:basedOn w:val="919"/>
+    <w:basedOn w:val="925"/>
     <w:uiPriority w:val="99"/>
     <w:pPr>
       <w:pBdr/>
@@ -37560,9 +37557,9 @@
       </w:tcPr>
     </w:tblStylePr>
   </w:style>
-  <w:style w:type="table" w:styleId="858">
+  <w:style w:type="table" w:styleId="864">
     <w:name w:val="Bordered - Accent 6"/>
-    <w:basedOn w:val="919"/>
+    <w:basedOn w:val="925"/>
     <w:uiPriority w:val="99"/>
     <w:pPr>
       <w:pBdr/>
@@ -37791,11 +37788,11 @@
       </w:tcPr>
     </w:tblStylePr>
   </w:style>
-  <w:style w:type="paragraph" w:styleId="859">
+  <w:style w:type="paragraph" w:styleId="865">
     <w:name w:val="Heading 1"/>
-    <w:basedOn w:val="918"/>
-    <w:next w:val="918"/>
-    <w:link w:val="869"/>
+    <w:basedOn w:val="924"/>
+    <w:next w:val="924"/>
+    <w:link w:val="875"/>
     <w:uiPriority w:val="9"/>
     <w:qFormat/>
     <w:pPr>
@@ -37813,11 +37810,11 @@
       <w:szCs w:val="40"/>
     </w:rPr>
   </w:style>
-  <w:style w:type="paragraph" w:styleId="860">
+  <w:style w:type="paragraph" w:styleId="866">
     <w:name w:val="Heading 2"/>
-    <w:basedOn w:val="918"/>
-    <w:next w:val="918"/>
-    <w:link w:val="870"/>
+    <w:basedOn w:val="924"/>
+    <w:next w:val="924"/>
+    <w:link w:val="876"/>
     <w:uiPriority w:val="9"/>
     <w:unhideWhenUsed/>
     <w:qFormat/>
@@ -37836,11 +37833,11 @@
       <w:szCs w:val="32"/>
     </w:rPr>
   </w:style>
-  <w:style w:type="paragraph" w:styleId="861">
+  <w:style w:type="paragraph" w:styleId="867">
     <w:name w:val="Heading 3"/>
-    <w:basedOn w:val="918"/>
-    <w:next w:val="918"/>
-    <w:link w:val="871"/>
+    <w:basedOn w:val="924"/>
+    <w:next w:val="924"/>
+    <w:link w:val="877"/>
     <w:uiPriority w:val="9"/>
     <w:unhideWhenUsed/>
     <w:qFormat/>
@@ -37859,11 +37856,11 @@
       <w:szCs w:val="28"/>
     </w:rPr>
   </w:style>
-  <w:style w:type="paragraph" w:styleId="862">
+  <w:style w:type="paragraph" w:styleId="868">
     <w:name w:val="Heading 4"/>
-    <w:basedOn w:val="918"/>
-    <w:next w:val="918"/>
-    <w:link w:val="872"/>
+    <w:basedOn w:val="924"/>
+    <w:next w:val="924"/>
+    <w:link w:val="878"/>
     <w:uiPriority w:val="9"/>
     <w:unhideWhenUsed/>
     <w:qFormat/>
@@ -37882,11 +37879,11 @@
       <w:color w:val="0f4761" w:themeColor="accent1" w:themeShade="BF"/>
     </w:rPr>
   </w:style>
-  <w:style w:type="paragraph" w:styleId="863">
+  <w:style w:type="paragraph" w:styleId="869">
     <w:name w:val="Heading 5"/>
-    <w:basedOn w:val="918"/>
-    <w:next w:val="918"/>
-    <w:link w:val="873"/>
+    <w:basedOn w:val="924"/>
+    <w:next w:val="924"/>
+    <w:link w:val="879"/>
     <w:uiPriority w:val="9"/>
     <w:unhideWhenUsed/>
     <w:qFormat/>
@@ -37903,11 +37900,11 @@
       <w:color w:val="0f4761" w:themeColor="accent1" w:themeShade="BF"/>
     </w:rPr>
   </w:style>
-  <w:style w:type="paragraph" w:styleId="864">
+  <w:style w:type="paragraph" w:styleId="870">
     <w:name w:val="Heading 6"/>
-    <w:basedOn w:val="918"/>
-    <w:next w:val="918"/>
-    <w:link w:val="874"/>
+    <w:basedOn w:val="924"/>
+    <w:next w:val="924"/>
+    <w:link w:val="880"/>
     <w:uiPriority w:val="9"/>
     <w:unhideWhenUsed/>
     <w:qFormat/>
@@ -37926,11 +37923,11 @@
       <w:color w:val="595959" w:themeColor="text1" w:themeTint="A6"/>
     </w:rPr>
   </w:style>
-  <w:style w:type="paragraph" w:styleId="865">
+  <w:style w:type="paragraph" w:styleId="871">
     <w:name w:val="Heading 7"/>
-    <w:basedOn w:val="918"/>
-    <w:next w:val="918"/>
-    <w:link w:val="875"/>
+    <w:basedOn w:val="924"/>
+    <w:next w:val="924"/>
+    <w:link w:val="881"/>
     <w:uiPriority w:val="9"/>
     <w:unhideWhenUsed/>
     <w:qFormat/>
@@ -37947,11 +37944,11 @@
       <w:color w:val="595959" w:themeColor="text1" w:themeTint="A6"/>
     </w:rPr>
   </w:style>
-  <w:style w:type="paragraph" w:styleId="866">
+  <w:style w:type="paragraph" w:styleId="872">
     <w:name w:val="Heading 8"/>
-    <w:basedOn w:val="918"/>
-    <w:next w:val="918"/>
-    <w:link w:val="876"/>
+    <w:basedOn w:val="924"/>
+    <w:next w:val="924"/>
+    <w:link w:val="882"/>
     <w:uiPriority w:val="9"/>
     <w:unhideWhenUsed/>
     <w:qFormat/>
@@ -37970,11 +37967,11 @@
       <w:color w:val="272727" w:themeColor="text1" w:themeTint="D8"/>
     </w:rPr>
   </w:style>
-  <w:style w:type="paragraph" w:styleId="867">
+  <w:style w:type="paragraph" w:styleId="873">
     <w:name w:val="Heading 9"/>
-    <w:basedOn w:val="918"/>
-    <w:next w:val="918"/>
-    <w:link w:val="877"/>
+    <w:basedOn w:val="924"/>
+    <w:next w:val="924"/>
+    <w:link w:val="883"/>
     <w:uiPriority w:val="9"/>
     <w:unhideWhenUsed/>
     <w:qFormat/>
@@ -37993,7 +37990,7 @@
       <w:color w:val="272727" w:themeColor="text1" w:themeTint="D8"/>
     </w:rPr>
   </w:style>
-  <w:style w:type="character" w:styleId="868" w:default="1">
+  <w:style w:type="character" w:styleId="874" w:default="1">
     <w:name w:val="Default Paragraph Font"/>
     <w:uiPriority w:val="1"/>
     <w:semiHidden/>
@@ -38004,10 +38001,10 @@
       <w:ind/>
     </w:pPr>
   </w:style>
-  <w:style w:type="character" w:styleId="869">
+  <w:style w:type="character" w:styleId="875">
     <w:name w:val="Heading 1 Char"/>
-    <w:basedOn w:val="868"/>
-    <w:link w:val="859"/>
+    <w:basedOn w:val="874"/>
+    <w:link w:val="865"/>
     <w:uiPriority w:val="9"/>
     <w:pPr>
       <w:pBdr/>
@@ -38021,10 +38018,10 @@
       <w:szCs w:val="40"/>
     </w:rPr>
   </w:style>
-  <w:style w:type="character" w:styleId="870">
+  <w:style w:type="character" w:styleId="876">
     <w:name w:val="Heading 2 Char"/>
-    <w:basedOn w:val="868"/>
-    <w:link w:val="860"/>
+    <w:basedOn w:val="874"/>
+    <w:link w:val="866"/>
     <w:uiPriority w:val="9"/>
     <w:pPr>
       <w:pBdr/>
@@ -38038,10 +38035,10 @@
       <w:szCs w:val="32"/>
     </w:rPr>
   </w:style>
-  <w:style w:type="character" w:styleId="871">
+  <w:style w:type="character" w:styleId="877">
     <w:name w:val="Heading 3 Char"/>
-    <w:basedOn w:val="868"/>
-    <w:link w:val="861"/>
+    <w:basedOn w:val="874"/>
+    <w:link w:val="867"/>
     <w:uiPriority w:val="9"/>
     <w:pPr>
       <w:pBdr/>
@@ -38055,10 +38052,10 @@
       <w:szCs w:val="28"/>
     </w:rPr>
   </w:style>
-  <w:style w:type="character" w:styleId="872">
+  <w:style w:type="character" w:styleId="878">
     <w:name w:val="Heading 4 Char"/>
-    <w:basedOn w:val="868"/>
-    <w:link w:val="862"/>
+    <w:basedOn w:val="874"/>
+    <w:link w:val="868"/>
     <w:uiPriority w:val="9"/>
     <w:pPr>
       <w:pBdr/>
@@ -38072,10 +38069,10 @@
       <w:color w:val="0f4761" w:themeColor="accent1" w:themeShade="BF"/>
     </w:rPr>
   </w:style>
-  <w:style w:type="character" w:styleId="873">
+  <w:style w:type="character" w:styleId="879">
     <w:name w:val="Heading 5 Char"/>
-    <w:basedOn w:val="868"/>
-    <w:link w:val="863"/>
+    <w:basedOn w:val="874"/>
+    <w:link w:val="869"/>
     <w:uiPriority w:val="9"/>
     <w:pPr>
       <w:pBdr/>
@@ -38087,10 +38084,10 @@
       <w:color w:val="0f4761" w:themeColor="accent1" w:themeShade="BF"/>
     </w:rPr>
   </w:style>
-  <w:style w:type="character" w:styleId="874">
+  <w:style w:type="character" w:styleId="880">
     <w:name w:val="Heading 6 Char"/>
-    <w:basedOn w:val="868"/>
-    <w:link w:val="864"/>
+    <w:basedOn w:val="874"/>
+    <w:link w:val="870"/>
     <w:uiPriority w:val="9"/>
     <w:pPr>
       <w:pBdr/>
@@ -38104,10 +38101,10 @@
       <w:color w:val="595959" w:themeColor="text1" w:themeTint="A6"/>
     </w:rPr>
   </w:style>
-  <w:style w:type="character" w:styleId="875">
+  <w:style w:type="character" w:styleId="881">
     <w:name w:val="Heading 7 Char"/>
-    <w:basedOn w:val="868"/>
-    <w:link w:val="865"/>
+    <w:basedOn w:val="874"/>
+    <w:link w:val="871"/>
     <w:uiPriority w:val="9"/>
     <w:pPr>
       <w:pBdr/>
@@ -38119,10 +38116,10 @@
       <w:color w:val="595959" w:themeColor="text1" w:themeTint="A6"/>
     </w:rPr>
   </w:style>
-  <w:style w:type="character" w:styleId="876">
+  <w:style w:type="character" w:styleId="882">
     <w:name w:val="Heading 8 Char"/>
-    <w:basedOn w:val="868"/>
-    <w:link w:val="866"/>
+    <w:basedOn w:val="874"/>
+    <w:link w:val="872"/>
     <w:uiPriority w:val="9"/>
     <w:pPr>
       <w:pBdr/>
@@ -38136,10 +38133,10 @@
       <w:color w:val="272727" w:themeColor="text1" w:themeTint="D8"/>
     </w:rPr>
   </w:style>
-  <w:style w:type="character" w:styleId="877">
+  <w:style w:type="character" w:styleId="883">
     <w:name w:val="Heading 9 Char"/>
-    <w:basedOn w:val="868"/>
-    <w:link w:val="867"/>
+    <w:basedOn w:val="874"/>
+    <w:link w:val="873"/>
     <w:uiPriority w:val="9"/>
     <w:pPr>
       <w:pBdr/>
@@ -38153,11 +38150,11 @@
       <w:color w:val="272727" w:themeColor="text1" w:themeTint="D8"/>
     </w:rPr>
   </w:style>
-  <w:style w:type="paragraph" w:styleId="878">
+  <w:style w:type="paragraph" w:styleId="884">
     <w:name w:val="Title"/>
-    <w:basedOn w:val="918"/>
-    <w:next w:val="918"/>
-    <w:link w:val="879"/>
+    <w:basedOn w:val="924"/>
+    <w:next w:val="924"/>
+    <w:link w:val="885"/>
     <w:uiPriority w:val="10"/>
     <w:qFormat/>
     <w:pPr>
@@ -38173,10 +38170,10 @@
       <w:szCs w:val="56"/>
     </w:rPr>
   </w:style>
-  <w:style w:type="character" w:styleId="879">
+  <w:style w:type="character" w:styleId="885">
     <w:name w:val="Title Char"/>
-    <w:basedOn w:val="868"/>
-    <w:link w:val="878"/>
+    <w:basedOn w:val="874"/>
+    <w:link w:val="884"/>
     <w:uiPriority w:val="10"/>
     <w:pPr>
       <w:pBdr/>
@@ -38190,11 +38187,11 @@
       <w:szCs w:val="56"/>
     </w:rPr>
   </w:style>
-  <w:style w:type="paragraph" w:styleId="880">
+  <w:style w:type="paragraph" w:styleId="886">
     <w:name w:val="Subtitle"/>
-    <w:basedOn w:val="918"/>
-    <w:next w:val="918"/>
-    <w:link w:val="881"/>
+    <w:basedOn w:val="924"/>
+    <w:next w:val="924"/>
+    <w:link w:val="887"/>
     <w:uiPriority w:val="11"/>
     <w:qFormat/>
     <w:pPr>
@@ -38212,10 +38209,10 @@
       <w:szCs w:val="28"/>
     </w:rPr>
   </w:style>
-  <w:style w:type="character" w:styleId="881">
+  <w:style w:type="character" w:styleId="887">
     <w:name w:val="Subtitle Char"/>
-    <w:basedOn w:val="868"/>
-    <w:link w:val="880"/>
+    <w:basedOn w:val="874"/>
+    <w:link w:val="886"/>
     <w:uiPriority w:val="11"/>
     <w:pPr>
       <w:pBdr/>
@@ -38229,11 +38226,11 @@
       <w:szCs w:val="28"/>
     </w:rPr>
   </w:style>
-  <w:style w:type="paragraph" w:styleId="882">
+  <w:style w:type="paragraph" w:styleId="888">
     <w:name w:val="Quote"/>
-    <w:basedOn w:val="918"/>
-    <w:next w:val="918"/>
-    <w:link w:val="883"/>
+    <w:basedOn w:val="924"/>
+    <w:next w:val="924"/>
+    <w:link w:val="889"/>
     <w:uiPriority w:val="29"/>
     <w:qFormat/>
     <w:pPr>
@@ -38248,10 +38245,10 @@
       <w:color w:val="404040" w:themeColor="text1" w:themeTint="BF"/>
     </w:rPr>
   </w:style>
-  <w:style w:type="character" w:styleId="883">
+  <w:style w:type="character" w:styleId="889">
     <w:name w:val="Quote Char"/>
-    <w:basedOn w:val="868"/>
-    <w:link w:val="882"/>
+    <w:basedOn w:val="874"/>
+    <w:link w:val="888"/>
     <w:uiPriority w:val="29"/>
     <w:pPr>
       <w:pBdr/>
@@ -38264,9 +38261,9 @@
       <w:color w:val="404040" w:themeColor="text1" w:themeTint="BF"/>
     </w:rPr>
   </w:style>
-  <w:style w:type="character" w:styleId="884">
+  <w:style w:type="character" w:styleId="890">
     <w:name w:val="Intense Emphasis"/>
-    <w:basedOn w:val="868"/>
+    <w:basedOn w:val="874"/>
     <w:uiPriority w:val="21"/>
     <w:qFormat/>
     <w:pPr>
@@ -38280,11 +38277,11 @@
       <w:color w:val="0f4761" w:themeColor="accent1" w:themeShade="BF"/>
     </w:rPr>
   </w:style>
-  <w:style w:type="paragraph" w:styleId="885">
+  <w:style w:type="paragraph" w:styleId="891">
     <w:name w:val="Intense Quote"/>
-    <w:basedOn w:val="918"/>
-    <w:next w:val="918"/>
-    <w:link w:val="886"/>
+    <w:basedOn w:val="924"/>
+    <w:next w:val="924"/>
+    <w:link w:val="892"/>
     <w:uiPriority w:val="30"/>
     <w:qFormat/>
     <w:pPr>
@@ -38302,10 +38299,10 @@
       <w:color w:val="0f4761" w:themeColor="accent1" w:themeShade="BF"/>
     </w:rPr>
   </w:style>
-  <w:style w:type="character" w:styleId="886">
+  <w:style w:type="character" w:styleId="892">
     <w:name w:val="Intense Quote Char"/>
-    <w:basedOn w:val="868"/>
-    <w:link w:val="885"/>
+    <w:basedOn w:val="874"/>
+    <w:link w:val="891"/>
     <w:uiPriority w:val="30"/>
     <w:pPr>
       <w:pBdr/>
@@ -38318,9 +38315,9 @@
       <w:color w:val="0f4761" w:themeColor="accent1" w:themeShade="BF"/>
     </w:rPr>
   </w:style>
-  <w:style w:type="character" w:styleId="887">
+  <w:style w:type="character" w:styleId="893">
     <w:name w:val="Intense Reference"/>
-    <w:basedOn w:val="868"/>
+    <w:basedOn w:val="874"/>
     <w:uiPriority w:val="32"/>
     <w:qFormat/>
     <w:pPr>
@@ -38336,9 +38333,9 @@
       <w:spacing w:val="5"/>
     </w:rPr>
   </w:style>
-  <w:style w:type="character" w:styleId="888">
+  <w:style w:type="character" w:styleId="894">
     <w:name w:val="Subtle Emphasis"/>
-    <w:basedOn w:val="868"/>
+    <w:basedOn w:val="874"/>
     <w:uiPriority w:val="19"/>
     <w:qFormat/>
     <w:pPr>
@@ -38352,9 +38349,9 @@
       <w:color w:val="404040" w:themeColor="text1" w:themeTint="BF"/>
     </w:rPr>
   </w:style>
-  <w:style w:type="character" w:styleId="889">
+  <w:style w:type="character" w:styleId="895">
     <w:name w:val="Emphasis"/>
-    <w:basedOn w:val="868"/>
+    <w:basedOn w:val="874"/>
     <w:uiPriority w:val="20"/>
     <w:qFormat/>
     <w:pPr>
@@ -38367,9 +38364,9 @@
       <w:iCs/>
     </w:rPr>
   </w:style>
-  <w:style w:type="character" w:styleId="890">
+  <w:style w:type="character" w:styleId="896">
     <w:name w:val="Strong"/>
-    <w:basedOn w:val="868"/>
+    <w:basedOn w:val="874"/>
     <w:uiPriority w:val="22"/>
     <w:qFormat/>
     <w:pPr>
@@ -38382,9 +38379,9 @@
       <w:bCs/>
     </w:rPr>
   </w:style>
-  <w:style w:type="character" w:styleId="891">
+  <w:style w:type="character" w:styleId="897">
     <w:name w:val="Subtle Reference"/>
-    <w:basedOn w:val="868"/>
+    <w:basedOn w:val="874"/>
     <w:uiPriority w:val="31"/>
     <w:qFormat/>
     <w:pPr>
@@ -38397,9 +38394,9 @@
       <w:color w:val="5a5a5a" w:themeColor="text1" w:themeTint="A5"/>
     </w:rPr>
   </w:style>
-  <w:style w:type="character" w:styleId="892">
+  <w:style w:type="character" w:styleId="898">
     <w:name w:val="Book Title"/>
-    <w:basedOn w:val="868"/>
+    <w:basedOn w:val="874"/>
     <w:uiPriority w:val="33"/>
     <w:qFormat/>
     <w:pPr>
@@ -38415,10 +38412,10 @@
       <w:spacing w:val="5"/>
     </w:rPr>
   </w:style>
-  <w:style w:type="paragraph" w:styleId="893">
+  <w:style w:type="paragraph" w:styleId="899">
     <w:name w:val="Header"/>
-    <w:basedOn w:val="918"/>
-    <w:link w:val="894"/>
+    <w:basedOn w:val="924"/>
+    <w:link w:val="900"/>
     <w:uiPriority w:val="99"/>
     <w:unhideWhenUsed/>
     <w:pPr>
@@ -38431,10 +38428,10 @@
       <w:ind/>
     </w:pPr>
   </w:style>
-  <w:style w:type="character" w:styleId="894">
+  <w:style w:type="character" w:styleId="900">
     <w:name w:val="Header Char"/>
-    <w:basedOn w:val="868"/>
-    <w:link w:val="893"/>
+    <w:basedOn w:val="874"/>
+    <w:link w:val="899"/>
     <w:uiPriority w:val="99"/>
     <w:pPr>
       <w:pBdr/>
@@ -38442,10 +38439,10 @@
       <w:ind/>
     </w:pPr>
   </w:style>
-  <w:style w:type="paragraph" w:styleId="895">
+  <w:style w:type="paragraph" w:styleId="901">
     <w:name w:val="Footer"/>
-    <w:basedOn w:val="918"/>
-    <w:link w:val="896"/>
+    <w:basedOn w:val="924"/>
+    <w:link w:val="902"/>
     <w:uiPriority w:val="99"/>
     <w:unhideWhenUsed/>
     <w:pPr>
@@ -38458,10 +38455,10 @@
       <w:ind/>
     </w:pPr>
   </w:style>
-  <w:style w:type="character" w:styleId="896">
+  <w:style w:type="character" w:styleId="902">
     <w:name w:val="Footer Char"/>
-    <w:basedOn w:val="868"/>
-    <w:link w:val="895"/>
+    <w:basedOn w:val="874"/>
+    <w:link w:val="901"/>
     <w:uiPriority w:val="99"/>
     <w:pPr>
       <w:pBdr/>
@@ -38469,10 +38466,10 @@
       <w:ind/>
     </w:pPr>
   </w:style>
-  <w:style w:type="paragraph" w:styleId="897">
+  <w:style w:type="paragraph" w:styleId="903">
     <w:name w:val="Caption"/>
-    <w:basedOn w:val="918"/>
-    <w:next w:val="918"/>
+    <w:basedOn w:val="924"/>
+    <w:next w:val="924"/>
     <w:uiPriority w:val="35"/>
     <w:unhideWhenUsed/>
     <w:qFormat/>
@@ -38489,10 +38486,10 @@
       <w:szCs w:val="18"/>
     </w:rPr>
   </w:style>
-  <w:style w:type="paragraph" w:styleId="898">
+  <w:style w:type="paragraph" w:styleId="904">
     <w:name w:val="footnote text"/>
-    <w:basedOn w:val="918"/>
-    <w:link w:val="899"/>
+    <w:basedOn w:val="924"/>
+    <w:link w:val="905"/>
     <w:uiPriority w:val="99"/>
     <w:semiHidden/>
     <w:unhideWhenUsed/>
@@ -38506,10 +38503,10 @@
       <w:szCs w:val="20"/>
     </w:rPr>
   </w:style>
-  <w:style w:type="character" w:styleId="899">
+  <w:style w:type="character" w:styleId="905">
     <w:name w:val="Footnote Text Char"/>
-    <w:basedOn w:val="868"/>
-    <w:link w:val="898"/>
+    <w:basedOn w:val="874"/>
+    <w:link w:val="904"/>
     <w:uiPriority w:val="99"/>
     <w:semiHidden/>
     <w:pPr>
@@ -38522,9 +38519,9 @@
       <w:szCs w:val="20"/>
     </w:rPr>
   </w:style>
-  <w:style w:type="character" w:styleId="900">
+  <w:style w:type="character" w:styleId="906">
     <w:name w:val="footnote reference"/>
-    <w:basedOn w:val="868"/>
+    <w:basedOn w:val="874"/>
     <w:uiPriority w:val="99"/>
     <w:semiHidden/>
     <w:unhideWhenUsed/>
@@ -38537,10 +38534,10 @@
       <w:vertAlign w:val="superscript"/>
     </w:rPr>
   </w:style>
-  <w:style w:type="paragraph" w:styleId="901">
+  <w:style w:type="paragraph" w:styleId="907">
     <w:name w:val="endnote text"/>
-    <w:basedOn w:val="918"/>
-    <w:link w:val="902"/>
+    <w:basedOn w:val="924"/>
+    <w:link w:val="908"/>
     <w:uiPriority w:val="99"/>
     <w:semiHidden/>
     <w:unhideWhenUsed/>
@@ -38554,10 +38551,10 @@
       <w:szCs w:val="20"/>
     </w:rPr>
   </w:style>
-  <w:style w:type="character" w:styleId="902">
+  <w:style w:type="character" w:styleId="908">
     <w:name w:val="Endnote Text Char"/>
-    <w:basedOn w:val="868"/>
-    <w:link w:val="901"/>
+    <w:basedOn w:val="874"/>
+    <w:link w:val="907"/>
     <w:uiPriority w:val="99"/>
     <w:semiHidden/>
     <w:pPr>
@@ -38570,9 +38567,9 @@
       <w:szCs w:val="20"/>
     </w:rPr>
   </w:style>
-  <w:style w:type="character" w:styleId="903">
+  <w:style w:type="character" w:styleId="909">
     <w:name w:val="endnote reference"/>
-    <w:basedOn w:val="868"/>
+    <w:basedOn w:val="874"/>
     <w:uiPriority w:val="99"/>
     <w:semiHidden/>
     <w:unhideWhenUsed/>
@@ -38585,9 +38582,9 @@
       <w:vertAlign w:val="superscript"/>
     </w:rPr>
   </w:style>
-  <w:style w:type="character" w:styleId="904">
+  <w:style w:type="character" w:styleId="910">
     <w:name w:val="Hyperlink"/>
-    <w:basedOn w:val="868"/>
+    <w:basedOn w:val="874"/>
     <w:uiPriority w:val="99"/>
     <w:unhideWhenUsed/>
     <w:pPr>
@@ -38600,9 +38597,9 @@
       <w:u w:val="single"/>
     </w:rPr>
   </w:style>
-  <w:style w:type="character" w:styleId="905">
+  <w:style w:type="character" w:styleId="911">
     <w:name w:val="FollowedHyperlink"/>
-    <w:basedOn w:val="868"/>
+    <w:basedOn w:val="874"/>
     <w:uiPriority w:val="99"/>
     <w:semiHidden/>
     <w:unhideWhenUsed/>
@@ -38616,10 +38613,10 @@
       <w:u w:val="single"/>
     </w:rPr>
   </w:style>
-  <w:style w:type="paragraph" w:styleId="906">
+  <w:style w:type="paragraph" w:styleId="912">
     <w:name w:val="toc 1"/>
-    <w:basedOn w:val="918"/>
-    <w:next w:val="918"/>
+    <w:basedOn w:val="924"/>
+    <w:next w:val="924"/>
     <w:uiPriority w:val="39"/>
     <w:unhideWhenUsed/>
     <w:pPr>
@@ -38628,10 +38625,10 @@
       <w:ind/>
     </w:pPr>
   </w:style>
-  <w:style w:type="paragraph" w:styleId="907">
+  <w:style w:type="paragraph" w:styleId="913">
     <w:name w:val="toc 2"/>
-    <w:basedOn w:val="918"/>
-    <w:next w:val="918"/>
+    <w:basedOn w:val="924"/>
+    <w:next w:val="924"/>
     <w:uiPriority w:val="39"/>
     <w:unhideWhenUsed/>
     <w:pPr>
@@ -38640,10 +38637,10 @@
       <w:ind w:left="220"/>
     </w:pPr>
   </w:style>
-  <w:style w:type="paragraph" w:styleId="908">
+  <w:style w:type="paragraph" w:styleId="914">
     <w:name w:val="toc 3"/>
-    <w:basedOn w:val="918"/>
-    <w:next w:val="918"/>
+    <w:basedOn w:val="924"/>
+    <w:next w:val="924"/>
     <w:uiPriority w:val="39"/>
     <w:unhideWhenUsed/>
     <w:pPr>
@@ -38652,10 +38649,10 @@
       <w:ind w:left="440"/>
     </w:pPr>
   </w:style>
-  <w:style w:type="paragraph" w:styleId="909">
+  <w:style w:type="paragraph" w:styleId="915">
     <w:name w:val="toc 4"/>
-    <w:basedOn w:val="918"/>
-    <w:next w:val="918"/>
+    <w:basedOn w:val="924"/>
+    <w:next w:val="924"/>
     <w:uiPriority w:val="39"/>
     <w:unhideWhenUsed/>
     <w:pPr>
@@ -38664,10 +38661,10 @@
       <w:ind w:left="660"/>
     </w:pPr>
   </w:style>
-  <w:style w:type="paragraph" w:styleId="910">
+  <w:style w:type="paragraph" w:styleId="916">
     <w:name w:val="toc 5"/>
-    <w:basedOn w:val="918"/>
-    <w:next w:val="918"/>
+    <w:basedOn w:val="924"/>
+    <w:next w:val="924"/>
     <w:uiPriority w:val="39"/>
     <w:unhideWhenUsed/>
     <w:pPr>
@@ -38676,10 +38673,10 @@
       <w:ind w:left="880"/>
     </w:pPr>
   </w:style>
-  <w:style w:type="paragraph" w:styleId="911">
+  <w:style w:type="paragraph" w:styleId="917">
     <w:name w:val="toc 6"/>
-    <w:basedOn w:val="918"/>
-    <w:next w:val="918"/>
+    <w:basedOn w:val="924"/>
+    <w:next w:val="924"/>
     <w:uiPriority w:val="39"/>
     <w:unhideWhenUsed/>
     <w:pPr>
@@ -38688,10 +38685,10 @@
       <w:ind w:left="1100"/>
     </w:pPr>
   </w:style>
-  <w:style w:type="paragraph" w:styleId="912">
+  <w:style w:type="paragraph" w:styleId="918">
     <w:name w:val="toc 7"/>
-    <w:basedOn w:val="918"/>
-    <w:next w:val="918"/>
+    <w:basedOn w:val="924"/>
+    <w:next w:val="924"/>
     <w:uiPriority w:val="39"/>
     <w:unhideWhenUsed/>
     <w:pPr>
@@ -38700,10 +38697,10 @@
       <w:ind w:left="1320"/>
     </w:pPr>
   </w:style>
-  <w:style w:type="paragraph" w:styleId="913">
+  <w:style w:type="paragraph" w:styleId="919">
     <w:name w:val="toc 8"/>
-    <w:basedOn w:val="918"/>
-    <w:next w:val="918"/>
+    <w:basedOn w:val="924"/>
+    <w:next w:val="924"/>
     <w:uiPriority w:val="39"/>
     <w:unhideWhenUsed/>
     <w:pPr>
@@ -38712,10 +38709,10 @@
       <w:ind w:left="1540"/>
     </w:pPr>
   </w:style>
-  <w:style w:type="paragraph" w:styleId="914">
+  <w:style w:type="paragraph" w:styleId="920">
     <w:name w:val="toc 9"/>
-    <w:basedOn w:val="918"/>
-    <w:next w:val="918"/>
+    <w:basedOn w:val="924"/>
+    <w:next w:val="924"/>
     <w:uiPriority w:val="39"/>
     <w:unhideWhenUsed/>
     <w:pPr>
@@ -38724,9 +38721,9 @@
       <w:ind w:left="1760"/>
     </w:pPr>
   </w:style>
-  <w:style w:type="character" w:styleId="915">
+  <w:style w:type="character" w:styleId="921">
     <w:name w:val="Placeholder Text"/>
-    <w:basedOn w:val="868"/>
+    <w:basedOn w:val="874"/>
     <w:uiPriority w:val="99"/>
     <w:semiHidden/>
     <w:pPr>
@@ -38738,7 +38735,7 @@
       <w:color w:val="666666"/>
     </w:rPr>
   </w:style>
-  <w:style w:type="paragraph" w:styleId="916">
+  <w:style w:type="paragraph" w:styleId="922">
     <w:name w:val="TOC Heading"/>
     <w:uiPriority w:val="39"/>
     <w:unhideWhenUsed/>
@@ -38748,10 +38745,10 @@
       <w:ind/>
     </w:pPr>
   </w:style>
-  <w:style w:type="paragraph" w:styleId="917">
+  <w:style w:type="paragraph" w:styleId="923">
     <w:name w:val="table of figures"/>
-    <w:basedOn w:val="918"/>
-    <w:next w:val="918"/>
+    <w:basedOn w:val="924"/>
+    <w:next w:val="924"/>
     <w:uiPriority w:val="99"/>
     <w:unhideWhenUsed/>
     <w:pPr>
@@ -38760,7 +38757,7 @@
       <w:ind/>
     </w:pPr>
   </w:style>
-  <w:style w:type="paragraph" w:styleId="918" w:default="1">
+  <w:style w:type="paragraph" w:styleId="924" w:default="1">
     <w:name w:val="Normal"/>
     <w:qFormat/>
     <w:pPr>
@@ -38769,7 +38766,7 @@
       <w:ind/>
     </w:pPr>
   </w:style>
-  <w:style w:type="table" w:styleId="919" w:default="1">
+  <w:style w:type="table" w:styleId="925" w:default="1">
     <w:name w:val="Normal Table"/>
     <w:uiPriority w:val="99"/>
     <w:semiHidden/>
@@ -38962,7 +38959,7 @@
       </w:tcPr>
     </w:tblStylePr>
   </w:style>
-  <w:style w:type="numbering" w:styleId="920" w:default="1">
+  <w:style w:type="numbering" w:styleId="926" w:default="1">
     <w:name w:val="No List"/>
     <w:uiPriority w:val="99"/>
     <w:semiHidden/>
@@ -38973,9 +38970,9 @@
       <w:ind/>
     </w:pPr>
   </w:style>
-  <w:style w:type="paragraph" w:styleId="921">
+  <w:style w:type="paragraph" w:styleId="927">
     <w:name w:val="No Spacing"/>
-    <w:basedOn w:val="918"/>
+    <w:basedOn w:val="924"/>
     <w:uiPriority w:val="1"/>
     <w:qFormat/>
     <w:pPr>
@@ -38984,9 +38981,9 @@
       <w:ind/>
     </w:pPr>
   </w:style>
-  <w:style w:type="paragraph" w:styleId="922">
+  <w:style w:type="paragraph" w:styleId="928">
     <w:name w:val="List Paragraph"/>
-    <w:basedOn w:val="918"/>
+    <w:basedOn w:val="924"/>
     <w:uiPriority w:val="34"/>
     <w:qFormat/>
     <w:pPr>

</xml_diff>

<commit_message>
Updated: all paper retrieval
</commit_message>
<xml_diff>
--- a/extra_materials/thesis /notes.docx
+++ b/extra_materials/thesis /notes.docx
@@ -116,7 +116,7 @@
     </w:p>
     <w:p>
       <w:pPr>
-        <w:pStyle w:val="928"/>
+        <w:pStyle w:val="932"/>
         <w:numPr>
           <w:ilvl w:val="0"/>
           <w:numId w:val="5"/>
@@ -161,7 +161,7 @@
     </w:p>
     <w:p>
       <w:pPr>
-        <w:pStyle w:val="928"/>
+        <w:pStyle w:val="932"/>
         <w:numPr>
           <w:ilvl w:val="0"/>
           <w:numId w:val="5"/>
@@ -197,7 +197,7 @@
     </w:p>
     <w:p>
       <w:pPr>
-        <w:pStyle w:val="928"/>
+        <w:pStyle w:val="932"/>
         <w:numPr>
           <w:ilvl w:val="0"/>
           <w:numId w:val="5"/>
@@ -271,7 +271,7 @@
     </w:p>
     <w:p>
       <w:pPr>
-        <w:pStyle w:val="928"/>
+        <w:pStyle w:val="932"/>
         <w:numPr>
           <w:ilvl w:val="0"/>
           <w:numId w:val="11"/>
@@ -302,7 +302,7 @@
     </w:p>
     <w:p>
       <w:pPr>
-        <w:pStyle w:val="928"/>
+        <w:pStyle w:val="932"/>
         <w:numPr>
           <w:ilvl w:val="0"/>
           <w:numId w:val="11"/>
@@ -324,7 +324,7 @@
     </w:p>
     <w:p>
       <w:pPr>
-        <w:pStyle w:val="928"/>
+        <w:pStyle w:val="932"/>
         <w:numPr>
           <w:ilvl w:val="0"/>
           <w:numId w:val="11"/>
@@ -385,7 +385,7 @@
     </w:p>
     <w:p>
       <w:pPr>
-        <w:pStyle w:val="928"/>
+        <w:pStyle w:val="932"/>
         <w:numPr>
           <w:ilvl w:val="0"/>
           <w:numId w:val="3"/>
@@ -418,7 +418,7 @@
     </w:p>
     <w:p>
       <w:pPr>
-        <w:pStyle w:val="928"/>
+        <w:pStyle w:val="932"/>
         <w:numPr>
           <w:ilvl w:val="0"/>
           <w:numId w:val="2"/>
@@ -484,7 +484,7 @@
     </w:p>
     <w:p>
       <w:pPr>
-        <w:pStyle w:val="928"/>
+        <w:pStyle w:val="932"/>
         <w:numPr>
           <w:ilvl w:val="0"/>
           <w:numId w:val="2"/>
@@ -532,7 +532,7 @@
     </w:p>
     <w:p>
       <w:pPr>
-        <w:pStyle w:val="928"/>
+        <w:pStyle w:val="932"/>
         <w:numPr>
           <w:ilvl w:val="0"/>
           <w:numId w:val="2"/>
@@ -563,7 +563,7 @@
     </w:p>
     <w:p>
       <w:pPr>
-        <w:pStyle w:val="928"/>
+        <w:pStyle w:val="932"/>
         <w:numPr>
           <w:ilvl w:val="1"/>
           <w:numId w:val="2"/>
@@ -594,7 +594,7 @@
     </w:p>
     <w:p>
       <w:pPr>
-        <w:pStyle w:val="928"/>
+        <w:pStyle w:val="932"/>
         <w:numPr>
           <w:ilvl w:val="0"/>
           <w:numId w:val="2"/>
@@ -677,7 +677,7 @@
     </w:p>
     <w:p>
       <w:pPr>
-        <w:pStyle w:val="928"/>
+        <w:pStyle w:val="932"/>
         <w:numPr>
           <w:ilvl w:val="0"/>
           <w:numId w:val="2"/>
@@ -769,7 +769,7 @@
     </w:p>
     <w:p>
       <w:pPr>
-        <w:pStyle w:val="928"/>
+        <w:pStyle w:val="932"/>
         <w:numPr>
           <w:ilvl w:val="0"/>
           <w:numId w:val="2"/>
@@ -828,28 +828,10 @@
           <w:highlight w:val="none"/>
         </w:rPr>
       </w:r>
-      <w:r>
-        <w:rPr>
-          <w:highlight w:val="none"/>
-        </w:rPr>
-      </w:r>
-      <w:r>
-        <w:rPr>
-          <w:highlight w:val="none"/>
-        </w:rPr>
-      </w:r>
-      <w:r>
-        <w:rPr>
-          <w:b/>
-          <w:bCs/>
-          <w:i w:val="0"/>
-          <w:highlight w:val="none"/>
-        </w:rPr>
-      </w:r>
     </w:p>
     <w:p>
       <w:pPr>
-        <w:pStyle w:val="928"/>
+        <w:pStyle w:val="932"/>
         <w:numPr>
           <w:ilvl w:val="0"/>
           <w:numId w:val="2"/>
@@ -917,7 +899,7 @@
     </w:p>
     <w:p>
       <w:pPr>
-        <w:pStyle w:val="928"/>
+        <w:pStyle w:val="932"/>
         <w:numPr>
           <w:ilvl w:val="0"/>
           <w:numId w:val="2"/>
@@ -1034,7 +1016,7 @@
     </w:p>
     <w:p>
       <w:pPr>
-        <w:pStyle w:val="928"/>
+        <w:pStyle w:val="932"/>
         <w:numPr>
           <w:ilvl w:val="0"/>
           <w:numId w:val="2"/>
@@ -1065,10 +1047,15 @@
           <w:highlight w:val="none"/>
         </w:rPr>
       </w:r>
+      <w:r>
+        <w:rPr>
+          <w:highlight w:val="none"/>
+        </w:rPr>
+      </w:r>
     </w:p>
     <w:p>
       <w:pPr>
-        <w:pStyle w:val="928"/>
+        <w:pStyle w:val="932"/>
         <w:numPr>
           <w:ilvl w:val="1"/>
           <w:numId w:val="2"/>
@@ -1100,19 +1087,19 @@
         <w:rPr>
           <w:b/>
           <w:bCs/>
-          <w:highlight w:val="none"/>
         </w:rPr>
       </w:r>
       <w:r>
         <w:rPr>
           <w:b/>
           <w:bCs/>
+          <w:highlight w:val="none"/>
         </w:rPr>
       </w:r>
     </w:p>
     <w:p>
       <w:pPr>
-        <w:pStyle w:val="928"/>
+        <w:pStyle w:val="932"/>
         <w:numPr>
           <w:ilvl w:val="2"/>
           <w:numId w:val="7"/>
@@ -1134,7 +1121,6 @@
         </w:rPr>
         <w:t xml:space="preserve">The input document (or query) has non-alphanumeric characters stripped out (remove_non_alphanumeric)</w:t>
       </w:r>
-      <w:r/>
       <w:r>
         <w:rPr>
           <w:rFonts w:ascii="Times New Roman" w:hAnsi="Times New Roman" w:eastAsia="Times New Roman" w:cs="Times New Roman"/>
@@ -1145,7 +1131,7 @@
     </w:p>
     <w:p>
       <w:pPr>
-        <w:pStyle w:val="928"/>
+        <w:pStyle w:val="932"/>
         <w:numPr>
           <w:ilvl w:val="1"/>
           <w:numId w:val="7"/>
@@ -1175,13 +1161,6 @@
       <w:r>
         <w:rPr>
           <w:rFonts w:ascii="Times New Roman" w:hAnsi="Times New Roman" w:eastAsia="Times New Roman" w:cs="Times New Roman"/>
-          <w:sz w:val="24"/>
-          <w:highlight w:val="none"/>
-        </w:rPr>
-      </w:r>
-      <w:r>
-        <w:rPr>
-          <w:rFonts w:ascii="Times New Roman" w:hAnsi="Times New Roman" w:eastAsia="Times New Roman" w:cs="Times New Roman"/>
           <w:b/>
           <w:color w:val="000000"/>
           <w:sz w:val="24"/>
@@ -1220,11 +1199,18 @@
           <w:highlight w:val="none"/>
         </w:rPr>
       </w:r>
-      <w:r/>
+      <w:r>
+        <w:rPr>
+          <w:rFonts w:ascii="Times New Roman" w:hAnsi="Times New Roman" w:eastAsia="Times New Roman" w:cs="Times New Roman"/>
+          <w:sz w:val="24"/>
+          <w:szCs w:val="24"/>
+          <w:highlight w:val="none"/>
+        </w:rPr>
+      </w:r>
     </w:p>
     <w:p>
       <w:pPr>
-        <w:pStyle w:val="928"/>
+        <w:pStyle w:val="932"/>
         <w:numPr>
           <w:ilvl w:val="1"/>
           <w:numId w:val="7"/>
@@ -1269,11 +1255,18 @@
         </w:rPr>
         <w:t xml:space="preserve"> For each token:</w:t>
       </w:r>
-      <w:r/>
+      <w:r>
+        <w:rPr>
+          <w:rFonts w:ascii="Times New Roman" w:hAnsi="Times New Roman" w:eastAsia="Times New Roman" w:cs="Times New Roman"/>
+          <w:color w:val="000000"/>
+          <w:sz w:val="24"/>
+          <w:szCs w:val="24"/>
+        </w:rPr>
+      </w:r>
     </w:p>
     <w:p>
       <w:pPr>
-        <w:pStyle w:val="928"/>
+        <w:pStyle w:val="932"/>
         <w:numPr>
           <w:ilvl w:val="2"/>
           <w:numId w:val="7"/>
@@ -1308,11 +1301,18 @@
         </w:rPr>
         <w:t xml:space="preserve">Lowercase it</w:t>
       </w:r>
-      <w:r/>
+      <w:r>
+        <w:rPr>
+          <w:rFonts w:ascii="Times New Roman" w:hAnsi="Times New Roman" w:eastAsia="Times New Roman" w:cs="Times New Roman"/>
+          <w:color w:val="000000"/>
+          <w:sz w:val="24"/>
+          <w:szCs w:val="24"/>
+        </w:rPr>
+      </w:r>
     </w:p>
     <w:p>
       <w:pPr>
-        <w:pStyle w:val="928"/>
+        <w:pStyle w:val="932"/>
         <w:numPr>
           <w:ilvl w:val="2"/>
           <w:numId w:val="7"/>
@@ -1347,11 +1347,18 @@
         </w:rPr>
         <w:t xml:space="preserve">Drop it if it's pure punctuation</w:t>
       </w:r>
-      <w:r/>
+      <w:r>
+        <w:rPr>
+          <w:rFonts w:ascii="Times New Roman" w:hAnsi="Times New Roman" w:eastAsia="Times New Roman" w:cs="Times New Roman"/>
+          <w:color w:val="000000"/>
+          <w:sz w:val="24"/>
+          <w:szCs w:val="24"/>
+        </w:rPr>
+      </w:r>
     </w:p>
     <w:p>
       <w:pPr>
-        <w:pStyle w:val="928"/>
+        <w:pStyle w:val="932"/>
         <w:numPr>
           <w:ilvl w:val="2"/>
           <w:numId w:val="7"/>
@@ -1402,11 +1409,18 @@
         </w:rPr>
         <w:t xml:space="preserve">)</w:t>
       </w:r>
-      <w:r/>
+      <w:r>
+        <w:rPr>
+          <w:rFonts w:ascii="Times New Roman" w:hAnsi="Times New Roman" w:eastAsia="Times New Roman" w:cs="Times New Roman"/>
+          <w:color w:val="000000"/>
+          <w:sz w:val="24"/>
+          <w:szCs w:val="24"/>
+        </w:rPr>
+      </w:r>
     </w:p>
     <w:p>
       <w:pPr>
-        <w:pStyle w:val="928"/>
+        <w:pStyle w:val="932"/>
         <w:numPr>
           <w:ilvl w:val="2"/>
           <w:numId w:val="7"/>
@@ -1457,11 +1471,18 @@
         </w:rPr>
         <w:t xml:space="preserve"> (default 40 chars)</w:t>
       </w:r>
-      <w:r/>
+      <w:r>
+        <w:rPr>
+          <w:rFonts w:ascii="Times New Roman" w:hAnsi="Times New Roman" w:eastAsia="Times New Roman" w:cs="Times New Roman"/>
+          <w:color w:val="000000"/>
+          <w:sz w:val="24"/>
+          <w:szCs w:val="24"/>
+        </w:rPr>
+      </w:r>
     </w:p>
     <w:p>
       <w:pPr>
-        <w:pStyle w:val="928"/>
+        <w:pStyle w:val="932"/>
         <w:numPr>
           <w:ilvl w:val="2"/>
           <w:numId w:val="7"/>
@@ -1492,11 +1513,10 @@
         <w:t xml:space="preserve">Otherwise, run it through a Snowball stemmer (e.g. "running" → "run"), unless stemming is disabled</w:t>
       </w:r>
       <w:r/>
-      <w:r/>
     </w:p>
     <w:p>
       <w:pPr>
-        <w:pStyle w:val="928"/>
+        <w:pStyle w:val="932"/>
         <w:numPr>
           <w:ilvl w:val="1"/>
           <w:numId w:val="7"/>
@@ -1521,13 +1541,6 @@
       <w:r>
         <w:rPr>
           <w:rFonts w:ascii="Times New Roman" w:hAnsi="Times New Roman" w:eastAsia="Times New Roman" w:cs="Times New Roman"/>
-          <w:sz w:val="24"/>
-          <w:highlight w:val="none"/>
-        </w:rPr>
-      </w:r>
-      <w:r>
-        <w:rPr>
-          <w:rFonts w:ascii="Times New Roman" w:hAnsi="Times New Roman" w:eastAsia="Times New Roman" w:cs="Times New Roman"/>
           <w:b/>
           <w:color w:val="000000"/>
           <w:sz w:val="24"/>
@@ -1555,7 +1568,7 @@
     </w:p>
     <w:p>
       <w:pPr>
-        <w:pStyle w:val="928"/>
+        <w:pStyle w:val="932"/>
         <w:numPr>
           <w:ilvl w:val="1"/>
           <w:numId w:val="7"/>
@@ -1590,12 +1603,8 @@
       </w:r>
       <w:r>
         <w:rPr>
-          <w:rFonts w:ascii="Courier New" w:hAnsi="Courier New" w:eastAsia="Courier New" w:cs="Courier New"/>
           <w:b/>
           <w:bCs/>
-          <w:color w:val="000000"/>
-          <w:sz w:val="20"/>
-          <w:highlight w:val="none"/>
         </w:rPr>
       </w:r>
       <w:r>
@@ -1607,7 +1616,7 @@
     </w:p>
     <w:p>
       <w:pPr>
-        <w:pStyle w:val="928"/>
+        <w:pStyle w:val="932"/>
         <w:numPr>
           <w:ilvl w:val="2"/>
           <w:numId w:val="7"/>
@@ -1645,11 +1654,19 @@
         </w:rPr>
         <w:t xml:space="preserve">weight = (f * (k+1)) / (f + k * (1 - b + b * doc_len/avg_len))</w:t>
       </w:r>
-      <w:r/>
+      <w:r>
+        <w:rPr>
+          <w:rFonts w:ascii="Courier New" w:hAnsi="Courier New" w:eastAsia="Courier New" w:cs="Courier New"/>
+          <w:color w:val="000000"/>
+          <w:sz w:val="20"/>
+          <w:szCs w:val="20"/>
+          <w:highlight w:val="none"/>
+        </w:rPr>
+      </w:r>
     </w:p>
     <w:p>
       <w:pPr>
-        <w:pStyle w:val="928"/>
+        <w:pStyle w:val="932"/>
         <w:numPr>
           <w:ilvl w:val="1"/>
           <w:numId w:val="7"/>
@@ -1695,11 +1712,18 @@
         </w:rPr>
         <w:t xml:space="preserve"> Each stemmed token is converted to its sparse-vector index via:</w:t>
       </w:r>
-      <w:r/>
+      <w:r>
+        <w:rPr>
+          <w:rFonts w:ascii="Times New Roman" w:hAnsi="Times New Roman" w:eastAsia="Times New Roman" w:cs="Times New Roman"/>
+          <w:color w:val="000000"/>
+          <w:sz w:val="24"/>
+          <w:szCs w:val="24"/>
+        </w:rPr>
+      </w:r>
     </w:p>
     <w:p>
       <w:pPr>
-        <w:pStyle w:val="928"/>
+        <w:pStyle w:val="932"/>
         <w:numPr>
           <w:ilvl w:val="2"/>
           <w:numId w:val="7"/>
@@ -1734,11 +1758,18 @@
         </w:rPr>
         <w:t xml:space="preserve">token_id = abs(mmh3.hash(token))</w:t>
       </w:r>
-      <w:r/>
+      <w:r>
+        <w:rPr>
+          <w:rFonts w:ascii="Times New Roman" w:hAnsi="Times New Roman" w:eastAsia="Times New Roman" w:cs="Times New Roman"/>
+          <w:color w:val="14181f"/>
+          <w:sz w:val="24"/>
+          <w:szCs w:val="24"/>
+        </w:rPr>
+      </w:r>
     </w:p>
     <w:p>
       <w:pPr>
-        <w:pStyle w:val="928"/>
+        <w:pStyle w:val="932"/>
         <w:numPr>
           <w:ilvl w:val="2"/>
           <w:numId w:val="7"/>
@@ -1769,16 +1800,14 @@
         </w:rPr>
         <w:t xml:space="preserve">(MurmurHash3) is </w:t>
       </w:r>
-      <w:r/>
       <w:r>
         <w:t xml:space="preserve">not a vocabulary lookup</w:t>
       </w:r>
-      <w:r/>
       <w:r/>
     </w:p>
     <w:p>
       <w:pPr>
-        <w:pStyle w:val="928"/>
+        <w:pStyle w:val="932"/>
         <w:numPr>
           <w:ilvl w:val="1"/>
           <w:numId w:val="7"/>
@@ -1800,7 +1829,6 @@
           <w:szCs w:val="24"/>
         </w:rPr>
       </w:pPr>
-      <w:r/>
       <w:r>
         <w:rPr>
           <w:rFonts w:ascii="Times New Roman" w:hAnsi="Times New Roman" w:eastAsia="Times New Roman" w:cs="Times New Roman"/>
@@ -1810,11 +1838,20 @@
         </w:rPr>
         <w:t xml:space="preserve">Assemble the sparse vector</w:t>
       </w:r>
-      <w:r/>
+      <w:r>
+        <w:rPr>
+          <w:rFonts w:ascii="Times New Roman" w:hAnsi="Times New Roman" w:eastAsia="Times New Roman" w:cs="Times New Roman"/>
+          <w:b/>
+          <w:bCs/>
+          <w:color w:val="000000"/>
+          <w:sz w:val="24"/>
+          <w:szCs w:val="24"/>
+        </w:rPr>
+      </w:r>
     </w:p>
     <w:p>
       <w:pPr>
-        <w:pStyle w:val="928"/>
+        <w:pStyle w:val="932"/>
         <w:numPr>
           <w:ilvl w:val="2"/>
           <w:numId w:val="7"/>
@@ -1859,11 +1896,18 @@
         </w:rPr>
         <w:t xml:space="preserve"> = the hashed token IDs</w:t>
       </w:r>
-      <w:r/>
+      <w:r>
+        <w:rPr>
+          <w:rFonts w:ascii="Times New Roman" w:hAnsi="Times New Roman" w:eastAsia="Times New Roman" w:cs="Times New Roman"/>
+          <w:color w:val="000000"/>
+          <w:sz w:val="24"/>
+          <w:szCs w:val="24"/>
+        </w:rPr>
+      </w:r>
     </w:p>
     <w:p>
       <w:pPr>
-        <w:pStyle w:val="928"/>
+        <w:pStyle w:val="932"/>
         <w:numPr>
           <w:ilvl w:val="2"/>
           <w:numId w:val="7"/>
@@ -1903,11 +1947,10 @@
         <w:t xml:space="preserve"> = the corresponding term-frequency weights from Step 5</w:t>
       </w:r>
       <w:r/>
-      <w:r/>
     </w:p>
     <w:p>
       <w:pPr>
-        <w:pStyle w:val="928"/>
+        <w:pStyle w:val="932"/>
         <w:numPr>
           <w:ilvl w:val="1"/>
           <w:numId w:val="7"/>
@@ -1927,7 +1970,6 @@
           <w:szCs w:val="24"/>
         </w:rPr>
       </w:pPr>
-      <w:r/>
       <w:r>
         <w:rPr>
           <w:rFonts w:ascii="Times New Roman" w:hAnsi="Times New Roman" w:eastAsia="Times New Roman" w:cs="Times New Roman"/>
@@ -1964,11 +2006,18 @@
         </w:rPr>
         <w:t xml:space="preserve">, Qdrant multiplies in the inverse document frequency at query time, completing the full BM25 score:</w:t>
       </w:r>
-      <w:r/>
+      <w:r>
+        <w:rPr>
+          <w:rFonts w:ascii="Times New Roman" w:hAnsi="Times New Roman" w:eastAsia="Times New Roman" w:cs="Times New Roman"/>
+          <w:color w:val="000000"/>
+          <w:sz w:val="24"/>
+          <w:szCs w:val="24"/>
+        </w:rPr>
+      </w:r>
     </w:p>
     <w:p>
       <w:pPr>
-        <w:pStyle w:val="928"/>
+        <w:pStyle w:val="932"/>
         <w:numPr>
           <w:ilvl w:val="2"/>
           <w:numId w:val="7"/>
@@ -1999,11 +2048,10 @@
         <w:t xml:space="preserve">score(q,d) = Σ IDF(q_i) × [TF weight computed above]</w:t>
       </w:r>
       <w:r/>
-      <w:r/>
     </w:p>
     <w:p>
       <w:pPr>
-        <w:pStyle w:val="928"/>
+        <w:pStyle w:val="932"/>
         <w:numPr>
           <w:ilvl w:val="1"/>
           <w:numId w:val="7"/>
@@ -2034,18 +2082,11 @@
           <w:highlight w:val="none"/>
         </w:rPr>
       </w:r>
-      <w:r>
-        <w:rPr>
-          <w:rFonts w:ascii="Courier New" w:hAnsi="Courier New" w:eastAsia="Courier New" w:cs="Courier New"/>
-          <w:color w:val="000000"/>
-          <w:sz w:val="20"/>
-          <w:highlight w:val="none"/>
-        </w:rPr>
-      </w:r>
+      <w:r/>
     </w:p>
     <w:p>
       <w:pPr>
-        <w:pStyle w:val="928"/>
+        <w:pStyle w:val="932"/>
         <w:numPr>
           <w:ilvl w:val="0"/>
           <w:numId w:val="10"/>
@@ -2097,7 +2138,7 @@
     </w:p>
     <w:p>
       <w:pPr>
-        <w:pStyle w:val="928"/>
+        <w:pStyle w:val="932"/>
         <w:numPr>
           <w:ilvl w:val="0"/>
           <w:numId w:val="10"/>
@@ -2197,7 +2238,7 @@
     </w:p>
     <w:p>
       <w:pPr>
-        <w:pStyle w:val="928"/>
+        <w:pStyle w:val="932"/>
         <w:numPr>
           <w:ilvl w:val="0"/>
           <w:numId w:val="4"/>
@@ -2260,7 +2301,7 @@
     </w:p>
     <w:p>
       <w:pPr>
-        <w:pStyle w:val="928"/>
+        <w:pStyle w:val="932"/>
         <w:numPr>
           <w:ilvl w:val="0"/>
           <w:numId w:val="4"/>
@@ -2339,7 +2380,7 @@
     </w:p>
     <w:p>
       <w:pPr>
-        <w:pStyle w:val="928"/>
+        <w:pStyle w:val="932"/>
         <w:numPr>
           <w:ilvl w:val="0"/>
           <w:numId w:val="4"/>
@@ -2421,7 +2462,7 @@
     </w:p>
     <w:p>
       <w:pPr>
-        <w:pStyle w:val="928"/>
+        <w:pStyle w:val="932"/>
         <w:numPr>
           <w:ilvl w:val="0"/>
           <w:numId w:val="4"/>
@@ -2504,7 +2545,7 @@
     </w:p>
     <w:p>
       <w:pPr>
-        <w:pStyle w:val="928"/>
+        <w:pStyle w:val="932"/>
         <w:numPr>
           <w:ilvl w:val="0"/>
           <w:numId w:val="4"/>
@@ -2751,7 +2792,7 @@
     </w:p>
     <w:p>
       <w:pPr>
-        <w:pStyle w:val="903"/>
+        <w:pStyle w:val="907"/>
         <w:pBdr/>
         <w:spacing/>
         <w:ind/>
@@ -2778,7 +2819,7 @@
     </w:p>
     <w:p>
       <w:pPr>
-        <w:pStyle w:val="928"/>
+        <w:pStyle w:val="932"/>
         <w:numPr>
           <w:ilvl w:val="0"/>
           <w:numId w:val="12"/>
@@ -2814,7 +2855,7 @@
     </w:p>
     <w:p>
       <w:pPr>
-        <w:pStyle w:val="928"/>
+        <w:pStyle w:val="932"/>
         <w:numPr>
           <w:ilvl w:val="0"/>
           <w:numId w:val="12"/>
@@ -2850,7 +2891,7 @@
     </w:p>
     <w:p>
       <w:pPr>
-        <w:pStyle w:val="928"/>
+        <w:pStyle w:val="932"/>
         <w:numPr>
           <w:ilvl w:val="1"/>
           <w:numId w:val="12"/>
@@ -2902,7 +2943,7 @@
     </w:p>
     <w:p>
       <w:pPr>
-        <w:pStyle w:val="928"/>
+        <w:pStyle w:val="932"/>
         <w:numPr>
           <w:ilvl w:val="2"/>
           <w:numId w:val="12"/>
@@ -2982,7 +3023,7 @@
     </w:p>
     <w:p>
       <w:pPr>
-        <w:pStyle w:val="928"/>
+        <w:pStyle w:val="932"/>
         <w:numPr>
           <w:ilvl w:val="1"/>
           <w:numId w:val="12"/>
@@ -3018,7 +3059,7 @@
     </w:p>
     <w:p>
       <w:pPr>
-        <w:pStyle w:val="928"/>
+        <w:pStyle w:val="932"/>
         <w:numPr>
           <w:ilvl w:val="1"/>
           <w:numId w:val="12"/>
@@ -3054,7 +3095,7 @@
     </w:p>
     <w:p>
       <w:pPr>
-        <w:pStyle w:val="928"/>
+        <w:pStyle w:val="932"/>
         <w:numPr>
           <w:ilvl w:val="1"/>
           <w:numId w:val="12"/>
@@ -3090,7 +3131,7 @@
     </w:p>
     <w:p>
       <w:pPr>
-        <w:pStyle w:val="928"/>
+        <w:pStyle w:val="932"/>
         <w:numPr>
           <w:ilvl w:val="0"/>
           <w:numId w:val="12"/>
@@ -3129,7 +3170,7 @@
     </w:p>
     <w:p>
       <w:pPr>
-        <w:pStyle w:val="928"/>
+        <w:pStyle w:val="932"/>
         <w:numPr>
           <w:ilvl w:val="1"/>
           <w:numId w:val="12"/>
@@ -3175,7 +3216,7 @@
     </w:p>
     <w:p>
       <w:pPr>
-        <w:pStyle w:val="928"/>
+        <w:pStyle w:val="932"/>
         <w:numPr>
           <w:ilvl w:val="1"/>
           <w:numId w:val="12"/>
@@ -3229,7 +3270,7 @@
     </w:p>
     <w:p>
       <w:pPr>
-        <w:pStyle w:val="928"/>
+        <w:pStyle w:val="932"/>
         <w:numPr>
           <w:ilvl w:val="1"/>
           <w:numId w:val="12"/>
@@ -3275,7 +3316,7 @@
     </w:p>
     <w:p>
       <w:pPr>
-        <w:pStyle w:val="928"/>
+        <w:pStyle w:val="932"/>
         <w:numPr>
           <w:ilvl w:val="2"/>
           <w:numId w:val="12"/>
@@ -3373,7 +3414,7 @@
     </w:p>
     <w:p>
       <w:pPr>
-        <w:pStyle w:val="928"/>
+        <w:pStyle w:val="932"/>
         <w:numPr>
           <w:ilvl w:val="1"/>
           <w:numId w:val="12"/>
@@ -3419,7 +3460,7 @@
     </w:p>
     <w:p>
       <w:pPr>
-        <w:pStyle w:val="928"/>
+        <w:pStyle w:val="932"/>
         <w:numPr>
           <w:ilvl w:val="2"/>
           <w:numId w:val="12"/>
@@ -3458,7 +3499,7 @@
     </w:p>
     <w:p>
       <w:pPr>
-        <w:pStyle w:val="928"/>
+        <w:pStyle w:val="932"/>
         <w:numPr>
           <w:ilvl w:val="3"/>
           <w:numId w:val="12"/>
@@ -3504,7 +3545,7 @@
     </w:p>
     <w:p>
       <w:pPr>
-        <w:pStyle w:val="928"/>
+        <w:pStyle w:val="932"/>
         <w:numPr>
           <w:ilvl w:val="3"/>
           <w:numId w:val="12"/>
@@ -3550,7 +3591,7 @@
     </w:p>
     <w:p>
       <w:pPr>
-        <w:pStyle w:val="928"/>
+        <w:pStyle w:val="932"/>
         <w:numPr>
           <w:ilvl w:val="3"/>
           <w:numId w:val="12"/>
@@ -3589,7 +3630,7 @@
     </w:p>
     <w:p>
       <w:pPr>
-        <w:pStyle w:val="928"/>
+        <w:pStyle w:val="932"/>
         <w:numPr>
           <w:ilvl w:val="2"/>
           <w:numId w:val="12"/>
@@ -3628,7 +3669,7 @@
     </w:p>
     <w:p>
       <w:pPr>
-        <w:pStyle w:val="928"/>
+        <w:pStyle w:val="932"/>
         <w:numPr>
           <w:ilvl w:val="2"/>
           <w:numId w:val="12"/>
@@ -3735,7 +3776,7 @@
     </w:p>
     <w:p>
       <w:pPr>
-        <w:pStyle w:val="928"/>
+        <w:pStyle w:val="932"/>
         <w:numPr>
           <w:ilvl w:val="2"/>
           <w:numId w:val="12"/>
@@ -3790,7 +3831,7 @@
     </w:p>
     <w:p>
       <w:pPr>
-        <w:pStyle w:val="928"/>
+        <w:pStyle w:val="932"/>
         <w:numPr>
           <w:ilvl w:val="3"/>
           <w:numId w:val="12"/>
@@ -3837,7 +3878,7 @@
     </w:p>
     <w:p>
       <w:pPr>
-        <w:pStyle w:val="928"/>
+        <w:pStyle w:val="932"/>
         <w:numPr>
           <w:ilvl w:val="3"/>
           <w:numId w:val="12"/>
@@ -3901,7 +3942,7 @@
     </w:p>
     <w:p>
       <w:pPr>
-        <w:pStyle w:val="928"/>
+        <w:pStyle w:val="932"/>
         <w:numPr>
           <w:ilvl w:val="3"/>
           <w:numId w:val="12"/>
@@ -3965,7 +4006,7 @@
     </w:p>
     <w:p>
       <w:pPr>
-        <w:pStyle w:val="928"/>
+        <w:pStyle w:val="932"/>
         <w:numPr>
           <w:ilvl w:val="3"/>
           <w:numId w:val="12"/>
@@ -4004,7 +4045,7 @@
     </w:p>
     <w:p>
       <w:pPr>
-        <w:pStyle w:val="928"/>
+        <w:pStyle w:val="932"/>
         <w:numPr>
           <w:ilvl w:val="4"/>
           <w:numId w:val="12"/>
@@ -4054,7 +4095,7 @@
     </w:p>
     <w:p>
       <w:pPr>
-        <w:pStyle w:val="928"/>
+        <w:pStyle w:val="932"/>
         <w:numPr>
           <w:ilvl w:val="4"/>
           <w:numId w:val="12"/>
@@ -4107,7 +4148,7 @@
     </w:p>
     <w:p>
       <w:pPr>
-        <w:pStyle w:val="928"/>
+        <w:pStyle w:val="932"/>
         <w:numPr>
           <w:ilvl w:val="4"/>
           <w:numId w:val="12"/>
@@ -4160,7 +4201,7 @@
     </w:p>
     <w:p>
       <w:pPr>
-        <w:pStyle w:val="928"/>
+        <w:pStyle w:val="932"/>
         <w:numPr>
           <w:ilvl w:val="3"/>
           <w:numId w:val="12"/>
@@ -4254,7 +4295,7 @@
     </w:p>
     <w:p>
       <w:pPr>
-        <w:pStyle w:val="928"/>
+        <w:pStyle w:val="932"/>
         <w:numPr>
           <w:ilvl w:val="2"/>
           <w:numId w:val="12"/>
@@ -4298,7 +4339,7 @@
     </w:p>
     <w:p>
       <w:pPr>
-        <w:pStyle w:val="928"/>
+        <w:pStyle w:val="932"/>
         <w:numPr>
           <w:ilvl w:val="3"/>
           <w:numId w:val="12"/>
@@ -4361,7 +4402,7 @@
     </w:p>
     <w:p>
       <w:pPr>
-        <w:pStyle w:val="928"/>
+        <w:pStyle w:val="932"/>
         <w:numPr>
           <w:ilvl w:val="1"/>
           <w:numId w:val="12"/>
@@ -4415,7 +4456,7 @@
     </w:p>
     <w:p>
       <w:pPr>
-        <w:pStyle w:val="928"/>
+        <w:pStyle w:val="932"/>
         <w:numPr>
           <w:ilvl w:val="2"/>
           <w:numId w:val="12"/>
@@ -4461,7 +4502,7 @@
     </w:p>
     <w:p>
       <w:pPr>
-        <w:pStyle w:val="928"/>
+        <w:pStyle w:val="932"/>
         <w:numPr>
           <w:ilvl w:val="3"/>
           <w:numId w:val="12"/>
@@ -4518,7 +4559,7 @@
     </w:p>
     <w:p>
       <w:pPr>
-        <w:pStyle w:val="928"/>
+        <w:pStyle w:val="932"/>
         <w:numPr>
           <w:ilvl w:val="3"/>
           <w:numId w:val="12"/>
@@ -4575,7 +4616,7 @@
     </w:p>
     <w:p>
       <w:pPr>
-        <w:pStyle w:val="928"/>
+        <w:pStyle w:val="932"/>
         <w:numPr>
           <w:ilvl w:val="3"/>
           <w:numId w:val="12"/>
@@ -4622,7 +4663,7 @@
     </w:p>
     <w:p>
       <w:pPr>
-        <w:pStyle w:val="928"/>
+        <w:pStyle w:val="932"/>
         <w:numPr>
           <w:ilvl w:val="1"/>
           <w:numId w:val="12"/>
@@ -4666,7 +4707,7 @@
     </w:p>
     <w:p>
       <w:pPr>
-        <w:pStyle w:val="928"/>
+        <w:pStyle w:val="932"/>
         <w:numPr>
           <w:ilvl w:val="2"/>
           <w:numId w:val="12"/>
@@ -4709,7 +4750,7 @@
     </w:p>
     <w:p>
       <w:pPr>
-        <w:pStyle w:val="928"/>
+        <w:pStyle w:val="932"/>
         <w:numPr>
           <w:ilvl w:val="0"/>
           <w:numId w:val="12"/>
@@ -4740,7 +4781,7 @@
       <w:hyperlink r:id="rId11" w:tooltip="https://qdrant.tech/course/essentials/day-3/sparse-vectors/" w:history="1">
         <w:r>
           <w:rPr>
-            <w:rStyle w:val="910"/>
+            <w:rStyle w:val="914"/>
             <w:b w:val="0"/>
             <w:bCs w:val="0"/>
             <w:highlight w:val="none"/>
@@ -4749,7 +4790,7 @@
         </w:r>
         <w:r>
           <w:rPr>
-            <w:rStyle w:val="910"/>
+            <w:rStyle w:val="914"/>
             <w:b w:val="0"/>
             <w:bCs w:val="0"/>
             <w:highlight w:val="none"/>
@@ -4808,7 +4849,7 @@
     </w:p>
     <w:p>
       <w:pPr>
-        <w:pStyle w:val="928"/>
+        <w:pStyle w:val="932"/>
         <w:numPr>
           <w:ilvl w:val="0"/>
           <w:numId w:val="15"/>
@@ -4874,7 +4915,7 @@
     </w:p>
     <w:p>
       <w:pPr>
-        <w:pStyle w:val="928"/>
+        <w:pStyle w:val="932"/>
         <w:numPr>
           <w:ilvl w:val="0"/>
           <w:numId w:val="16"/>
@@ -4913,7 +4954,7 @@
     </w:p>
     <w:p>
       <w:pPr>
-        <w:pStyle w:val="928"/>
+        <w:pStyle w:val="932"/>
         <w:numPr>
           <w:ilvl w:val="0"/>
           <w:numId w:val="16"/>
@@ -4991,7 +5032,7 @@
     </w:p>
     <w:p>
       <w:pPr>
-        <w:pStyle w:val="928"/>
+        <w:pStyle w:val="932"/>
         <w:numPr>
           <w:ilvl w:val="0"/>
           <w:numId w:val="14"/>
@@ -5074,7 +5115,7 @@
     </w:p>
     <w:p>
       <w:pPr>
-        <w:pStyle w:val="928"/>
+        <w:pStyle w:val="932"/>
         <w:numPr>
           <w:ilvl w:val="0"/>
           <w:numId w:val="14"/>
@@ -5113,7 +5154,7 @@
     </w:p>
     <w:p>
       <w:pPr>
-        <w:pStyle w:val="928"/>
+        <w:pStyle w:val="932"/>
         <w:numPr>
           <w:ilvl w:val="1"/>
           <w:numId w:val="14"/>
@@ -5154,7 +5195,7 @@
     </w:p>
     <w:p>
       <w:pPr>
-        <w:pStyle w:val="928"/>
+        <w:pStyle w:val="932"/>
         <w:numPr>
           <w:ilvl w:val="1"/>
           <w:numId w:val="14"/>
@@ -5244,7 +5285,7 @@
     </w:p>
     <w:p>
       <w:pPr>
-        <w:pStyle w:val="928"/>
+        <w:pStyle w:val="932"/>
         <w:numPr>
           <w:ilvl w:val="0"/>
           <w:numId w:val="14"/>
@@ -5317,18 +5358,18 @@
       <w:hyperlink r:id="rId12" w:tooltip="https://blog.serghei.pl/posts/reciprocal-rank-fusion-explained/" w:history="1">
         <w:r>
           <w:rPr>
-            <w:rStyle w:val="910"/>
+            <w:rStyle w:val="914"/>
           </w:rPr>
           <w:t xml:space="preserve">https://blog.serghei.pl/posts/reciprocal-rank-fusion-explained/</w:t>
         </w:r>
         <w:r>
           <w:rPr>
-            <w:rStyle w:val="910"/>
+            <w:rStyle w:val="914"/>
           </w:rPr>
         </w:r>
         <w:r>
           <w:rPr>
-            <w:rStyle w:val="910"/>
+            <w:rStyle w:val="914"/>
           </w:rPr>
         </w:r>
       </w:hyperlink>
@@ -5440,7 +5481,7 @@
     </w:p>
     <w:p>
       <w:pPr>
-        <w:pStyle w:val="928"/>
+        <w:pStyle w:val="932"/>
         <w:numPr>
           <w:ilvl w:val="0"/>
           <w:numId w:val="19"/>
@@ -5466,7 +5507,7 @@
     </w:p>
     <w:p>
       <w:pPr>
-        <w:pStyle w:val="928"/>
+        <w:pStyle w:val="932"/>
         <w:numPr>
           <w:ilvl w:val="0"/>
           <w:numId w:val="19"/>
@@ -5492,7 +5533,7 @@
     </w:p>
     <w:p>
       <w:pPr>
-        <w:pStyle w:val="928"/>
+        <w:pStyle w:val="932"/>
         <w:numPr>
           <w:ilvl w:val="1"/>
           <w:numId w:val="19"/>
@@ -5517,7 +5558,7 @@
     </w:p>
     <w:p>
       <w:pPr>
-        <w:pStyle w:val="928"/>
+        <w:pStyle w:val="932"/>
         <w:numPr>
           <w:ilvl w:val="2"/>
           <w:numId w:val="19"/>
@@ -5543,7 +5584,7 @@
     </w:p>
     <w:p>
       <w:pPr>
-        <w:pStyle w:val="928"/>
+        <w:pStyle w:val="932"/>
         <w:numPr>
           <w:ilvl w:val="1"/>
           <w:numId w:val="19"/>
@@ -5565,7 +5606,7 @@
     </w:p>
     <w:p>
       <w:pPr>
-        <w:pStyle w:val="928"/>
+        <w:pStyle w:val="932"/>
         <w:numPr>
           <w:ilvl w:val="2"/>
           <w:numId w:val="19"/>
@@ -5591,7 +5632,7 @@
     </w:p>
     <w:p>
       <w:pPr>
-        <w:pStyle w:val="928"/>
+        <w:pStyle w:val="932"/>
         <w:numPr>
           <w:ilvl w:val="1"/>
           <w:numId w:val="19"/>
@@ -5627,7 +5668,7 @@
     </w:p>
     <w:p>
       <w:pPr>
-        <w:pStyle w:val="928"/>
+        <w:pStyle w:val="932"/>
         <w:numPr>
           <w:ilvl w:val="2"/>
           <w:numId w:val="19"/>
@@ -5653,7 +5694,7 @@
     </w:p>
     <w:p>
       <w:pPr>
-        <w:pStyle w:val="928"/>
+        <w:pStyle w:val="932"/>
         <w:numPr>
           <w:ilvl w:val="1"/>
           <w:numId w:val="19"/>
@@ -5681,7 +5722,7 @@
     </w:p>
     <w:p>
       <w:pPr>
-        <w:pStyle w:val="928"/>
+        <w:pStyle w:val="932"/>
         <w:numPr>
           <w:ilvl w:val="2"/>
           <w:numId w:val="19"/>
@@ -5718,7 +5759,7 @@
     </w:p>
     <w:p>
       <w:pPr>
-        <w:pStyle w:val="928"/>
+        <w:pStyle w:val="932"/>
         <w:numPr>
           <w:ilvl w:val="0"/>
           <w:numId w:val="19"/>
@@ -9170,9 +9211,9 @@
     <w:lsdException w:name="Bibliography" w:uiPriority="37"/>
     <w:lsdException w:name="TOC Heading" w:uiPriority="39" w:qFormat="1"/>
   </w:latentStyles>
-  <w:style w:type="table" w:styleId="739">
+  <w:style w:type="table" w:styleId="743">
     <w:name w:val="Table Grid"/>
-    <w:basedOn w:val="925"/>
+    <w:basedOn w:val="929"/>
     <w:uiPriority w:val="59"/>
     <w:pPr>
       <w:pBdr/>
@@ -9369,9 +9410,9 @@
       </w:tcPr>
     </w:tblStylePr>
   </w:style>
-  <w:style w:type="table" w:styleId="740">
+  <w:style w:type="table" w:styleId="744">
     <w:name w:val="Table Grid Light"/>
-    <w:basedOn w:val="925"/>
+    <w:basedOn w:val="929"/>
     <w:uiPriority w:val="59"/>
     <w:pPr>
       <w:pBdr/>
@@ -9568,9 +9609,9 @@
       </w:tcPr>
     </w:tblStylePr>
   </w:style>
-  <w:style w:type="table" w:styleId="741">
+  <w:style w:type="table" w:styleId="745">
     <w:name w:val="Plain Table 1"/>
-    <w:basedOn w:val="925"/>
+    <w:basedOn w:val="929"/>
     <w:uiPriority w:val="59"/>
     <w:pPr>
       <w:pBdr/>
@@ -9793,9 +9834,9 @@
       </w:tcPr>
     </w:tblStylePr>
   </w:style>
-  <w:style w:type="table" w:styleId="742">
+  <w:style w:type="table" w:styleId="746">
     <w:name w:val="Plain Table 2"/>
-    <w:basedOn w:val="925"/>
+    <w:basedOn w:val="929"/>
     <w:uiPriority w:val="59"/>
     <w:pPr>
       <w:pBdr/>
@@ -10026,9 +10067,9 @@
       </w:tcPr>
     </w:tblStylePr>
   </w:style>
-  <w:style w:type="table" w:styleId="743">
+  <w:style w:type="table" w:styleId="747">
     <w:name w:val="Plain Table 3"/>
-    <w:basedOn w:val="925"/>
+    <w:basedOn w:val="929"/>
     <w:uiPriority w:val="99"/>
     <w:pPr>
       <w:pBdr/>
@@ -10256,9 +10297,9 @@
       </w:tcPr>
     </w:tblStylePr>
   </w:style>
-  <w:style w:type="table" w:styleId="744">
+  <w:style w:type="table" w:styleId="748">
     <w:name w:val="Plain Table 4"/>
-    <w:basedOn w:val="925"/>
+    <w:basedOn w:val="929"/>
     <w:uiPriority w:val="99"/>
     <w:pPr>
       <w:pBdr/>
@@ -10472,9 +10513,9 @@
       </w:tcPr>
     </w:tblStylePr>
   </w:style>
-  <w:style w:type="table" w:styleId="745">
+  <w:style w:type="table" w:styleId="749">
     <w:name w:val="Plain Table 5"/>
-    <w:basedOn w:val="925"/>
+    <w:basedOn w:val="929"/>
     <w:uiPriority w:val="99"/>
     <w:pPr>
       <w:pBdr/>
@@ -10705,9 +10746,9 @@
       </w:tcPr>
     </w:tblStylePr>
   </w:style>
-  <w:style w:type="table" w:styleId="746">
+  <w:style w:type="table" w:styleId="750">
     <w:name w:val="Grid Table 1 Light"/>
-    <w:basedOn w:val="925"/>
+    <w:basedOn w:val="929"/>
     <w:uiPriority w:val="99"/>
     <w:pPr>
       <w:pBdr/>
@@ -10928,9 +10969,9 @@
       </w:tcPr>
     </w:tblStylePr>
   </w:style>
-  <w:style w:type="table" w:styleId="747">
+  <w:style w:type="table" w:styleId="751">
     <w:name w:val="Grid Table 1 Light - Accent 1"/>
-    <w:basedOn w:val="925"/>
+    <w:basedOn w:val="929"/>
     <w:uiPriority w:val="99"/>
     <w:pPr>
       <w:pBdr/>
@@ -11151,9 +11192,9 @@
       </w:tcPr>
     </w:tblStylePr>
   </w:style>
-  <w:style w:type="table" w:styleId="748">
+  <w:style w:type="table" w:styleId="752">
     <w:name w:val="Grid Table 1 Light - Accent 2"/>
-    <w:basedOn w:val="925"/>
+    <w:basedOn w:val="929"/>
     <w:uiPriority w:val="99"/>
     <w:pPr>
       <w:pBdr/>
@@ -11374,9 +11415,9 @@
       </w:tcPr>
     </w:tblStylePr>
   </w:style>
-  <w:style w:type="table" w:styleId="749">
+  <w:style w:type="table" w:styleId="753">
     <w:name w:val="Grid Table 1 Light - Accent 3"/>
-    <w:basedOn w:val="925"/>
+    <w:basedOn w:val="929"/>
     <w:uiPriority w:val="99"/>
     <w:pPr>
       <w:pBdr/>
@@ -11597,9 +11638,9 @@
       </w:tcPr>
     </w:tblStylePr>
   </w:style>
-  <w:style w:type="table" w:styleId="750">
+  <w:style w:type="table" w:styleId="754">
     <w:name w:val="Grid Table 1 Light - Accent 4"/>
-    <w:basedOn w:val="925"/>
+    <w:basedOn w:val="929"/>
     <w:uiPriority w:val="99"/>
     <w:pPr>
       <w:pBdr/>
@@ -11820,9 +11861,9 @@
       </w:tcPr>
     </w:tblStylePr>
   </w:style>
-  <w:style w:type="table" w:styleId="751">
+  <w:style w:type="table" w:styleId="755">
     <w:name w:val="Grid Table 1 Light - Accent 5"/>
-    <w:basedOn w:val="925"/>
+    <w:basedOn w:val="929"/>
     <w:uiPriority w:val="99"/>
     <w:pPr>
       <w:pBdr/>
@@ -12043,9 +12084,9 @@
       </w:tcPr>
     </w:tblStylePr>
   </w:style>
-  <w:style w:type="table" w:styleId="752">
+  <w:style w:type="table" w:styleId="756">
     <w:name w:val="Grid Table 1 Light - Accent 6"/>
-    <w:basedOn w:val="925"/>
+    <w:basedOn w:val="929"/>
     <w:uiPriority w:val="99"/>
     <w:pPr>
       <w:pBdr/>
@@ -12266,9 +12307,9 @@
       </w:tcPr>
     </w:tblStylePr>
   </w:style>
-  <w:style w:type="table" w:styleId="753">
+  <w:style w:type="table" w:styleId="757">
     <w:name w:val="Grid Table 2"/>
-    <w:basedOn w:val="925"/>
+    <w:basedOn w:val="929"/>
     <w:uiPriority w:val="99"/>
     <w:pPr>
       <w:pBdr/>
@@ -12498,9 +12539,9 @@
       </w:tcPr>
     </w:tblStylePr>
   </w:style>
-  <w:style w:type="table" w:styleId="754">
+  <w:style w:type="table" w:styleId="758">
     <w:name w:val="Grid Table 2 - Accent 1"/>
-    <w:basedOn w:val="925"/>
+    <w:basedOn w:val="929"/>
     <w:uiPriority w:val="99"/>
     <w:pPr>
       <w:pBdr/>
@@ -12730,9 +12771,9 @@
       </w:tcPr>
     </w:tblStylePr>
   </w:style>
-  <w:style w:type="table" w:styleId="755">
+  <w:style w:type="table" w:styleId="759">
     <w:name w:val="Grid Table 2 - Accent 2"/>
-    <w:basedOn w:val="925"/>
+    <w:basedOn w:val="929"/>
     <w:uiPriority w:val="99"/>
     <w:pPr>
       <w:pBdr/>
@@ -12962,9 +13003,9 @@
       </w:tcPr>
     </w:tblStylePr>
   </w:style>
-  <w:style w:type="table" w:styleId="756">
+  <w:style w:type="table" w:styleId="760">
     <w:name w:val="Grid Table 2 - Accent 3"/>
-    <w:basedOn w:val="925"/>
+    <w:basedOn w:val="929"/>
     <w:uiPriority w:val="99"/>
     <w:pPr>
       <w:pBdr/>
@@ -13194,9 +13235,9 @@
       </w:tcPr>
     </w:tblStylePr>
   </w:style>
-  <w:style w:type="table" w:styleId="757">
+  <w:style w:type="table" w:styleId="761">
     <w:name w:val="Grid Table 2 - Accent 4"/>
-    <w:basedOn w:val="925"/>
+    <w:basedOn w:val="929"/>
     <w:uiPriority w:val="99"/>
     <w:pPr>
       <w:pBdr/>
@@ -13426,9 +13467,9 @@
       </w:tcPr>
     </w:tblStylePr>
   </w:style>
-  <w:style w:type="table" w:styleId="758">
+  <w:style w:type="table" w:styleId="762">
     <w:name w:val="Grid Table 2 - Accent 5"/>
-    <w:basedOn w:val="925"/>
+    <w:basedOn w:val="929"/>
     <w:uiPriority w:val="99"/>
     <w:pPr>
       <w:pBdr/>
@@ -13658,9 +13699,9 @@
       </w:tcPr>
     </w:tblStylePr>
   </w:style>
-  <w:style w:type="table" w:styleId="759">
+  <w:style w:type="table" w:styleId="763">
     <w:name w:val="Grid Table 2 - Accent 6"/>
-    <w:basedOn w:val="925"/>
+    <w:basedOn w:val="929"/>
     <w:uiPriority w:val="99"/>
     <w:pPr>
       <w:pBdr/>
@@ -13890,9 +13931,9 @@
       </w:tcPr>
     </w:tblStylePr>
   </w:style>
-  <w:style w:type="table" w:styleId="760">
+  <w:style w:type="table" w:styleId="764">
     <w:name w:val="Grid Table 3"/>
-    <w:basedOn w:val="925"/>
+    <w:basedOn w:val="929"/>
     <w:uiPriority w:val="99"/>
     <w:pPr>
       <w:pBdr/>
@@ -14135,9 +14176,9 @@
       </w:tcPr>
     </w:tblStylePr>
   </w:style>
-  <w:style w:type="table" w:styleId="761">
+  <w:style w:type="table" w:styleId="765">
     <w:name w:val="Grid Table 3 - Accent 1"/>
-    <w:basedOn w:val="925"/>
+    <w:basedOn w:val="929"/>
     <w:uiPriority w:val="99"/>
     <w:pPr>
       <w:pBdr/>
@@ -14380,9 +14421,9 @@
       </w:tcPr>
     </w:tblStylePr>
   </w:style>
-  <w:style w:type="table" w:styleId="762">
+  <w:style w:type="table" w:styleId="766">
     <w:name w:val="Grid Table 3 - Accent 2"/>
-    <w:basedOn w:val="925"/>
+    <w:basedOn w:val="929"/>
     <w:uiPriority w:val="99"/>
     <w:pPr>
       <w:pBdr/>
@@ -14625,9 +14666,9 @@
       </w:tcPr>
     </w:tblStylePr>
   </w:style>
-  <w:style w:type="table" w:styleId="763">
+  <w:style w:type="table" w:styleId="767">
     <w:name w:val="Grid Table 3 - Accent 3"/>
-    <w:basedOn w:val="925"/>
+    <w:basedOn w:val="929"/>
     <w:uiPriority w:val="99"/>
     <w:pPr>
       <w:pBdr/>
@@ -14870,9 +14911,9 @@
       </w:tcPr>
     </w:tblStylePr>
   </w:style>
-  <w:style w:type="table" w:styleId="764">
+  <w:style w:type="table" w:styleId="768">
     <w:name w:val="Grid Table 3 - Accent 4"/>
-    <w:basedOn w:val="925"/>
+    <w:basedOn w:val="929"/>
     <w:uiPriority w:val="99"/>
     <w:pPr>
       <w:pBdr/>
@@ -15115,9 +15156,9 @@
       </w:tcPr>
     </w:tblStylePr>
   </w:style>
-  <w:style w:type="table" w:styleId="765">
+  <w:style w:type="table" w:styleId="769">
     <w:name w:val="Grid Table 3 - Accent 5"/>
-    <w:basedOn w:val="925"/>
+    <w:basedOn w:val="929"/>
     <w:uiPriority w:val="99"/>
     <w:pPr>
       <w:pBdr/>
@@ -15360,9 +15401,9 @@
       </w:tcPr>
     </w:tblStylePr>
   </w:style>
-  <w:style w:type="table" w:styleId="766">
+  <w:style w:type="table" w:styleId="770">
     <w:name w:val="Grid Table 3 - Accent 6"/>
-    <w:basedOn w:val="925"/>
+    <w:basedOn w:val="929"/>
     <w:uiPriority w:val="99"/>
     <w:pPr>
       <w:pBdr/>
@@ -15605,9 +15646,9 @@
       </w:tcPr>
     </w:tblStylePr>
   </w:style>
-  <w:style w:type="table" w:styleId="767">
+  <w:style w:type="table" w:styleId="771">
     <w:name w:val="Grid Table 4"/>
-    <w:basedOn w:val="925"/>
+    <w:basedOn w:val="929"/>
     <w:uiPriority w:val="59"/>
     <w:pPr>
       <w:pBdr/>
@@ -15838,9 +15879,9 @@
       </w:tcPr>
     </w:tblStylePr>
   </w:style>
-  <w:style w:type="table" w:styleId="768">
+  <w:style w:type="table" w:styleId="772">
     <w:name w:val="Grid Table 4 - Accent 1"/>
-    <w:basedOn w:val="925"/>
+    <w:basedOn w:val="929"/>
     <w:uiPriority w:val="59"/>
     <w:pPr>
       <w:pBdr/>
@@ -16071,9 +16112,9 @@
       </w:tcPr>
     </w:tblStylePr>
   </w:style>
-  <w:style w:type="table" w:styleId="769">
+  <w:style w:type="table" w:styleId="773">
     <w:name w:val="Grid Table 4 - Accent 2"/>
-    <w:basedOn w:val="925"/>
+    <w:basedOn w:val="929"/>
     <w:uiPriority w:val="59"/>
     <w:pPr>
       <w:pBdr/>
@@ -16304,9 +16345,9 @@
       </w:tcPr>
     </w:tblStylePr>
   </w:style>
-  <w:style w:type="table" w:styleId="770">
+  <w:style w:type="table" w:styleId="774">
     <w:name w:val="Grid Table 4 - Accent 3"/>
-    <w:basedOn w:val="925"/>
+    <w:basedOn w:val="929"/>
     <w:uiPriority w:val="59"/>
     <w:pPr>
       <w:pBdr/>
@@ -16537,9 +16578,9 @@
       </w:tcPr>
     </w:tblStylePr>
   </w:style>
-  <w:style w:type="table" w:styleId="771">
+  <w:style w:type="table" w:styleId="775">
     <w:name w:val="Grid Table 4 - Accent 4"/>
-    <w:basedOn w:val="925"/>
+    <w:basedOn w:val="929"/>
     <w:uiPriority w:val="59"/>
     <w:pPr>
       <w:pBdr/>
@@ -16770,9 +16811,9 @@
       </w:tcPr>
     </w:tblStylePr>
   </w:style>
-  <w:style w:type="table" w:styleId="772">
+  <w:style w:type="table" w:styleId="776">
     <w:name w:val="Grid Table 4 - Accent 5"/>
-    <w:basedOn w:val="925"/>
+    <w:basedOn w:val="929"/>
     <w:uiPriority w:val="59"/>
     <w:pPr>
       <w:pBdr/>
@@ -17003,9 +17044,9 @@
       </w:tcPr>
     </w:tblStylePr>
   </w:style>
-  <w:style w:type="table" w:styleId="773">
+  <w:style w:type="table" w:styleId="777">
     <w:name w:val="Grid Table 4 - Accent 6"/>
-    <w:basedOn w:val="925"/>
+    <w:basedOn w:val="929"/>
     <w:uiPriority w:val="59"/>
     <w:pPr>
       <w:pBdr/>
@@ -17236,9 +17277,9 @@
       </w:tcPr>
     </w:tblStylePr>
   </w:style>
-  <w:style w:type="table" w:styleId="774">
+  <w:style w:type="table" w:styleId="778">
     <w:name w:val="Grid Table 5 Dark"/>
-    <w:basedOn w:val="925"/>
+    <w:basedOn w:val="929"/>
     <w:uiPriority w:val="99"/>
     <w:pPr>
       <w:pBdr/>
@@ -17464,9 +17505,9 @@
       </w:tcPr>
     </w:tblStylePr>
   </w:style>
-  <w:style w:type="table" w:styleId="775">
+  <w:style w:type="table" w:styleId="779">
     <w:name w:val="Grid Table 5 Dark- Accent 1"/>
-    <w:basedOn w:val="925"/>
+    <w:basedOn w:val="929"/>
     <w:uiPriority w:val="99"/>
     <w:pPr>
       <w:pBdr/>
@@ -17692,9 +17733,9 @@
       </w:tcPr>
     </w:tblStylePr>
   </w:style>
-  <w:style w:type="table" w:styleId="776">
+  <w:style w:type="table" w:styleId="780">
     <w:name w:val="Grid Table 5 Dark - Accent 2"/>
-    <w:basedOn w:val="925"/>
+    <w:basedOn w:val="929"/>
     <w:uiPriority w:val="99"/>
     <w:pPr>
       <w:pBdr/>
@@ -17920,9 +17961,9 @@
       </w:tcPr>
     </w:tblStylePr>
   </w:style>
-  <w:style w:type="table" w:styleId="777">
+  <w:style w:type="table" w:styleId="781">
     <w:name w:val="Grid Table 5 Dark - Accent 3"/>
-    <w:basedOn w:val="925"/>
+    <w:basedOn w:val="929"/>
     <w:uiPriority w:val="99"/>
     <w:pPr>
       <w:pBdr/>
@@ -18148,9 +18189,9 @@
       </w:tcPr>
     </w:tblStylePr>
   </w:style>
-  <w:style w:type="table" w:styleId="778">
+  <w:style w:type="table" w:styleId="782">
     <w:name w:val="Grid Table 5 Dark- Accent 4"/>
-    <w:basedOn w:val="925"/>
+    <w:basedOn w:val="929"/>
     <w:uiPriority w:val="99"/>
     <w:pPr>
       <w:pBdr/>
@@ -18376,9 +18417,9 @@
       </w:tcPr>
     </w:tblStylePr>
   </w:style>
-  <w:style w:type="table" w:styleId="779">
+  <w:style w:type="table" w:styleId="783">
     <w:name w:val="Grid Table 5 Dark - Accent 5"/>
-    <w:basedOn w:val="925"/>
+    <w:basedOn w:val="929"/>
     <w:uiPriority w:val="99"/>
     <w:pPr>
       <w:pBdr/>
@@ -18604,9 +18645,9 @@
       </w:tcPr>
     </w:tblStylePr>
   </w:style>
-  <w:style w:type="table" w:styleId="780">
+  <w:style w:type="table" w:styleId="784">
     <w:name w:val="Grid Table 5 Dark - Accent 6"/>
-    <w:basedOn w:val="925"/>
+    <w:basedOn w:val="929"/>
     <w:uiPriority w:val="99"/>
     <w:pPr>
       <w:pBdr/>
@@ -18832,9 +18873,9 @@
       </w:tcPr>
     </w:tblStylePr>
   </w:style>
-  <w:style w:type="table" w:styleId="781">
+  <w:style w:type="table" w:styleId="785">
     <w:name w:val="Grid Table 6 Colorful"/>
-    <w:basedOn w:val="925"/>
+    <w:basedOn w:val="929"/>
     <w:uiPriority w:val="99"/>
     <w:pPr>
       <w:pBdr/>
@@ -19062,9 +19103,9 @@
       </w:tcPr>
     </w:tblStylePr>
   </w:style>
-  <w:style w:type="table" w:styleId="782">
+  <w:style w:type="table" w:styleId="786">
     <w:name w:val="Grid Table 6 Colorful - Accent 1"/>
-    <w:basedOn w:val="925"/>
+    <w:basedOn w:val="929"/>
     <w:uiPriority w:val="99"/>
     <w:pPr>
       <w:pBdr/>
@@ -19292,9 +19333,9 @@
       </w:tcPr>
     </w:tblStylePr>
   </w:style>
-  <w:style w:type="table" w:styleId="783">
+  <w:style w:type="table" w:styleId="787">
     <w:name w:val="Grid Table 6 Colorful - Accent 2"/>
-    <w:basedOn w:val="925"/>
+    <w:basedOn w:val="929"/>
     <w:uiPriority w:val="99"/>
     <w:pPr>
       <w:pBdr/>
@@ -19522,9 +19563,9 @@
       </w:tcPr>
     </w:tblStylePr>
   </w:style>
-  <w:style w:type="table" w:styleId="784">
+  <w:style w:type="table" w:styleId="788">
     <w:name w:val="Grid Table 6 Colorful - Accent 3"/>
-    <w:basedOn w:val="925"/>
+    <w:basedOn w:val="929"/>
     <w:uiPriority w:val="99"/>
     <w:pPr>
       <w:pBdr/>
@@ -19752,9 +19793,9 @@
       </w:tcPr>
     </w:tblStylePr>
   </w:style>
-  <w:style w:type="table" w:styleId="785">
+  <w:style w:type="table" w:styleId="789">
     <w:name w:val="Grid Table 6 Colorful - Accent 4"/>
-    <w:basedOn w:val="925"/>
+    <w:basedOn w:val="929"/>
     <w:uiPriority w:val="99"/>
     <w:pPr>
       <w:pBdr/>
@@ -19982,9 +20023,9 @@
       </w:tcPr>
     </w:tblStylePr>
   </w:style>
-  <w:style w:type="table" w:styleId="786">
+  <w:style w:type="table" w:styleId="790">
     <w:name w:val="Grid Table 6 Colorful - Accent 5"/>
-    <w:basedOn w:val="925"/>
+    <w:basedOn w:val="929"/>
     <w:uiPriority w:val="99"/>
     <w:pPr>
       <w:pBdr/>
@@ -20212,9 +20253,9 @@
       </w:tcPr>
     </w:tblStylePr>
   </w:style>
-  <w:style w:type="table" w:styleId="787">
+  <w:style w:type="table" w:styleId="791">
     <w:name w:val="Grid Table 6 Colorful - Accent 6"/>
-    <w:basedOn w:val="925"/>
+    <w:basedOn w:val="929"/>
     <w:uiPriority w:val="99"/>
     <w:pPr>
       <w:pBdr/>
@@ -20442,9 +20483,9 @@
       </w:tcPr>
     </w:tblStylePr>
   </w:style>
-  <w:style w:type="table" w:styleId="788">
+  <w:style w:type="table" w:styleId="792">
     <w:name w:val="Grid Table 7 Colorful"/>
-    <w:basedOn w:val="925"/>
+    <w:basedOn w:val="929"/>
     <w:uiPriority w:val="99"/>
     <w:pPr>
       <w:pBdr/>
@@ -20696,9 +20737,9 @@
       </w:tcPr>
     </w:tblStylePr>
   </w:style>
-  <w:style w:type="table" w:styleId="789">
+  <w:style w:type="table" w:styleId="793">
     <w:name w:val="Grid Table 7 Colorful - Accent 1"/>
-    <w:basedOn w:val="925"/>
+    <w:basedOn w:val="929"/>
     <w:uiPriority w:val="99"/>
     <w:pPr>
       <w:pBdr/>
@@ -20950,9 +20991,9 @@
       </w:tcPr>
     </w:tblStylePr>
   </w:style>
-  <w:style w:type="table" w:styleId="790">
+  <w:style w:type="table" w:styleId="794">
     <w:name w:val="Grid Table 7 Colorful - Accent 2"/>
-    <w:basedOn w:val="925"/>
+    <w:basedOn w:val="929"/>
     <w:uiPriority w:val="99"/>
     <w:pPr>
       <w:pBdr/>
@@ -21204,9 +21245,9 @@
       </w:tcPr>
     </w:tblStylePr>
   </w:style>
-  <w:style w:type="table" w:styleId="791">
+  <w:style w:type="table" w:styleId="795">
     <w:name w:val="Grid Table 7 Colorful - Accent 3"/>
-    <w:basedOn w:val="925"/>
+    <w:basedOn w:val="929"/>
     <w:uiPriority w:val="99"/>
     <w:pPr>
       <w:pBdr/>
@@ -21458,9 +21499,9 @@
       </w:tcPr>
     </w:tblStylePr>
   </w:style>
-  <w:style w:type="table" w:styleId="792">
+  <w:style w:type="table" w:styleId="796">
     <w:name w:val="Grid Table 7 Colorful - Accent 4"/>
-    <w:basedOn w:val="925"/>
+    <w:basedOn w:val="929"/>
     <w:uiPriority w:val="99"/>
     <w:pPr>
       <w:pBdr/>
@@ -21712,9 +21753,9 @@
       </w:tcPr>
     </w:tblStylePr>
   </w:style>
-  <w:style w:type="table" w:styleId="793">
+  <w:style w:type="table" w:styleId="797">
     <w:name w:val="Grid Table 7 Colorful - Accent 5"/>
-    <w:basedOn w:val="925"/>
+    <w:basedOn w:val="929"/>
     <w:uiPriority w:val="99"/>
     <w:pPr>
       <w:pBdr/>
@@ -21966,9 +22007,9 @@
       </w:tcPr>
     </w:tblStylePr>
   </w:style>
-  <w:style w:type="table" w:styleId="794">
+  <w:style w:type="table" w:styleId="798">
     <w:name w:val="Grid Table 7 Colorful - Accent 6"/>
-    <w:basedOn w:val="925"/>
+    <w:basedOn w:val="929"/>
     <w:uiPriority w:val="99"/>
     <w:pPr>
       <w:pBdr/>
@@ -22220,9 +22261,9 @@
       </w:tcPr>
     </w:tblStylePr>
   </w:style>
-  <w:style w:type="table" w:styleId="795">
+  <w:style w:type="table" w:styleId="799">
     <w:name w:val="List Table 1 Light"/>
-    <w:basedOn w:val="925"/>
+    <w:basedOn w:val="929"/>
     <w:uiPriority w:val="99"/>
     <w:pPr>
       <w:pBdr/>
@@ -22436,9 +22477,9 @@
       </w:tcPr>
     </w:tblStylePr>
   </w:style>
-  <w:style w:type="table" w:styleId="796">
+  <w:style w:type="table" w:styleId="800">
     <w:name w:val="List Table 1 Light - Accent 1"/>
-    <w:basedOn w:val="925"/>
+    <w:basedOn w:val="929"/>
     <w:uiPriority w:val="99"/>
     <w:pPr>
       <w:pBdr/>
@@ -22652,9 +22693,9 @@
       </w:tcPr>
     </w:tblStylePr>
   </w:style>
-  <w:style w:type="table" w:styleId="797">
+  <w:style w:type="table" w:styleId="801">
     <w:name w:val="List Table 1 Light - Accent 2"/>
-    <w:basedOn w:val="925"/>
+    <w:basedOn w:val="929"/>
     <w:uiPriority w:val="99"/>
     <w:pPr>
       <w:pBdr/>
@@ -22868,9 +22909,9 @@
       </w:tcPr>
     </w:tblStylePr>
   </w:style>
-  <w:style w:type="table" w:styleId="798">
+  <w:style w:type="table" w:styleId="802">
     <w:name w:val="List Table 1 Light - Accent 3"/>
-    <w:basedOn w:val="925"/>
+    <w:basedOn w:val="929"/>
     <w:uiPriority w:val="99"/>
     <w:pPr>
       <w:pBdr/>
@@ -23084,9 +23125,9 @@
       </w:tcPr>
     </w:tblStylePr>
   </w:style>
-  <w:style w:type="table" w:styleId="799">
+  <w:style w:type="table" w:styleId="803">
     <w:name w:val="List Table 1 Light - Accent 4"/>
-    <w:basedOn w:val="925"/>
+    <w:basedOn w:val="929"/>
     <w:uiPriority w:val="99"/>
     <w:pPr>
       <w:pBdr/>
@@ -23300,9 +23341,9 @@
       </w:tcPr>
     </w:tblStylePr>
   </w:style>
-  <w:style w:type="table" w:styleId="800">
+  <w:style w:type="table" w:styleId="804">
     <w:name w:val="List Table 1 Light - Accent 5"/>
-    <w:basedOn w:val="925"/>
+    <w:basedOn w:val="929"/>
     <w:uiPriority w:val="99"/>
     <w:pPr>
       <w:pBdr/>
@@ -23516,9 +23557,9 @@
       </w:tcPr>
     </w:tblStylePr>
   </w:style>
-  <w:style w:type="table" w:styleId="801">
+  <w:style w:type="table" w:styleId="805">
     <w:name w:val="List Table 1 Light - Accent 6"/>
-    <w:basedOn w:val="925"/>
+    <w:basedOn w:val="929"/>
     <w:uiPriority w:val="99"/>
     <w:pPr>
       <w:pBdr/>
@@ -23732,9 +23773,9 @@
       </w:tcPr>
     </w:tblStylePr>
   </w:style>
-  <w:style w:type="table" w:styleId="802">
+  <w:style w:type="table" w:styleId="806">
     <w:name w:val="List Table 2"/>
-    <w:basedOn w:val="925"/>
+    <w:basedOn w:val="929"/>
     <w:uiPriority w:val="99"/>
     <w:pPr>
       <w:pBdr/>
@@ -23970,9 +24011,9 @@
       </w:tcPr>
     </w:tblStylePr>
   </w:style>
-  <w:style w:type="table" w:styleId="803">
+  <w:style w:type="table" w:styleId="807">
     <w:name w:val="List Table 2 - Accent 1"/>
-    <w:basedOn w:val="925"/>
+    <w:basedOn w:val="929"/>
     <w:uiPriority w:val="99"/>
     <w:pPr>
       <w:pBdr/>
@@ -24208,9 +24249,9 @@
       </w:tcPr>
     </w:tblStylePr>
   </w:style>
-  <w:style w:type="table" w:styleId="804">
+  <w:style w:type="table" w:styleId="808">
     <w:name w:val="List Table 2 - Accent 2"/>
-    <w:basedOn w:val="925"/>
+    <w:basedOn w:val="929"/>
     <w:uiPriority w:val="99"/>
     <w:pPr>
       <w:pBdr/>
@@ -24446,9 +24487,9 @@
       </w:tcPr>
     </w:tblStylePr>
   </w:style>
-  <w:style w:type="table" w:styleId="805">
+  <w:style w:type="table" w:styleId="809">
     <w:name w:val="List Table 2 - Accent 3"/>
-    <w:basedOn w:val="925"/>
+    <w:basedOn w:val="929"/>
     <w:uiPriority w:val="99"/>
     <w:pPr>
       <w:pBdr/>
@@ -24684,9 +24725,9 @@
       </w:tcPr>
     </w:tblStylePr>
   </w:style>
-  <w:style w:type="table" w:styleId="806">
+  <w:style w:type="table" w:styleId="810">
     <w:name w:val="List Table 2 - Accent 4"/>
-    <w:basedOn w:val="925"/>
+    <w:basedOn w:val="929"/>
     <w:uiPriority w:val="99"/>
     <w:pPr>
       <w:pBdr/>
@@ -24922,9 +24963,9 @@
       </w:tcPr>
     </w:tblStylePr>
   </w:style>
-  <w:style w:type="table" w:styleId="807">
+  <w:style w:type="table" w:styleId="811">
     <w:name w:val="List Table 2 - Accent 5"/>
-    <w:basedOn w:val="925"/>
+    <w:basedOn w:val="929"/>
     <w:uiPriority w:val="99"/>
     <w:pPr>
       <w:pBdr/>
@@ -25160,9 +25201,9 @@
       </w:tcPr>
     </w:tblStylePr>
   </w:style>
-  <w:style w:type="table" w:styleId="808">
+  <w:style w:type="table" w:styleId="812">
     <w:name w:val="List Table 2 - Accent 6"/>
-    <w:basedOn w:val="925"/>
+    <w:basedOn w:val="929"/>
     <w:uiPriority w:val="99"/>
     <w:pPr>
       <w:pBdr/>
@@ -25398,9 +25439,9 @@
       </w:tcPr>
     </w:tblStylePr>
   </w:style>
-  <w:style w:type="table" w:styleId="809">
+  <w:style w:type="table" w:styleId="813">
     <w:name w:val="List Table 3"/>
-    <w:basedOn w:val="925"/>
+    <w:basedOn w:val="929"/>
     <w:uiPriority w:val="99"/>
     <w:pPr>
       <w:pBdr/>
@@ -25626,9 +25667,9 @@
       </w:tcPr>
     </w:tblStylePr>
   </w:style>
-  <w:style w:type="table" w:styleId="810">
+  <w:style w:type="table" w:styleId="814">
     <w:name w:val="List Table 3 - Accent 1"/>
-    <w:basedOn w:val="925"/>
+    <w:basedOn w:val="929"/>
     <w:uiPriority w:val="99"/>
     <w:pPr>
       <w:pBdr/>
@@ -25854,9 +25895,9 @@
       </w:tcPr>
     </w:tblStylePr>
   </w:style>
-  <w:style w:type="table" w:styleId="811">
+  <w:style w:type="table" w:styleId="815">
     <w:name w:val="List Table 3 - Accent 2"/>
-    <w:basedOn w:val="925"/>
+    <w:basedOn w:val="929"/>
     <w:uiPriority w:val="99"/>
     <w:pPr>
       <w:pBdr/>
@@ -26082,9 +26123,9 @@
       </w:tcPr>
     </w:tblStylePr>
   </w:style>
-  <w:style w:type="table" w:styleId="812">
+  <w:style w:type="table" w:styleId="816">
     <w:name w:val="List Table 3 - Accent 3"/>
-    <w:basedOn w:val="925"/>
+    <w:basedOn w:val="929"/>
     <w:uiPriority w:val="99"/>
     <w:pPr>
       <w:pBdr/>
@@ -26310,9 +26351,9 @@
       </w:tcPr>
     </w:tblStylePr>
   </w:style>
-  <w:style w:type="table" w:styleId="813">
+  <w:style w:type="table" w:styleId="817">
     <w:name w:val="List Table 3 - Accent 4"/>
-    <w:basedOn w:val="925"/>
+    <w:basedOn w:val="929"/>
     <w:uiPriority w:val="99"/>
     <w:pPr>
       <w:pBdr/>
@@ -26538,9 +26579,9 @@
       </w:tcPr>
     </w:tblStylePr>
   </w:style>
-  <w:style w:type="table" w:styleId="814">
+  <w:style w:type="table" w:styleId="818">
     <w:name w:val="List Table 3 - Accent 5"/>
-    <w:basedOn w:val="925"/>
+    <w:basedOn w:val="929"/>
     <w:uiPriority w:val="99"/>
     <w:pPr>
       <w:pBdr/>
@@ -26766,9 +26807,9 @@
       </w:tcPr>
     </w:tblStylePr>
   </w:style>
-  <w:style w:type="table" w:styleId="815">
+  <w:style w:type="table" w:styleId="819">
     <w:name w:val="List Table 3 - Accent 6"/>
-    <w:basedOn w:val="925"/>
+    <w:basedOn w:val="929"/>
     <w:uiPriority w:val="99"/>
     <w:pPr>
       <w:pBdr/>
@@ -26994,9 +27035,9 @@
       </w:tcPr>
     </w:tblStylePr>
   </w:style>
-  <w:style w:type="table" w:styleId="816">
+  <w:style w:type="table" w:styleId="820">
     <w:name w:val="List Table 4"/>
-    <w:basedOn w:val="925"/>
+    <w:basedOn w:val="929"/>
     <w:uiPriority w:val="99"/>
     <w:pPr>
       <w:pBdr/>
@@ -27219,9 +27260,9 @@
       </w:tcPr>
     </w:tblStylePr>
   </w:style>
-  <w:style w:type="table" w:styleId="817">
+  <w:style w:type="table" w:styleId="821">
     <w:name w:val="List Table 4 - Accent 1"/>
-    <w:basedOn w:val="925"/>
+    <w:basedOn w:val="929"/>
     <w:uiPriority w:val="99"/>
     <w:pPr>
       <w:pBdr/>
@@ -27444,9 +27485,9 @@
       </w:tcPr>
     </w:tblStylePr>
   </w:style>
-  <w:style w:type="table" w:styleId="818">
+  <w:style w:type="table" w:styleId="822">
     <w:name w:val="List Table 4 - Accent 2"/>
-    <w:basedOn w:val="925"/>
+    <w:basedOn w:val="929"/>
     <w:uiPriority w:val="99"/>
     <w:pPr>
       <w:pBdr/>
@@ -27669,9 +27710,9 @@
       </w:tcPr>
     </w:tblStylePr>
   </w:style>
-  <w:style w:type="table" w:styleId="819">
+  <w:style w:type="table" w:styleId="823">
     <w:name w:val="List Table 4 - Accent 3"/>
-    <w:basedOn w:val="925"/>
+    <w:basedOn w:val="929"/>
     <w:uiPriority w:val="99"/>
     <w:pPr>
       <w:pBdr/>
@@ -27894,9 +27935,9 @@
       </w:tcPr>
     </w:tblStylePr>
   </w:style>
-  <w:style w:type="table" w:styleId="820">
+  <w:style w:type="table" w:styleId="824">
     <w:name w:val="List Table 4 - Accent 4"/>
-    <w:basedOn w:val="925"/>
+    <w:basedOn w:val="929"/>
     <w:uiPriority w:val="99"/>
     <w:pPr>
       <w:pBdr/>
@@ -28119,9 +28160,9 @@
       </w:tcPr>
     </w:tblStylePr>
   </w:style>
-  <w:style w:type="table" w:styleId="821">
+  <w:style w:type="table" w:styleId="825">
     <w:name w:val="List Table 4 - Accent 5"/>
-    <w:basedOn w:val="925"/>
+    <w:basedOn w:val="929"/>
     <w:uiPriority w:val="99"/>
     <w:pPr>
       <w:pBdr/>
@@ -28344,9 +28385,9 @@
       </w:tcPr>
     </w:tblStylePr>
   </w:style>
-  <w:style w:type="table" w:styleId="822">
+  <w:style w:type="table" w:styleId="826">
     <w:name w:val="List Table 4 - Accent 6"/>
-    <w:basedOn w:val="925"/>
+    <w:basedOn w:val="929"/>
     <w:uiPriority w:val="99"/>
     <w:pPr>
       <w:pBdr/>
@@ -28569,9 +28610,9 @@
       </w:tcPr>
     </w:tblStylePr>
   </w:style>
-  <w:style w:type="table" w:styleId="823">
+  <w:style w:type="table" w:styleId="827">
     <w:name w:val="List Table 5 Dark"/>
-    <w:basedOn w:val="925"/>
+    <w:basedOn w:val="929"/>
     <w:uiPriority w:val="99"/>
     <w:pPr>
       <w:pBdr/>
@@ -28811,9 +28852,9 @@
       </w:tcPr>
     </w:tblStylePr>
   </w:style>
-  <w:style w:type="table" w:styleId="824">
+  <w:style w:type="table" w:styleId="828">
     <w:name w:val="List Table 5 Dark - Accent 1"/>
-    <w:basedOn w:val="925"/>
+    <w:basedOn w:val="929"/>
     <w:uiPriority w:val="99"/>
     <w:pPr>
       <w:pBdr/>
@@ -29053,9 +29094,9 @@
       </w:tcPr>
     </w:tblStylePr>
   </w:style>
-  <w:style w:type="table" w:styleId="825">
+  <w:style w:type="table" w:styleId="829">
     <w:name w:val="List Table 5 Dark - Accent 2"/>
-    <w:basedOn w:val="925"/>
+    <w:basedOn w:val="929"/>
     <w:uiPriority w:val="99"/>
     <w:pPr>
       <w:pBdr/>
@@ -29295,9 +29336,9 @@
       </w:tcPr>
     </w:tblStylePr>
   </w:style>
-  <w:style w:type="table" w:styleId="826">
+  <w:style w:type="table" w:styleId="830">
     <w:name w:val="List Table 5 Dark - Accent 3"/>
-    <w:basedOn w:val="925"/>
+    <w:basedOn w:val="929"/>
     <w:uiPriority w:val="99"/>
     <w:pPr>
       <w:pBdr/>
@@ -29537,9 +29578,9 @@
       </w:tcPr>
     </w:tblStylePr>
   </w:style>
-  <w:style w:type="table" w:styleId="827">
+  <w:style w:type="table" w:styleId="831">
     <w:name w:val="List Table 5 Dark - Accent 4"/>
-    <w:basedOn w:val="925"/>
+    <w:basedOn w:val="929"/>
     <w:uiPriority w:val="99"/>
     <w:pPr>
       <w:pBdr/>
@@ -29779,9 +29820,9 @@
       </w:tcPr>
     </w:tblStylePr>
   </w:style>
-  <w:style w:type="table" w:styleId="828">
+  <w:style w:type="table" w:styleId="832">
     <w:name w:val="List Table 5 Dark - Accent 5"/>
-    <w:basedOn w:val="925"/>
+    <w:basedOn w:val="929"/>
     <w:uiPriority w:val="99"/>
     <w:pPr>
       <w:pBdr/>
@@ -30021,9 +30062,9 @@
       </w:tcPr>
     </w:tblStylePr>
   </w:style>
-  <w:style w:type="table" w:styleId="829">
+  <w:style w:type="table" w:styleId="833">
     <w:name w:val="List Table 5 Dark - Accent 6"/>
-    <w:basedOn w:val="925"/>
+    <w:basedOn w:val="929"/>
     <w:uiPriority w:val="99"/>
     <w:pPr>
       <w:pBdr/>
@@ -30263,9 +30304,9 @@
       </w:tcPr>
     </w:tblStylePr>
   </w:style>
-  <w:style w:type="table" w:styleId="830">
+  <w:style w:type="table" w:styleId="834">
     <w:name w:val="List Table 6 Colorful"/>
-    <w:basedOn w:val="925"/>
+    <w:basedOn w:val="929"/>
     <w:uiPriority w:val="99"/>
     <w:pPr>
       <w:pBdr/>
@@ -30486,9 +30527,9 @@
       </w:tcPr>
     </w:tblStylePr>
   </w:style>
-  <w:style w:type="table" w:styleId="831">
+  <w:style w:type="table" w:styleId="835">
     <w:name w:val="List Table 6 Colorful - Accent 1"/>
-    <w:basedOn w:val="925"/>
+    <w:basedOn w:val="929"/>
     <w:uiPriority w:val="99"/>
     <w:pPr>
       <w:pBdr/>
@@ -30709,9 +30750,9 @@
       </w:tcPr>
     </w:tblStylePr>
   </w:style>
-  <w:style w:type="table" w:styleId="832">
+  <w:style w:type="table" w:styleId="836">
     <w:name w:val="List Table 6 Colorful - Accent 2"/>
-    <w:basedOn w:val="925"/>
+    <w:basedOn w:val="929"/>
     <w:uiPriority w:val="99"/>
     <w:pPr>
       <w:pBdr/>
@@ -30932,9 +30973,9 @@
       </w:tcPr>
     </w:tblStylePr>
   </w:style>
-  <w:style w:type="table" w:styleId="833">
+  <w:style w:type="table" w:styleId="837">
     <w:name w:val="List Table 6 Colorful - Accent 3"/>
-    <w:basedOn w:val="925"/>
+    <w:basedOn w:val="929"/>
     <w:uiPriority w:val="99"/>
     <w:pPr>
       <w:pBdr/>
@@ -31155,9 +31196,9 @@
       </w:tcPr>
     </w:tblStylePr>
   </w:style>
-  <w:style w:type="table" w:styleId="834">
+  <w:style w:type="table" w:styleId="838">
     <w:name w:val="List Table 6 Colorful - Accent 4"/>
-    <w:basedOn w:val="925"/>
+    <w:basedOn w:val="929"/>
     <w:uiPriority w:val="99"/>
     <w:pPr>
       <w:pBdr/>
@@ -31378,9 +31419,9 @@
       </w:tcPr>
     </w:tblStylePr>
   </w:style>
-  <w:style w:type="table" w:styleId="835">
+  <w:style w:type="table" w:styleId="839">
     <w:name w:val="List Table 6 Colorful - Accent 5"/>
-    <w:basedOn w:val="925"/>
+    <w:basedOn w:val="929"/>
     <w:uiPriority w:val="99"/>
     <w:pPr>
       <w:pBdr/>
@@ -31601,9 +31642,9 @@
       </w:tcPr>
     </w:tblStylePr>
   </w:style>
-  <w:style w:type="table" w:styleId="836">
+  <w:style w:type="table" w:styleId="840">
     <w:name w:val="List Table 6 Colorful - Accent 6"/>
-    <w:basedOn w:val="925"/>
+    <w:basedOn w:val="929"/>
     <w:uiPriority w:val="99"/>
     <w:pPr>
       <w:pBdr/>
@@ -31824,9 +31865,9 @@
       </w:tcPr>
     </w:tblStylePr>
   </w:style>
-  <w:style w:type="table" w:styleId="837">
+  <w:style w:type="table" w:styleId="841">
     <w:name w:val="List Table 7 Colorful"/>
-    <w:basedOn w:val="925"/>
+    <w:basedOn w:val="929"/>
     <w:uiPriority w:val="99"/>
     <w:pPr>
       <w:pBdr/>
@@ -32080,9 +32121,9 @@
       </w:tcPr>
     </w:tblStylePr>
   </w:style>
-  <w:style w:type="table" w:styleId="838">
+  <w:style w:type="table" w:styleId="842">
     <w:name w:val="List Table 7 Colorful - Accent 1"/>
-    <w:basedOn w:val="925"/>
+    <w:basedOn w:val="929"/>
     <w:uiPriority w:val="99"/>
     <w:pPr>
       <w:pBdr/>
@@ -32336,9 +32377,9 @@
       </w:tcPr>
     </w:tblStylePr>
   </w:style>
-  <w:style w:type="table" w:styleId="839">
+  <w:style w:type="table" w:styleId="843">
     <w:name w:val="List Table 7 Colorful - Accent 2"/>
-    <w:basedOn w:val="925"/>
+    <w:basedOn w:val="929"/>
     <w:uiPriority w:val="99"/>
     <w:pPr>
       <w:pBdr/>
@@ -32592,9 +32633,9 @@
       </w:tcPr>
     </w:tblStylePr>
   </w:style>
-  <w:style w:type="table" w:styleId="840">
+  <w:style w:type="table" w:styleId="844">
     <w:name w:val="List Table 7 Colorful - Accent 3"/>
-    <w:basedOn w:val="925"/>
+    <w:basedOn w:val="929"/>
     <w:uiPriority w:val="99"/>
     <w:pPr>
       <w:pBdr/>
@@ -32848,9 +32889,9 @@
       </w:tcPr>
     </w:tblStylePr>
   </w:style>
-  <w:style w:type="table" w:styleId="841">
+  <w:style w:type="table" w:styleId="845">
     <w:name w:val="List Table 7 Colorful - Accent 4"/>
-    <w:basedOn w:val="925"/>
+    <w:basedOn w:val="929"/>
     <w:uiPriority w:val="99"/>
     <w:pPr>
       <w:pBdr/>
@@ -33104,9 +33145,9 @@
       </w:tcPr>
     </w:tblStylePr>
   </w:style>
-  <w:style w:type="table" w:styleId="842">
+  <w:style w:type="table" w:styleId="846">
     <w:name w:val="List Table 7 Colorful - Accent 5"/>
-    <w:basedOn w:val="925"/>
+    <w:basedOn w:val="929"/>
     <w:uiPriority w:val="99"/>
     <w:pPr>
       <w:pBdr/>
@@ -33360,9 +33401,9 @@
       </w:tcPr>
     </w:tblStylePr>
   </w:style>
-  <w:style w:type="table" w:styleId="843">
+  <w:style w:type="table" w:styleId="847">
     <w:name w:val="List Table 7 Colorful - Accent 6"/>
-    <w:basedOn w:val="925"/>
+    <w:basedOn w:val="929"/>
     <w:uiPriority w:val="99"/>
     <w:pPr>
       <w:pBdr/>
@@ -33616,9 +33657,9 @@
       </w:tcPr>
     </w:tblStylePr>
   </w:style>
-  <w:style w:type="table" w:styleId="844">
+  <w:style w:type="table" w:styleId="848">
     <w:name w:val="Lined - Accent"/>
-    <w:basedOn w:val="925"/>
+    <w:basedOn w:val="929"/>
     <w:uiPriority w:val="99"/>
     <w:pPr>
       <w:pBdr/>
@@ -33853,9 +33894,9 @@
       </w:tcPr>
     </w:tblStylePr>
   </w:style>
-  <w:style w:type="table" w:styleId="845">
+  <w:style w:type="table" w:styleId="849">
     <w:name w:val="Lined - Accent 1"/>
-    <w:basedOn w:val="925"/>
+    <w:basedOn w:val="929"/>
     <w:uiPriority w:val="99"/>
     <w:pPr>
       <w:pBdr/>
@@ -34090,9 +34131,9 @@
       </w:tcPr>
     </w:tblStylePr>
   </w:style>
-  <w:style w:type="table" w:styleId="846">
+  <w:style w:type="table" w:styleId="850">
     <w:name w:val="Lined - Accent 2"/>
-    <w:basedOn w:val="925"/>
+    <w:basedOn w:val="929"/>
     <w:uiPriority w:val="99"/>
     <w:pPr>
       <w:pBdr/>
@@ -34327,9 +34368,9 @@
       </w:tcPr>
     </w:tblStylePr>
   </w:style>
-  <w:style w:type="table" w:styleId="847">
+  <w:style w:type="table" w:styleId="851">
     <w:name w:val="Lined - Accent 3"/>
-    <w:basedOn w:val="925"/>
+    <w:basedOn w:val="929"/>
     <w:uiPriority w:val="99"/>
     <w:pPr>
       <w:pBdr/>
@@ -34564,9 +34605,9 @@
       </w:tcPr>
     </w:tblStylePr>
   </w:style>
-  <w:style w:type="table" w:styleId="848">
+  <w:style w:type="table" w:styleId="852">
     <w:name w:val="Lined - Accent 4"/>
-    <w:basedOn w:val="925"/>
+    <w:basedOn w:val="929"/>
     <w:uiPriority w:val="99"/>
     <w:pPr>
       <w:pBdr/>
@@ -34801,9 +34842,9 @@
       </w:tcPr>
     </w:tblStylePr>
   </w:style>
-  <w:style w:type="table" w:styleId="849">
+  <w:style w:type="table" w:styleId="853">
     <w:name w:val="Lined - Accent 5"/>
-    <w:basedOn w:val="925"/>
+    <w:basedOn w:val="929"/>
     <w:uiPriority w:val="99"/>
     <w:pPr>
       <w:pBdr/>
@@ -35038,9 +35079,9 @@
       </w:tcPr>
     </w:tblStylePr>
   </w:style>
-  <w:style w:type="table" w:styleId="850">
+  <w:style w:type="table" w:styleId="854">
     <w:name w:val="Lined - Accent 6"/>
-    <w:basedOn w:val="925"/>
+    <w:basedOn w:val="929"/>
     <w:uiPriority w:val="99"/>
     <w:pPr>
       <w:pBdr/>
@@ -35275,9 +35316,9 @@
       </w:tcPr>
     </w:tblStylePr>
   </w:style>
-  <w:style w:type="table" w:styleId="851">
+  <w:style w:type="table" w:styleId="855">
     <w:name w:val="Bordered &amp; Lined - Accent"/>
-    <w:basedOn w:val="925"/>
+    <w:basedOn w:val="929"/>
     <w:uiPriority w:val="99"/>
     <w:pPr>
       <w:pBdr/>
@@ -35519,9 +35560,9 @@
       </w:tcPr>
     </w:tblStylePr>
   </w:style>
-  <w:style w:type="table" w:styleId="852">
+  <w:style w:type="table" w:styleId="856">
     <w:name w:val="Bordered &amp; Lined - Accent 1"/>
-    <w:basedOn w:val="925"/>
+    <w:basedOn w:val="929"/>
     <w:uiPriority w:val="99"/>
     <w:pPr>
       <w:pBdr/>
@@ -35763,9 +35804,9 @@
       </w:tcPr>
     </w:tblStylePr>
   </w:style>
-  <w:style w:type="table" w:styleId="853">
+  <w:style w:type="table" w:styleId="857">
     <w:name w:val="Bordered &amp; Lined - Accent 2"/>
-    <w:basedOn w:val="925"/>
+    <w:basedOn w:val="929"/>
     <w:uiPriority w:val="99"/>
     <w:pPr>
       <w:pBdr/>
@@ -36007,9 +36048,9 @@
       </w:tcPr>
     </w:tblStylePr>
   </w:style>
-  <w:style w:type="table" w:styleId="854">
+  <w:style w:type="table" w:styleId="858">
     <w:name w:val="Bordered &amp; Lined - Accent 3"/>
-    <w:basedOn w:val="925"/>
+    <w:basedOn w:val="929"/>
     <w:uiPriority w:val="99"/>
     <w:pPr>
       <w:pBdr/>
@@ -36251,9 +36292,9 @@
       </w:tcPr>
     </w:tblStylePr>
   </w:style>
-  <w:style w:type="table" w:styleId="855">
+  <w:style w:type="table" w:styleId="859">
     <w:name w:val="Bordered &amp; Lined - Accent 4"/>
-    <w:basedOn w:val="925"/>
+    <w:basedOn w:val="929"/>
     <w:uiPriority w:val="99"/>
     <w:pPr>
       <w:pBdr/>
@@ -36495,9 +36536,9 @@
       </w:tcPr>
     </w:tblStylePr>
   </w:style>
-  <w:style w:type="table" w:styleId="856">
+  <w:style w:type="table" w:styleId="860">
     <w:name w:val="Bordered &amp; Lined - Accent 5"/>
-    <w:basedOn w:val="925"/>
+    <w:basedOn w:val="929"/>
     <w:uiPriority w:val="99"/>
     <w:pPr>
       <w:pBdr/>
@@ -36739,9 +36780,9 @@
       </w:tcPr>
     </w:tblStylePr>
   </w:style>
-  <w:style w:type="table" w:styleId="857">
+  <w:style w:type="table" w:styleId="861">
     <w:name w:val="Bordered &amp; Lined - Accent 6"/>
-    <w:basedOn w:val="925"/>
+    <w:basedOn w:val="929"/>
     <w:uiPriority w:val="99"/>
     <w:pPr>
       <w:pBdr/>
@@ -36983,9 +37024,9 @@
       </w:tcPr>
     </w:tblStylePr>
   </w:style>
-  <w:style w:type="table" w:styleId="858">
+  <w:style w:type="table" w:styleId="862">
     <w:name w:val="Bordered"/>
-    <w:basedOn w:val="925"/>
+    <w:basedOn w:val="929"/>
     <w:uiPriority w:val="99"/>
     <w:pPr>
       <w:pBdr/>
@@ -37214,9 +37255,9 @@
       </w:tcPr>
     </w:tblStylePr>
   </w:style>
-  <w:style w:type="table" w:styleId="859">
+  <w:style w:type="table" w:styleId="863">
     <w:name w:val="Bordered - Accent 1"/>
-    <w:basedOn w:val="925"/>
+    <w:basedOn w:val="929"/>
     <w:uiPriority w:val="99"/>
     <w:pPr>
       <w:pBdr/>
@@ -37445,9 +37486,9 @@
       </w:tcPr>
     </w:tblStylePr>
   </w:style>
-  <w:style w:type="table" w:styleId="860">
+  <w:style w:type="table" w:styleId="864">
     <w:name w:val="Bordered - Accent 2"/>
-    <w:basedOn w:val="925"/>
+    <w:basedOn w:val="929"/>
     <w:uiPriority w:val="99"/>
     <w:pPr>
       <w:pBdr/>
@@ -37676,9 +37717,9 @@
       </w:tcPr>
     </w:tblStylePr>
   </w:style>
-  <w:style w:type="table" w:styleId="861">
+  <w:style w:type="table" w:styleId="865">
     <w:name w:val="Bordered - Accent 3"/>
-    <w:basedOn w:val="925"/>
+    <w:basedOn w:val="929"/>
     <w:uiPriority w:val="99"/>
     <w:pPr>
       <w:pBdr/>
@@ -37907,9 +37948,9 @@
       </w:tcPr>
     </w:tblStylePr>
   </w:style>
-  <w:style w:type="table" w:styleId="862">
+  <w:style w:type="table" w:styleId="866">
     <w:name w:val="Bordered - Accent 4"/>
-    <w:basedOn w:val="925"/>
+    <w:basedOn w:val="929"/>
     <w:uiPriority w:val="99"/>
     <w:pPr>
       <w:pBdr/>
@@ -38138,9 +38179,9 @@
       </w:tcPr>
     </w:tblStylePr>
   </w:style>
-  <w:style w:type="table" w:styleId="863">
+  <w:style w:type="table" w:styleId="867">
     <w:name w:val="Bordered - Accent 5"/>
-    <w:basedOn w:val="925"/>
+    <w:basedOn w:val="929"/>
     <w:uiPriority w:val="99"/>
     <w:pPr>
       <w:pBdr/>
@@ -38369,9 +38410,9 @@
       </w:tcPr>
     </w:tblStylePr>
   </w:style>
-  <w:style w:type="table" w:styleId="864">
+  <w:style w:type="table" w:styleId="868">
     <w:name w:val="Bordered - Accent 6"/>
-    <w:basedOn w:val="925"/>
+    <w:basedOn w:val="929"/>
     <w:uiPriority w:val="99"/>
     <w:pPr>
       <w:pBdr/>
@@ -38600,11 +38641,11 @@
       </w:tcPr>
     </w:tblStylePr>
   </w:style>
-  <w:style w:type="paragraph" w:styleId="865">
+  <w:style w:type="paragraph" w:styleId="869">
     <w:name w:val="Heading 1"/>
-    <w:basedOn w:val="924"/>
-    <w:next w:val="924"/>
-    <w:link w:val="875"/>
+    <w:basedOn w:val="928"/>
+    <w:next w:val="928"/>
+    <w:link w:val="879"/>
     <w:uiPriority w:val="9"/>
     <w:qFormat/>
     <w:pPr>
@@ -38622,11 +38663,11 @@
       <w:szCs w:val="40"/>
     </w:rPr>
   </w:style>
-  <w:style w:type="paragraph" w:styleId="866">
+  <w:style w:type="paragraph" w:styleId="870">
     <w:name w:val="Heading 2"/>
-    <w:basedOn w:val="924"/>
-    <w:next w:val="924"/>
-    <w:link w:val="876"/>
+    <w:basedOn w:val="928"/>
+    <w:next w:val="928"/>
+    <w:link w:val="880"/>
     <w:uiPriority w:val="9"/>
     <w:unhideWhenUsed/>
     <w:qFormat/>
@@ -38645,11 +38686,11 @@
       <w:szCs w:val="32"/>
     </w:rPr>
   </w:style>
-  <w:style w:type="paragraph" w:styleId="867">
+  <w:style w:type="paragraph" w:styleId="871">
     <w:name w:val="Heading 3"/>
-    <w:basedOn w:val="924"/>
-    <w:next w:val="924"/>
-    <w:link w:val="877"/>
+    <w:basedOn w:val="928"/>
+    <w:next w:val="928"/>
+    <w:link w:val="881"/>
     <w:uiPriority w:val="9"/>
     <w:unhideWhenUsed/>
     <w:qFormat/>
@@ -38668,11 +38709,11 @@
       <w:szCs w:val="28"/>
     </w:rPr>
   </w:style>
-  <w:style w:type="paragraph" w:styleId="868">
+  <w:style w:type="paragraph" w:styleId="872">
     <w:name w:val="Heading 4"/>
-    <w:basedOn w:val="924"/>
-    <w:next w:val="924"/>
-    <w:link w:val="878"/>
+    <w:basedOn w:val="928"/>
+    <w:next w:val="928"/>
+    <w:link w:val="882"/>
     <w:uiPriority w:val="9"/>
     <w:unhideWhenUsed/>
     <w:qFormat/>
@@ -38691,11 +38732,11 @@
       <w:color w:val="0f4761" w:themeColor="accent1" w:themeShade="BF"/>
     </w:rPr>
   </w:style>
-  <w:style w:type="paragraph" w:styleId="869">
+  <w:style w:type="paragraph" w:styleId="873">
     <w:name w:val="Heading 5"/>
-    <w:basedOn w:val="924"/>
-    <w:next w:val="924"/>
-    <w:link w:val="879"/>
+    <w:basedOn w:val="928"/>
+    <w:next w:val="928"/>
+    <w:link w:val="883"/>
     <w:uiPriority w:val="9"/>
     <w:unhideWhenUsed/>
     <w:qFormat/>
@@ -38712,11 +38753,11 @@
       <w:color w:val="0f4761" w:themeColor="accent1" w:themeShade="BF"/>
     </w:rPr>
   </w:style>
-  <w:style w:type="paragraph" w:styleId="870">
+  <w:style w:type="paragraph" w:styleId="874">
     <w:name w:val="Heading 6"/>
-    <w:basedOn w:val="924"/>
-    <w:next w:val="924"/>
-    <w:link w:val="880"/>
+    <w:basedOn w:val="928"/>
+    <w:next w:val="928"/>
+    <w:link w:val="884"/>
     <w:uiPriority w:val="9"/>
     <w:unhideWhenUsed/>
     <w:qFormat/>
@@ -38735,11 +38776,11 @@
       <w:color w:val="595959" w:themeColor="text1" w:themeTint="A6"/>
     </w:rPr>
   </w:style>
-  <w:style w:type="paragraph" w:styleId="871">
+  <w:style w:type="paragraph" w:styleId="875">
     <w:name w:val="Heading 7"/>
-    <w:basedOn w:val="924"/>
-    <w:next w:val="924"/>
-    <w:link w:val="881"/>
+    <w:basedOn w:val="928"/>
+    <w:next w:val="928"/>
+    <w:link w:val="885"/>
     <w:uiPriority w:val="9"/>
     <w:unhideWhenUsed/>
     <w:qFormat/>
@@ -38756,11 +38797,11 @@
       <w:color w:val="595959" w:themeColor="text1" w:themeTint="A6"/>
     </w:rPr>
   </w:style>
-  <w:style w:type="paragraph" w:styleId="872">
+  <w:style w:type="paragraph" w:styleId="876">
     <w:name w:val="Heading 8"/>
-    <w:basedOn w:val="924"/>
-    <w:next w:val="924"/>
-    <w:link w:val="882"/>
+    <w:basedOn w:val="928"/>
+    <w:next w:val="928"/>
+    <w:link w:val="886"/>
     <w:uiPriority w:val="9"/>
     <w:unhideWhenUsed/>
     <w:qFormat/>
@@ -38779,11 +38820,11 @@
       <w:color w:val="272727" w:themeColor="text1" w:themeTint="D8"/>
     </w:rPr>
   </w:style>
-  <w:style w:type="paragraph" w:styleId="873">
+  <w:style w:type="paragraph" w:styleId="877">
     <w:name w:val="Heading 9"/>
-    <w:basedOn w:val="924"/>
-    <w:next w:val="924"/>
-    <w:link w:val="883"/>
+    <w:basedOn w:val="928"/>
+    <w:next w:val="928"/>
+    <w:link w:val="887"/>
     <w:uiPriority w:val="9"/>
     <w:unhideWhenUsed/>
     <w:qFormat/>
@@ -38802,7 +38843,7 @@
       <w:color w:val="272727" w:themeColor="text1" w:themeTint="D8"/>
     </w:rPr>
   </w:style>
-  <w:style w:type="character" w:styleId="874" w:default="1">
+  <w:style w:type="character" w:styleId="878" w:default="1">
     <w:name w:val="Default Paragraph Font"/>
     <w:uiPriority w:val="1"/>
     <w:semiHidden/>
@@ -38813,10 +38854,10 @@
       <w:ind/>
     </w:pPr>
   </w:style>
-  <w:style w:type="character" w:styleId="875">
+  <w:style w:type="character" w:styleId="879">
     <w:name w:val="Heading 1 Char"/>
-    <w:basedOn w:val="874"/>
-    <w:link w:val="865"/>
+    <w:basedOn w:val="878"/>
+    <w:link w:val="869"/>
     <w:uiPriority w:val="9"/>
     <w:pPr>
       <w:pBdr/>
@@ -38830,10 +38871,10 @@
       <w:szCs w:val="40"/>
     </w:rPr>
   </w:style>
-  <w:style w:type="character" w:styleId="876">
+  <w:style w:type="character" w:styleId="880">
     <w:name w:val="Heading 2 Char"/>
-    <w:basedOn w:val="874"/>
-    <w:link w:val="866"/>
+    <w:basedOn w:val="878"/>
+    <w:link w:val="870"/>
     <w:uiPriority w:val="9"/>
     <w:pPr>
       <w:pBdr/>
@@ -38847,10 +38888,10 @@
       <w:szCs w:val="32"/>
     </w:rPr>
   </w:style>
-  <w:style w:type="character" w:styleId="877">
+  <w:style w:type="character" w:styleId="881">
     <w:name w:val="Heading 3 Char"/>
-    <w:basedOn w:val="874"/>
-    <w:link w:val="867"/>
+    <w:basedOn w:val="878"/>
+    <w:link w:val="871"/>
     <w:uiPriority w:val="9"/>
     <w:pPr>
       <w:pBdr/>
@@ -38864,10 +38905,10 @@
       <w:szCs w:val="28"/>
     </w:rPr>
   </w:style>
-  <w:style w:type="character" w:styleId="878">
+  <w:style w:type="character" w:styleId="882">
     <w:name w:val="Heading 4 Char"/>
-    <w:basedOn w:val="874"/>
-    <w:link w:val="868"/>
+    <w:basedOn w:val="878"/>
+    <w:link w:val="872"/>
     <w:uiPriority w:val="9"/>
     <w:pPr>
       <w:pBdr/>
@@ -38881,10 +38922,10 @@
       <w:color w:val="0f4761" w:themeColor="accent1" w:themeShade="BF"/>
     </w:rPr>
   </w:style>
-  <w:style w:type="character" w:styleId="879">
+  <w:style w:type="character" w:styleId="883">
     <w:name w:val="Heading 5 Char"/>
-    <w:basedOn w:val="874"/>
-    <w:link w:val="869"/>
+    <w:basedOn w:val="878"/>
+    <w:link w:val="873"/>
     <w:uiPriority w:val="9"/>
     <w:pPr>
       <w:pBdr/>
@@ -38896,10 +38937,10 @@
       <w:color w:val="0f4761" w:themeColor="accent1" w:themeShade="BF"/>
     </w:rPr>
   </w:style>
-  <w:style w:type="character" w:styleId="880">
+  <w:style w:type="character" w:styleId="884">
     <w:name w:val="Heading 6 Char"/>
-    <w:basedOn w:val="874"/>
-    <w:link w:val="870"/>
+    <w:basedOn w:val="878"/>
+    <w:link w:val="874"/>
     <w:uiPriority w:val="9"/>
     <w:pPr>
       <w:pBdr/>
@@ -38913,10 +38954,10 @@
       <w:color w:val="595959" w:themeColor="text1" w:themeTint="A6"/>
     </w:rPr>
   </w:style>
-  <w:style w:type="character" w:styleId="881">
+  <w:style w:type="character" w:styleId="885">
     <w:name w:val="Heading 7 Char"/>
-    <w:basedOn w:val="874"/>
-    <w:link w:val="871"/>
+    <w:basedOn w:val="878"/>
+    <w:link w:val="875"/>
     <w:uiPriority w:val="9"/>
     <w:pPr>
       <w:pBdr/>
@@ -38928,10 +38969,10 @@
       <w:color w:val="595959" w:themeColor="text1" w:themeTint="A6"/>
     </w:rPr>
   </w:style>
-  <w:style w:type="character" w:styleId="882">
+  <w:style w:type="character" w:styleId="886">
     <w:name w:val="Heading 8 Char"/>
-    <w:basedOn w:val="874"/>
-    <w:link w:val="872"/>
+    <w:basedOn w:val="878"/>
+    <w:link w:val="876"/>
     <w:uiPriority w:val="9"/>
     <w:pPr>
       <w:pBdr/>
@@ -38945,10 +38986,10 @@
       <w:color w:val="272727" w:themeColor="text1" w:themeTint="D8"/>
     </w:rPr>
   </w:style>
-  <w:style w:type="character" w:styleId="883">
+  <w:style w:type="character" w:styleId="887">
     <w:name w:val="Heading 9 Char"/>
-    <w:basedOn w:val="874"/>
-    <w:link w:val="873"/>
+    <w:basedOn w:val="878"/>
+    <w:link w:val="877"/>
     <w:uiPriority w:val="9"/>
     <w:pPr>
       <w:pBdr/>
@@ -38962,11 +39003,11 @@
       <w:color w:val="272727" w:themeColor="text1" w:themeTint="D8"/>
     </w:rPr>
   </w:style>
-  <w:style w:type="paragraph" w:styleId="884">
+  <w:style w:type="paragraph" w:styleId="888">
     <w:name w:val="Title"/>
-    <w:basedOn w:val="924"/>
-    <w:next w:val="924"/>
-    <w:link w:val="885"/>
+    <w:basedOn w:val="928"/>
+    <w:next w:val="928"/>
+    <w:link w:val="889"/>
     <w:uiPriority w:val="10"/>
     <w:qFormat/>
     <w:pPr>
@@ -38982,10 +39023,10 @@
       <w:szCs w:val="56"/>
     </w:rPr>
   </w:style>
-  <w:style w:type="character" w:styleId="885">
+  <w:style w:type="character" w:styleId="889">
     <w:name w:val="Title Char"/>
-    <w:basedOn w:val="874"/>
-    <w:link w:val="884"/>
+    <w:basedOn w:val="878"/>
+    <w:link w:val="888"/>
     <w:uiPriority w:val="10"/>
     <w:pPr>
       <w:pBdr/>
@@ -38999,11 +39040,11 @@
       <w:szCs w:val="56"/>
     </w:rPr>
   </w:style>
-  <w:style w:type="paragraph" w:styleId="886">
+  <w:style w:type="paragraph" w:styleId="890">
     <w:name w:val="Subtitle"/>
-    <w:basedOn w:val="924"/>
-    <w:next w:val="924"/>
-    <w:link w:val="887"/>
+    <w:basedOn w:val="928"/>
+    <w:next w:val="928"/>
+    <w:link w:val="891"/>
     <w:uiPriority w:val="11"/>
     <w:qFormat/>
     <w:pPr>
@@ -39021,10 +39062,10 @@
       <w:szCs w:val="28"/>
     </w:rPr>
   </w:style>
-  <w:style w:type="character" w:styleId="887">
+  <w:style w:type="character" w:styleId="891">
     <w:name w:val="Subtitle Char"/>
-    <w:basedOn w:val="874"/>
-    <w:link w:val="886"/>
+    <w:basedOn w:val="878"/>
+    <w:link w:val="890"/>
     <w:uiPriority w:val="11"/>
     <w:pPr>
       <w:pBdr/>
@@ -39038,11 +39079,11 @@
       <w:szCs w:val="28"/>
     </w:rPr>
   </w:style>
-  <w:style w:type="paragraph" w:styleId="888">
+  <w:style w:type="paragraph" w:styleId="892">
     <w:name w:val="Quote"/>
-    <w:basedOn w:val="924"/>
-    <w:next w:val="924"/>
-    <w:link w:val="889"/>
+    <w:basedOn w:val="928"/>
+    <w:next w:val="928"/>
+    <w:link w:val="893"/>
     <w:uiPriority w:val="29"/>
     <w:qFormat/>
     <w:pPr>
@@ -39057,10 +39098,10 @@
       <w:color w:val="404040" w:themeColor="text1" w:themeTint="BF"/>
     </w:rPr>
   </w:style>
-  <w:style w:type="character" w:styleId="889">
+  <w:style w:type="character" w:styleId="893">
     <w:name w:val="Quote Char"/>
-    <w:basedOn w:val="874"/>
-    <w:link w:val="888"/>
+    <w:basedOn w:val="878"/>
+    <w:link w:val="892"/>
     <w:uiPriority w:val="29"/>
     <w:pPr>
       <w:pBdr/>
@@ -39073,9 +39114,9 @@
       <w:color w:val="404040" w:themeColor="text1" w:themeTint="BF"/>
     </w:rPr>
   </w:style>
-  <w:style w:type="character" w:styleId="890">
+  <w:style w:type="character" w:styleId="894">
     <w:name w:val="Intense Emphasis"/>
-    <w:basedOn w:val="874"/>
+    <w:basedOn w:val="878"/>
     <w:uiPriority w:val="21"/>
     <w:qFormat/>
     <w:pPr>
@@ -39089,11 +39130,11 @@
       <w:color w:val="0f4761" w:themeColor="accent1" w:themeShade="BF"/>
     </w:rPr>
   </w:style>
-  <w:style w:type="paragraph" w:styleId="891">
+  <w:style w:type="paragraph" w:styleId="895">
     <w:name w:val="Intense Quote"/>
-    <w:basedOn w:val="924"/>
-    <w:next w:val="924"/>
-    <w:link w:val="892"/>
+    <w:basedOn w:val="928"/>
+    <w:next w:val="928"/>
+    <w:link w:val="896"/>
     <w:uiPriority w:val="30"/>
     <w:qFormat/>
     <w:pPr>
@@ -39111,10 +39152,10 @@
       <w:color w:val="0f4761" w:themeColor="accent1" w:themeShade="BF"/>
     </w:rPr>
   </w:style>
-  <w:style w:type="character" w:styleId="892">
+  <w:style w:type="character" w:styleId="896">
     <w:name w:val="Intense Quote Char"/>
-    <w:basedOn w:val="874"/>
-    <w:link w:val="891"/>
+    <w:basedOn w:val="878"/>
+    <w:link w:val="895"/>
     <w:uiPriority w:val="30"/>
     <w:pPr>
       <w:pBdr/>
@@ -39127,9 +39168,9 @@
       <w:color w:val="0f4761" w:themeColor="accent1" w:themeShade="BF"/>
     </w:rPr>
   </w:style>
-  <w:style w:type="character" w:styleId="893">
+  <w:style w:type="character" w:styleId="897">
     <w:name w:val="Intense Reference"/>
-    <w:basedOn w:val="874"/>
+    <w:basedOn w:val="878"/>
     <w:uiPriority w:val="32"/>
     <w:qFormat/>
     <w:pPr>
@@ -39145,9 +39186,9 @@
       <w:spacing w:val="5"/>
     </w:rPr>
   </w:style>
-  <w:style w:type="character" w:styleId="894">
+  <w:style w:type="character" w:styleId="898">
     <w:name w:val="Subtle Emphasis"/>
-    <w:basedOn w:val="874"/>
+    <w:basedOn w:val="878"/>
     <w:uiPriority w:val="19"/>
     <w:qFormat/>
     <w:pPr>
@@ -39161,9 +39202,9 @@
       <w:color w:val="404040" w:themeColor="text1" w:themeTint="BF"/>
     </w:rPr>
   </w:style>
-  <w:style w:type="character" w:styleId="895">
+  <w:style w:type="character" w:styleId="899">
     <w:name w:val="Emphasis"/>
-    <w:basedOn w:val="874"/>
+    <w:basedOn w:val="878"/>
     <w:uiPriority w:val="20"/>
     <w:qFormat/>
     <w:pPr>
@@ -39176,9 +39217,9 @@
       <w:iCs/>
     </w:rPr>
   </w:style>
-  <w:style w:type="character" w:styleId="896">
+  <w:style w:type="character" w:styleId="900">
     <w:name w:val="Strong"/>
-    <w:basedOn w:val="874"/>
+    <w:basedOn w:val="878"/>
     <w:uiPriority w:val="22"/>
     <w:qFormat/>
     <w:pPr>
@@ -39191,9 +39232,9 @@
       <w:bCs/>
     </w:rPr>
   </w:style>
-  <w:style w:type="character" w:styleId="897">
+  <w:style w:type="character" w:styleId="901">
     <w:name w:val="Subtle Reference"/>
-    <w:basedOn w:val="874"/>
+    <w:basedOn w:val="878"/>
     <w:uiPriority w:val="31"/>
     <w:qFormat/>
     <w:pPr>
@@ -39206,9 +39247,9 @@
       <w:color w:val="5a5a5a" w:themeColor="text1" w:themeTint="A5"/>
     </w:rPr>
   </w:style>
-  <w:style w:type="character" w:styleId="898">
+  <w:style w:type="character" w:styleId="902">
     <w:name w:val="Book Title"/>
-    <w:basedOn w:val="874"/>
+    <w:basedOn w:val="878"/>
     <w:uiPriority w:val="33"/>
     <w:qFormat/>
     <w:pPr>
@@ -39224,10 +39265,10 @@
       <w:spacing w:val="5"/>
     </w:rPr>
   </w:style>
-  <w:style w:type="paragraph" w:styleId="899">
+  <w:style w:type="paragraph" w:styleId="903">
     <w:name w:val="Header"/>
-    <w:basedOn w:val="924"/>
-    <w:link w:val="900"/>
+    <w:basedOn w:val="928"/>
+    <w:link w:val="904"/>
     <w:uiPriority w:val="99"/>
     <w:unhideWhenUsed/>
     <w:pPr>
@@ -39240,10 +39281,10 @@
       <w:ind/>
     </w:pPr>
   </w:style>
-  <w:style w:type="character" w:styleId="900">
+  <w:style w:type="character" w:styleId="904">
     <w:name w:val="Header Char"/>
-    <w:basedOn w:val="874"/>
-    <w:link w:val="899"/>
+    <w:basedOn w:val="878"/>
+    <w:link w:val="903"/>
     <w:uiPriority w:val="99"/>
     <w:pPr>
       <w:pBdr/>
@@ -39251,10 +39292,10 @@
       <w:ind/>
     </w:pPr>
   </w:style>
-  <w:style w:type="paragraph" w:styleId="901">
+  <w:style w:type="paragraph" w:styleId="905">
     <w:name w:val="Footer"/>
-    <w:basedOn w:val="924"/>
-    <w:link w:val="902"/>
+    <w:basedOn w:val="928"/>
+    <w:link w:val="906"/>
     <w:uiPriority w:val="99"/>
     <w:unhideWhenUsed/>
     <w:pPr>
@@ -39267,10 +39308,10 @@
       <w:ind/>
     </w:pPr>
   </w:style>
-  <w:style w:type="character" w:styleId="902">
+  <w:style w:type="character" w:styleId="906">
     <w:name w:val="Footer Char"/>
-    <w:basedOn w:val="874"/>
-    <w:link w:val="901"/>
+    <w:basedOn w:val="878"/>
+    <w:link w:val="905"/>
     <w:uiPriority w:val="99"/>
     <w:pPr>
       <w:pBdr/>
@@ -39278,10 +39319,10 @@
       <w:ind/>
     </w:pPr>
   </w:style>
-  <w:style w:type="paragraph" w:styleId="903">
+  <w:style w:type="paragraph" w:styleId="907">
     <w:name w:val="Caption"/>
-    <w:basedOn w:val="924"/>
-    <w:next w:val="924"/>
+    <w:basedOn w:val="928"/>
+    <w:next w:val="928"/>
     <w:uiPriority w:val="35"/>
     <w:unhideWhenUsed/>
     <w:qFormat/>
@@ -39298,10 +39339,10 @@
       <w:szCs w:val="18"/>
     </w:rPr>
   </w:style>
-  <w:style w:type="paragraph" w:styleId="904">
+  <w:style w:type="paragraph" w:styleId="908">
     <w:name w:val="footnote text"/>
-    <w:basedOn w:val="924"/>
-    <w:link w:val="905"/>
+    <w:basedOn w:val="928"/>
+    <w:link w:val="909"/>
     <w:uiPriority w:val="99"/>
     <w:semiHidden/>
     <w:unhideWhenUsed/>
@@ -39315,10 +39356,10 @@
       <w:szCs w:val="20"/>
     </w:rPr>
   </w:style>
-  <w:style w:type="character" w:styleId="905">
+  <w:style w:type="character" w:styleId="909">
     <w:name w:val="Footnote Text Char"/>
-    <w:basedOn w:val="874"/>
-    <w:link w:val="904"/>
+    <w:basedOn w:val="878"/>
+    <w:link w:val="908"/>
     <w:uiPriority w:val="99"/>
     <w:semiHidden/>
     <w:pPr>
@@ -39331,9 +39372,9 @@
       <w:szCs w:val="20"/>
     </w:rPr>
   </w:style>
-  <w:style w:type="character" w:styleId="906">
+  <w:style w:type="character" w:styleId="910">
     <w:name w:val="footnote reference"/>
-    <w:basedOn w:val="874"/>
+    <w:basedOn w:val="878"/>
     <w:uiPriority w:val="99"/>
     <w:semiHidden/>
     <w:unhideWhenUsed/>
@@ -39346,10 +39387,10 @@
       <w:vertAlign w:val="superscript"/>
     </w:rPr>
   </w:style>
-  <w:style w:type="paragraph" w:styleId="907">
+  <w:style w:type="paragraph" w:styleId="911">
     <w:name w:val="endnote text"/>
-    <w:basedOn w:val="924"/>
-    <w:link w:val="908"/>
+    <w:basedOn w:val="928"/>
+    <w:link w:val="912"/>
     <w:uiPriority w:val="99"/>
     <w:semiHidden/>
     <w:unhideWhenUsed/>
@@ -39363,10 +39404,10 @@
       <w:szCs w:val="20"/>
     </w:rPr>
   </w:style>
-  <w:style w:type="character" w:styleId="908">
+  <w:style w:type="character" w:styleId="912">
     <w:name w:val="Endnote Text Char"/>
-    <w:basedOn w:val="874"/>
-    <w:link w:val="907"/>
+    <w:basedOn w:val="878"/>
+    <w:link w:val="911"/>
     <w:uiPriority w:val="99"/>
     <w:semiHidden/>
     <w:pPr>
@@ -39379,9 +39420,9 @@
       <w:szCs w:val="20"/>
     </w:rPr>
   </w:style>
-  <w:style w:type="character" w:styleId="909">
+  <w:style w:type="character" w:styleId="913">
     <w:name w:val="endnote reference"/>
-    <w:basedOn w:val="874"/>
+    <w:basedOn w:val="878"/>
     <w:uiPriority w:val="99"/>
     <w:semiHidden/>
     <w:unhideWhenUsed/>
@@ -39394,9 +39435,9 @@
       <w:vertAlign w:val="superscript"/>
     </w:rPr>
   </w:style>
-  <w:style w:type="character" w:styleId="910">
+  <w:style w:type="character" w:styleId="914">
     <w:name w:val="Hyperlink"/>
-    <w:basedOn w:val="874"/>
+    <w:basedOn w:val="878"/>
     <w:uiPriority w:val="99"/>
     <w:unhideWhenUsed/>
     <w:pPr>
@@ -39409,9 +39450,9 @@
       <w:u w:val="single"/>
     </w:rPr>
   </w:style>
-  <w:style w:type="character" w:styleId="911">
+  <w:style w:type="character" w:styleId="915">
     <w:name w:val="FollowedHyperlink"/>
-    <w:basedOn w:val="874"/>
+    <w:basedOn w:val="878"/>
     <w:uiPriority w:val="99"/>
     <w:semiHidden/>
     <w:unhideWhenUsed/>
@@ -39425,10 +39466,10 @@
       <w:u w:val="single"/>
     </w:rPr>
   </w:style>
-  <w:style w:type="paragraph" w:styleId="912">
+  <w:style w:type="paragraph" w:styleId="916">
     <w:name w:val="toc 1"/>
-    <w:basedOn w:val="924"/>
-    <w:next w:val="924"/>
+    <w:basedOn w:val="928"/>
+    <w:next w:val="928"/>
     <w:uiPriority w:val="39"/>
     <w:unhideWhenUsed/>
     <w:pPr>
@@ -39437,10 +39478,10 @@
       <w:ind/>
     </w:pPr>
   </w:style>
-  <w:style w:type="paragraph" w:styleId="913">
+  <w:style w:type="paragraph" w:styleId="917">
     <w:name w:val="toc 2"/>
-    <w:basedOn w:val="924"/>
-    <w:next w:val="924"/>
+    <w:basedOn w:val="928"/>
+    <w:next w:val="928"/>
     <w:uiPriority w:val="39"/>
     <w:unhideWhenUsed/>
     <w:pPr>
@@ -39449,10 +39490,10 @@
       <w:ind w:left="220"/>
     </w:pPr>
   </w:style>
-  <w:style w:type="paragraph" w:styleId="914">
+  <w:style w:type="paragraph" w:styleId="918">
     <w:name w:val="toc 3"/>
-    <w:basedOn w:val="924"/>
-    <w:next w:val="924"/>
+    <w:basedOn w:val="928"/>
+    <w:next w:val="928"/>
     <w:uiPriority w:val="39"/>
     <w:unhideWhenUsed/>
     <w:pPr>
@@ -39461,10 +39502,10 @@
       <w:ind w:left="440"/>
     </w:pPr>
   </w:style>
-  <w:style w:type="paragraph" w:styleId="915">
+  <w:style w:type="paragraph" w:styleId="919">
     <w:name w:val="toc 4"/>
-    <w:basedOn w:val="924"/>
-    <w:next w:val="924"/>
+    <w:basedOn w:val="928"/>
+    <w:next w:val="928"/>
     <w:uiPriority w:val="39"/>
     <w:unhideWhenUsed/>
     <w:pPr>
@@ -39473,10 +39514,10 @@
       <w:ind w:left="660"/>
     </w:pPr>
   </w:style>
-  <w:style w:type="paragraph" w:styleId="916">
+  <w:style w:type="paragraph" w:styleId="920">
     <w:name w:val="toc 5"/>
-    <w:basedOn w:val="924"/>
-    <w:next w:val="924"/>
+    <w:basedOn w:val="928"/>
+    <w:next w:val="928"/>
     <w:uiPriority w:val="39"/>
     <w:unhideWhenUsed/>
     <w:pPr>
@@ -39485,10 +39526,10 @@
       <w:ind w:left="880"/>
     </w:pPr>
   </w:style>
-  <w:style w:type="paragraph" w:styleId="917">
+  <w:style w:type="paragraph" w:styleId="921">
     <w:name w:val="toc 6"/>
-    <w:basedOn w:val="924"/>
-    <w:next w:val="924"/>
+    <w:basedOn w:val="928"/>
+    <w:next w:val="928"/>
     <w:uiPriority w:val="39"/>
     <w:unhideWhenUsed/>
     <w:pPr>
@@ -39497,10 +39538,10 @@
       <w:ind w:left="1100"/>
     </w:pPr>
   </w:style>
-  <w:style w:type="paragraph" w:styleId="918">
+  <w:style w:type="paragraph" w:styleId="922">
     <w:name w:val="toc 7"/>
-    <w:basedOn w:val="924"/>
-    <w:next w:val="924"/>
+    <w:basedOn w:val="928"/>
+    <w:next w:val="928"/>
     <w:uiPriority w:val="39"/>
     <w:unhideWhenUsed/>
     <w:pPr>
@@ -39509,10 +39550,10 @@
       <w:ind w:left="1320"/>
     </w:pPr>
   </w:style>
-  <w:style w:type="paragraph" w:styleId="919">
+  <w:style w:type="paragraph" w:styleId="923">
     <w:name w:val="toc 8"/>
-    <w:basedOn w:val="924"/>
-    <w:next w:val="924"/>
+    <w:basedOn w:val="928"/>
+    <w:next w:val="928"/>
     <w:uiPriority w:val="39"/>
     <w:unhideWhenUsed/>
     <w:pPr>
@@ -39521,10 +39562,10 @@
       <w:ind w:left="1540"/>
     </w:pPr>
   </w:style>
-  <w:style w:type="paragraph" w:styleId="920">
+  <w:style w:type="paragraph" w:styleId="924">
     <w:name w:val="toc 9"/>
-    <w:basedOn w:val="924"/>
-    <w:next w:val="924"/>
+    <w:basedOn w:val="928"/>
+    <w:next w:val="928"/>
     <w:uiPriority w:val="39"/>
     <w:unhideWhenUsed/>
     <w:pPr>
@@ -39533,9 +39574,9 @@
       <w:ind w:left="1760"/>
     </w:pPr>
   </w:style>
-  <w:style w:type="character" w:styleId="921">
+  <w:style w:type="character" w:styleId="925">
     <w:name w:val="Placeholder Text"/>
-    <w:basedOn w:val="874"/>
+    <w:basedOn w:val="878"/>
     <w:uiPriority w:val="99"/>
     <w:semiHidden/>
     <w:pPr>
@@ -39547,7 +39588,7 @@
       <w:color w:val="666666"/>
     </w:rPr>
   </w:style>
-  <w:style w:type="paragraph" w:styleId="922">
+  <w:style w:type="paragraph" w:styleId="926">
     <w:name w:val="TOC Heading"/>
     <w:uiPriority w:val="39"/>
     <w:unhideWhenUsed/>
@@ -39557,10 +39598,10 @@
       <w:ind/>
     </w:pPr>
   </w:style>
-  <w:style w:type="paragraph" w:styleId="923">
+  <w:style w:type="paragraph" w:styleId="927">
     <w:name w:val="table of figures"/>
-    <w:basedOn w:val="924"/>
-    <w:next w:val="924"/>
+    <w:basedOn w:val="928"/>
+    <w:next w:val="928"/>
     <w:uiPriority w:val="99"/>
     <w:unhideWhenUsed/>
     <w:pPr>
@@ -39569,7 +39610,7 @@
       <w:ind/>
     </w:pPr>
   </w:style>
-  <w:style w:type="paragraph" w:styleId="924" w:default="1">
+  <w:style w:type="paragraph" w:styleId="928" w:default="1">
     <w:name w:val="Normal"/>
     <w:qFormat/>
     <w:pPr>
@@ -39578,7 +39619,7 @@
       <w:ind/>
     </w:pPr>
   </w:style>
-  <w:style w:type="table" w:styleId="925" w:default="1">
+  <w:style w:type="table" w:styleId="929" w:default="1">
     <w:name w:val="Normal Table"/>
     <w:uiPriority w:val="99"/>
     <w:semiHidden/>
@@ -39771,7 +39812,7 @@
       </w:tcPr>
     </w:tblStylePr>
   </w:style>
-  <w:style w:type="numbering" w:styleId="926" w:default="1">
+  <w:style w:type="numbering" w:styleId="930" w:default="1">
     <w:name w:val="No List"/>
     <w:uiPriority w:val="99"/>
     <w:semiHidden/>
@@ -39782,9 +39823,9 @@
       <w:ind/>
     </w:pPr>
   </w:style>
-  <w:style w:type="paragraph" w:styleId="927">
+  <w:style w:type="paragraph" w:styleId="931">
     <w:name w:val="No Spacing"/>
-    <w:basedOn w:val="924"/>
+    <w:basedOn w:val="928"/>
     <w:uiPriority w:val="1"/>
     <w:qFormat/>
     <w:pPr>
@@ -39793,9 +39834,9 @@
       <w:ind/>
     </w:pPr>
   </w:style>
-  <w:style w:type="paragraph" w:styleId="928">
+  <w:style w:type="paragraph" w:styleId="932">
     <w:name w:val="List Paragraph"/>
-    <w:basedOn w:val="924"/>
+    <w:basedOn w:val="928"/>
     <w:uiPriority w:val="34"/>
     <w:qFormat/>
     <w:pPr>

</xml_diff>